<commit_message>
Fix GMM stats error, separate H1a/H1b models, real size, DEA report and figures
- gmmstats: stop re-adding e(ar1p) etc. already stored by xtabond2 (r(110))
- Eqs. (6a)/(6b): H1a and H1b each in its own model; Eq. (6) kept for the
  asymmetry Wald test
- LTA = ln(real total assets): nominal size trended with inflation
- CTRL_TYPE switch (controls predetermined or endogenous)
- Descriptive figures and DEA frontier report saved before GMM estimation
- Methodology (doc, md, docx) synced

Co-Authored-By: Claude Opus 5.5 <noreply@anthropic.com>
Claude-Session: https://claude.ai/code/session_019etBaQcYpfE848z3Ex8rct
</commit_message>
<xml_diff>
--- a/docs/Research_Methodology.docx
+++ b/docs/Research_Methodology.docx
@@ -1609,7 +1609,7 @@
         <w:t xml:space="preserve">LTA</w:t>
       </w:r>
       <w:r>
-        <w:t xml:space="preserve">: natural logarithm of total assets (size).</w:t>
+        <w:t xml:space="preserve">: natural logarithm of total assets in 1392 prices (size). Deflation is necessary because nominal assets grow mechanically with inflation of 30–40% a year.</w:t>
       </w:r>
     </w:p>
     <w:p>
@@ -3209,7 +3209,7 @@
         <w:pStyle w:val="FirstParagraph"/>
       </w:pPr>
       <w:r>
-        <w:t xml:space="preserve">Each hypothesis is tested with a dedicated dynamic panel model, and each prediction is stated as a sign restriction on a named coefficient. Because InvEff is signed, a negative coefficient indicates a shift toward under-investment and a positive coefficient a shift toward over-investment. In all equations, X is the vector of controls (LTA, MTB, PROFIT, FCF), η</w:t>
+        <w:t xml:space="preserve">Each hypothesis is tested with its own dynamic panel model, and each prediction is stated as a sign restriction on a named coefficient. Because InvEff is signed, a negative coefficient indicates a shift toward under-investment and a positive coefficient a shift toward over-investment. In all equations, X is the vector of controls (LTA, MTB, PROFIT, FCF), η</w:t>
       </w:r>
       <w:r>
         <w:rPr>
@@ -3260,6 +3260,14 @@
     <w:p>
       <w:pPr>
         <w:pStyle w:val="FirstParagraph"/>
+      </w:pPr>
+      <w:r>
+        <w:t xml:space="preserve">Each direct-effect hypothesis is tested in its own model. H1a is tested with:</w:t>
+      </w:r>
+    </w:p>
+    <w:p>
+      <w:pPr>
+        <w:pStyle w:val="BodyText"/>
       </w:pPr>
       <m:oMathPara>
         <m:oMathParaPr>
@@ -3442,28 +3450,28 @@
             </m:rPr>
             <m:t>+</m:t>
           </m:r>
+          <m:r>
+            <m:t>ϕ</m:t>
+          </m:r>
+          <m:r>
+            <m:t> </m:t>
+          </m:r>
+          <m:r>
+            <m:t>U</m:t>
+          </m:r>
+          <m:r>
+            <m:t>N</m:t>
+          </m:r>
+          <m:r>
+            <m:t>D</m:t>
+          </m:r>
+          <m:r>
+            <m:t>E</m:t>
+          </m:r>
           <m:sSub>
             <m:e>
               <m:r>
-                <m:t>β</m:t>
-              </m:r>
-            </m:e>
-            <m:sub>
-              <m:r>
-                <m:t>2</m:t>
-              </m:r>
-            </m:sub>
-          </m:sSub>
-          <m:r>
-            <m:t>C</m:t>
-          </m:r>
-          <m:r>
-            <m:t>S</m:t>
-          </m:r>
-          <m:sSubSup>
-            <m:e>
-              <m:r>
-                <m:t>D</m:t>
+                <m:t>R</m:t>
               </m:r>
             </m:e>
             <m:sub>
@@ -3480,15 +3488,383 @@
                 <m:t>t</m:t>
               </m:r>
             </m:sub>
+          </m:sSub>
+          <m:r>
+            <m:rPr>
+              <m:sty m:val="p"/>
+            </m:rPr>
+            <m:t>+</m:t>
+          </m:r>
+          <m:sSup>
+            <m:e>
+              <m:r>
+                <m:t>δ</m:t>
+              </m:r>
+            </m:e>
             <m:sup>
+              <m:r>
+                <m:rPr>
+                  <m:sty m:val="p"/>
+                </m:rPr>
+                <m:t>′</m:t>
+              </m:r>
+            </m:sup>
+          </m:sSup>
+          <m:sSub>
+            <m:e>
+              <m:r>
+                <m:t>X</m:t>
+              </m:r>
+            </m:e>
+            <m:sub>
+              <m:r>
+                <m:t>i</m:t>
+              </m:r>
+              <m:r>
+                <m:rPr>
+                  <m:sty m:val="p"/>
+                </m:rPr>
+                <m:t>,</m:t>
+              </m:r>
+              <m:r>
+                <m:t>t</m:t>
+              </m:r>
+            </m:sub>
+          </m:sSub>
+          <m:r>
+            <m:rPr>
+              <m:sty m:val="p"/>
+            </m:rPr>
+            <m:t>+</m:t>
+          </m:r>
+          <m:sSub>
+            <m:e>
+              <m:r>
+                <m:t>η</m:t>
+              </m:r>
+            </m:e>
+            <m:sub>
+              <m:r>
+                <m:t>i</m:t>
+              </m:r>
+            </m:sub>
+          </m:sSub>
+          <m:r>
+            <m:rPr>
+              <m:sty m:val="p"/>
+            </m:rPr>
+            <m:t>+</m:t>
+          </m:r>
+          <m:sSub>
+            <m:e>
+              <m:r>
+                <m:t>ν</m:t>
+              </m:r>
+            </m:e>
+            <m:sub>
+              <m:r>
+                <m:t>t</m:t>
+              </m:r>
+            </m:sub>
+          </m:sSub>
+          <m:r>
+            <m:rPr>
+              <m:sty m:val="p"/>
+            </m:rPr>
+            <m:t>+</m:t>
+          </m:r>
+          <m:sSub>
+            <m:e>
+              <m:r>
+                <m:t>λ</m:t>
+              </m:r>
+            </m:e>
+            <m:sub>
+              <m:r>
+                <m:t>j</m:t>
+              </m:r>
+            </m:sub>
+          </m:sSub>
+          <m:r>
+            <m:rPr>
+              <m:sty m:val="p"/>
+            </m:rPr>
+            <m:t>+</m:t>
+          </m:r>
+          <m:sSub>
+            <m:e>
+              <m:r>
+                <m:t>ε</m:t>
+              </m:r>
+            </m:e>
+            <m:sub>
+              <m:r>
+                <m:t>i</m:t>
+              </m:r>
+              <m:r>
+                <m:rPr>
+                  <m:sty m:val="p"/>
+                </m:rPr>
+                <m:t>,</m:t>
+              </m:r>
+              <m:r>
+                <m:t>t</m:t>
+              </m:r>
+            </m:sub>
+          </m:sSub>
+          <m:r>
+            <m:t>  </m:t>
+          </m:r>
+          <m:r>
+            <m:rPr>
+              <m:sty m:val="p"/>
+            </m:rPr>
+            <m:t>(</m:t>
+          </m:r>
+          <m:r>
+            <m:t>6</m:t>
+          </m:r>
+          <m:r>
+            <m:t>a</m:t>
+          </m:r>
+          <m:r>
+            <m:rPr>
+              <m:sty m:val="p"/>
+            </m:rPr>
+            <m:t>)</m:t>
+          </m:r>
+        </m:oMath>
+      </m:oMathPara>
+    </w:p>
+    <w:p>
+      <w:pPr>
+        <w:pStyle w:val="FirstParagraph"/>
+      </w:pPr>
+      <w:r>
+        <w:t xml:space="preserve">H1b is tested with:</w:t>
+      </w:r>
+    </w:p>
+    <w:p>
+      <w:pPr>
+        <w:pStyle w:val="BodyText"/>
+      </w:pPr>
+      <m:oMathPara>
+        <m:oMathParaPr>
+          <m:jc m:val="center"/>
+        </m:oMathParaPr>
+        <m:oMath>
+          <m:r>
+            <m:t>I</m:t>
+          </m:r>
+          <m:r>
+            <m:t>n</m:t>
+          </m:r>
+          <m:r>
+            <m:t>v</m:t>
+          </m:r>
+          <m:r>
+            <m:t>E</m:t>
+          </m:r>
+          <m:r>
+            <m:t>f</m:t>
+          </m:r>
+          <m:sSub>
+            <m:e>
+              <m:r>
+                <m:t>f</m:t>
+              </m:r>
+            </m:e>
+            <m:sub>
+              <m:r>
+                <m:t>i</m:t>
+              </m:r>
+              <m:r>
+                <m:rPr>
+                  <m:sty m:val="p"/>
+                </m:rPr>
+                <m:t>,</m:t>
+              </m:r>
+              <m:r>
+                <m:t>t</m:t>
+              </m:r>
+            </m:sub>
+          </m:sSub>
+          <m:r>
+            <m:rPr>
+              <m:sty m:val="p"/>
+            </m:rPr>
+            <m:t>=</m:t>
+          </m:r>
+          <m:sSub>
+            <m:e>
+              <m:r>
+                <m:t>γ</m:t>
+              </m:r>
+            </m:e>
+            <m:sub>
+              <m:r>
+                <m:t>0</m:t>
+              </m:r>
+            </m:sub>
+          </m:sSub>
+          <m:r>
+            <m:rPr>
+              <m:sty m:val="p"/>
+            </m:rPr>
+            <m:t>+</m:t>
+          </m:r>
+          <m:sSub>
+            <m:e>
+              <m:r>
+                <m:t>γ</m:t>
+              </m:r>
+            </m:e>
+            <m:sub>
+              <m:r>
+                <m:t>1</m:t>
+              </m:r>
+            </m:sub>
+          </m:sSub>
+          <m:r>
+            <m:t>I</m:t>
+          </m:r>
+          <m:r>
+            <m:t>n</m:t>
+          </m:r>
+          <m:r>
+            <m:t>v</m:t>
+          </m:r>
+          <m:r>
+            <m:t>E</m:t>
+          </m:r>
+          <m:r>
+            <m:t>f</m:t>
+          </m:r>
+          <m:sSub>
+            <m:e>
+              <m:r>
+                <m:t>f</m:t>
+              </m:r>
+            </m:e>
+            <m:sub>
+              <m:r>
+                <m:t>i</m:t>
+              </m:r>
+              <m:r>
+                <m:rPr>
+                  <m:sty m:val="p"/>
+                </m:rPr>
+                <m:t>,</m:t>
+              </m:r>
+              <m:r>
+                <m:t>t</m:t>
+              </m:r>
               <m:r>
                 <m:rPr>
                   <m:sty m:val="p"/>
                 </m:rPr>
                 <m:t>−</m:t>
               </m:r>
+              <m:r>
+                <m:t>1</m:t>
+              </m:r>
+            </m:sub>
+          </m:sSub>
+          <m:r>
+            <m:rPr>
+              <m:sty m:val="p"/>
+            </m:rPr>
+            <m:t>+</m:t>
+          </m:r>
+          <m:sSub>
+            <m:e>
+              <m:r>
+                <m:t>β</m:t>
+              </m:r>
+            </m:e>
+            <m:sub>
+              <m:r>
+                <m:t>2</m:t>
+              </m:r>
+            </m:sub>
+          </m:sSub>
+          <m:r>
+            <m:t>C</m:t>
+          </m:r>
+          <m:r>
+            <m:t>S</m:t>
+          </m:r>
+          <m:sSubSup>
+            <m:e>
+              <m:r>
+                <m:t>D</m:t>
+              </m:r>
+            </m:e>
+            <m:sub>
+              <m:r>
+                <m:t>i</m:t>
+              </m:r>
+              <m:r>
+                <m:rPr>
+                  <m:sty m:val="p"/>
+                </m:rPr>
+                <m:t>,</m:t>
+              </m:r>
+              <m:r>
+                <m:t>t</m:t>
+              </m:r>
+            </m:sub>
+            <m:sup>
+              <m:r>
+                <m:rPr>
+                  <m:sty m:val="p"/>
+                </m:rPr>
+                <m:t>−</m:t>
+              </m:r>
             </m:sup>
           </m:sSubSup>
+          <m:r>
+            <m:rPr>
+              <m:sty m:val="p"/>
+            </m:rPr>
+            <m:t>+</m:t>
+          </m:r>
+          <m:r>
+            <m:t>ϕ</m:t>
+          </m:r>
+          <m:r>
+            <m:t> </m:t>
+          </m:r>
+          <m:r>
+            <m:t>O</m:t>
+          </m:r>
+          <m:r>
+            <m:t>V</m:t>
+          </m:r>
+          <m:r>
+            <m:t>E</m:t>
+          </m:r>
+          <m:sSub>
+            <m:e>
+              <m:r>
+                <m:t>R</m:t>
+              </m:r>
+            </m:e>
+            <m:sub>
+              <m:r>
+                <m:t>i</m:t>
+              </m:r>
+              <m:r>
+                <m:rPr>
+                  <m:sty m:val="p"/>
+                </m:rPr>
+                <m:t>,</m:t>
+              </m:r>
+              <m:r>
+                <m:t>t</m:t>
+              </m:r>
+            </m:sub>
+          </m:sSub>
           <m:r>
             <m:rPr>
               <m:sty m:val="p"/>
@@ -3625,6 +4001,9 @@
             <m:t>6</m:t>
           </m:r>
           <m:r>
+            <m:t>b</m:t>
+          </m:r>
+          <m:r>
             <m:rPr>
               <m:sty m:val="p"/>
             </m:rPr>
@@ -3638,7 +4017,407 @@
         <w:pStyle w:val="FirstParagraph"/>
       </w:pPr>
       <w:r>
-        <w:t xml:space="preserve">H1a predicts β₁ &lt; 0: the further a firm lies above its target, the further its investment falls below the expected level, consistent with debt overhang (Myers, 1977). H1b predicts β₂ &gt; 0: the further a firm lies below its target, the further its investment rises above the expected level, consistent with free-cash-flow problems when debt discipline is weak (Jensen, 1986). Asymmetry is tested with a Wald test of β₁ + β₂ = 0. Both components enter one equation because they are complementary parts of the same deviation; estimating either alone would load the omitted component onto the intercept and bias the included coefficient.</w:t>
+        <w:t xml:space="preserve">UNDER (OVER) equals 1 for under-leveraged (over-leveraged) firm-years. The indicator absorbs the mean investment of firms on the other side of the target, so the slope on CSD⁺ in Eq. (6a) is identified only from over-leveraged firms, and the slope on CSD⁻ in Eq. (6b) only from under-leveraged firms. Because CSD⁺ is zero for every firm with UNDER = 1 and CSD⁻ is zero for every firm with UNDER = 0, omitting the other side’s slope does not bias the tested coefficient.</w:t>
+      </w:r>
+    </w:p>
+    <w:p>
+      <w:pPr>
+        <w:pStyle w:val="BodyText"/>
+      </w:pPr>
+      <w:r>
+        <w:t xml:space="preserve">H1a predicts β₁ &lt; 0: the further a firm lies above its target, the further its investment falls below the expected level, consistent with debt overhang (Myers, 1977). H1b predicts β₂ &gt; 0: the further a firm lies below its target, the further its investment rises above the expected level, consistent with free-cash-flow problems when debt discipline is weak (Jensen, 1986).</w:t>
+      </w:r>
+    </w:p>
+    <w:p>
+      <w:pPr>
+        <w:pStyle w:val="BodyText"/>
+      </w:pPr>
+      <w:r>
+        <w:t xml:space="preserve">Asymmetry, the central claim of the study, compares the two slopes and therefore requires both in one equation:</w:t>
+      </w:r>
+    </w:p>
+    <w:p>
+      <w:pPr>
+        <w:pStyle w:val="BodyText"/>
+      </w:pPr>
+      <m:oMathPara>
+        <m:oMathParaPr>
+          <m:jc m:val="center"/>
+        </m:oMathParaPr>
+        <m:oMath>
+          <m:r>
+            <m:t>I</m:t>
+          </m:r>
+          <m:r>
+            <m:t>n</m:t>
+          </m:r>
+          <m:r>
+            <m:t>v</m:t>
+          </m:r>
+          <m:r>
+            <m:t>E</m:t>
+          </m:r>
+          <m:r>
+            <m:t>f</m:t>
+          </m:r>
+          <m:sSub>
+            <m:e>
+              <m:r>
+                <m:t>f</m:t>
+              </m:r>
+            </m:e>
+            <m:sub>
+              <m:r>
+                <m:t>i</m:t>
+              </m:r>
+              <m:r>
+                <m:rPr>
+                  <m:sty m:val="p"/>
+                </m:rPr>
+                <m:t>,</m:t>
+              </m:r>
+              <m:r>
+                <m:t>t</m:t>
+              </m:r>
+            </m:sub>
+          </m:sSub>
+          <m:r>
+            <m:rPr>
+              <m:sty m:val="p"/>
+            </m:rPr>
+            <m:t>=</m:t>
+          </m:r>
+          <m:sSub>
+            <m:e>
+              <m:r>
+                <m:t>γ</m:t>
+              </m:r>
+            </m:e>
+            <m:sub>
+              <m:r>
+                <m:t>0</m:t>
+              </m:r>
+            </m:sub>
+          </m:sSub>
+          <m:r>
+            <m:rPr>
+              <m:sty m:val="p"/>
+            </m:rPr>
+            <m:t>+</m:t>
+          </m:r>
+          <m:sSub>
+            <m:e>
+              <m:r>
+                <m:t>γ</m:t>
+              </m:r>
+            </m:e>
+            <m:sub>
+              <m:r>
+                <m:t>1</m:t>
+              </m:r>
+            </m:sub>
+          </m:sSub>
+          <m:r>
+            <m:t>I</m:t>
+          </m:r>
+          <m:r>
+            <m:t>n</m:t>
+          </m:r>
+          <m:r>
+            <m:t>v</m:t>
+          </m:r>
+          <m:r>
+            <m:t>E</m:t>
+          </m:r>
+          <m:r>
+            <m:t>f</m:t>
+          </m:r>
+          <m:sSub>
+            <m:e>
+              <m:r>
+                <m:t>f</m:t>
+              </m:r>
+            </m:e>
+            <m:sub>
+              <m:r>
+                <m:t>i</m:t>
+              </m:r>
+              <m:r>
+                <m:rPr>
+                  <m:sty m:val="p"/>
+                </m:rPr>
+                <m:t>,</m:t>
+              </m:r>
+              <m:r>
+                <m:t>t</m:t>
+              </m:r>
+              <m:r>
+                <m:rPr>
+                  <m:sty m:val="p"/>
+                </m:rPr>
+                <m:t>−</m:t>
+              </m:r>
+              <m:r>
+                <m:t>1</m:t>
+              </m:r>
+            </m:sub>
+          </m:sSub>
+          <m:r>
+            <m:rPr>
+              <m:sty m:val="p"/>
+            </m:rPr>
+            <m:t>+</m:t>
+          </m:r>
+          <m:sSub>
+            <m:e>
+              <m:r>
+                <m:t>β</m:t>
+              </m:r>
+            </m:e>
+            <m:sub>
+              <m:r>
+                <m:t>1</m:t>
+              </m:r>
+            </m:sub>
+          </m:sSub>
+          <m:r>
+            <m:t>C</m:t>
+          </m:r>
+          <m:r>
+            <m:t>S</m:t>
+          </m:r>
+          <m:sSubSup>
+            <m:e>
+              <m:r>
+                <m:t>D</m:t>
+              </m:r>
+            </m:e>
+            <m:sub>
+              <m:r>
+                <m:t>i</m:t>
+              </m:r>
+              <m:r>
+                <m:rPr>
+                  <m:sty m:val="p"/>
+                </m:rPr>
+                <m:t>,</m:t>
+              </m:r>
+              <m:r>
+                <m:t>t</m:t>
+              </m:r>
+            </m:sub>
+            <m:sup>
+              <m:r>
+                <m:rPr>
+                  <m:sty m:val="p"/>
+                </m:rPr>
+                <m:t>+</m:t>
+              </m:r>
+            </m:sup>
+          </m:sSubSup>
+          <m:r>
+            <m:rPr>
+              <m:sty m:val="p"/>
+            </m:rPr>
+            <m:t>+</m:t>
+          </m:r>
+          <m:sSub>
+            <m:e>
+              <m:r>
+                <m:t>β</m:t>
+              </m:r>
+            </m:e>
+            <m:sub>
+              <m:r>
+                <m:t>2</m:t>
+              </m:r>
+            </m:sub>
+          </m:sSub>
+          <m:r>
+            <m:t>C</m:t>
+          </m:r>
+          <m:r>
+            <m:t>S</m:t>
+          </m:r>
+          <m:sSubSup>
+            <m:e>
+              <m:r>
+                <m:t>D</m:t>
+              </m:r>
+            </m:e>
+            <m:sub>
+              <m:r>
+                <m:t>i</m:t>
+              </m:r>
+              <m:r>
+                <m:rPr>
+                  <m:sty m:val="p"/>
+                </m:rPr>
+                <m:t>,</m:t>
+              </m:r>
+              <m:r>
+                <m:t>t</m:t>
+              </m:r>
+            </m:sub>
+            <m:sup>
+              <m:r>
+                <m:rPr>
+                  <m:sty m:val="p"/>
+                </m:rPr>
+                <m:t>−</m:t>
+              </m:r>
+            </m:sup>
+          </m:sSubSup>
+          <m:r>
+            <m:rPr>
+              <m:sty m:val="p"/>
+            </m:rPr>
+            <m:t>+</m:t>
+          </m:r>
+          <m:sSup>
+            <m:e>
+              <m:r>
+                <m:t>δ</m:t>
+              </m:r>
+            </m:e>
+            <m:sup>
+              <m:r>
+                <m:rPr>
+                  <m:sty m:val="p"/>
+                </m:rPr>
+                <m:t>′</m:t>
+              </m:r>
+            </m:sup>
+          </m:sSup>
+          <m:sSub>
+            <m:e>
+              <m:r>
+                <m:t>X</m:t>
+              </m:r>
+            </m:e>
+            <m:sub>
+              <m:r>
+                <m:t>i</m:t>
+              </m:r>
+              <m:r>
+                <m:rPr>
+                  <m:sty m:val="p"/>
+                </m:rPr>
+                <m:t>,</m:t>
+              </m:r>
+              <m:r>
+                <m:t>t</m:t>
+              </m:r>
+            </m:sub>
+          </m:sSub>
+          <m:r>
+            <m:rPr>
+              <m:sty m:val="p"/>
+            </m:rPr>
+            <m:t>+</m:t>
+          </m:r>
+          <m:sSub>
+            <m:e>
+              <m:r>
+                <m:t>η</m:t>
+              </m:r>
+            </m:e>
+            <m:sub>
+              <m:r>
+                <m:t>i</m:t>
+              </m:r>
+            </m:sub>
+          </m:sSub>
+          <m:r>
+            <m:rPr>
+              <m:sty m:val="p"/>
+            </m:rPr>
+            <m:t>+</m:t>
+          </m:r>
+          <m:sSub>
+            <m:e>
+              <m:r>
+                <m:t>ν</m:t>
+              </m:r>
+            </m:e>
+            <m:sub>
+              <m:r>
+                <m:t>t</m:t>
+              </m:r>
+            </m:sub>
+          </m:sSub>
+          <m:r>
+            <m:rPr>
+              <m:sty m:val="p"/>
+            </m:rPr>
+            <m:t>+</m:t>
+          </m:r>
+          <m:sSub>
+            <m:e>
+              <m:r>
+                <m:t>λ</m:t>
+              </m:r>
+            </m:e>
+            <m:sub>
+              <m:r>
+                <m:t>j</m:t>
+              </m:r>
+            </m:sub>
+          </m:sSub>
+          <m:r>
+            <m:rPr>
+              <m:sty m:val="p"/>
+            </m:rPr>
+            <m:t>+</m:t>
+          </m:r>
+          <m:sSub>
+            <m:e>
+              <m:r>
+                <m:t>ε</m:t>
+              </m:r>
+            </m:e>
+            <m:sub>
+              <m:r>
+                <m:t>i</m:t>
+              </m:r>
+              <m:r>
+                <m:rPr>
+                  <m:sty m:val="p"/>
+                </m:rPr>
+                <m:t>,</m:t>
+              </m:r>
+              <m:r>
+                <m:t>t</m:t>
+              </m:r>
+            </m:sub>
+          </m:sSub>
+          <m:r>
+            <m:t>  </m:t>
+          </m:r>
+          <m:r>
+            <m:rPr>
+              <m:sty m:val="p"/>
+            </m:rPr>
+            <m:t>(</m:t>
+          </m:r>
+          <m:r>
+            <m:t>6</m:t>
+          </m:r>
+          <m:r>
+            <m:rPr>
+              <m:sty m:val="p"/>
+            </m:rPr>
+            <m:t>)</m:t>
+          </m:r>
+        </m:oMath>
+      </m:oMathPara>
+    </w:p>
+    <w:p>
+      <w:pPr>
+        <w:pStyle w:val="FirstParagraph"/>
+      </w:pPr>
+      <w:r>
+        <w:t xml:space="preserve">Asymmetry is tested with a Wald test of β₁ + β₂ = 0 in Eq. (6).</w:t>
       </w:r>
     </w:p>
     <w:bookmarkEnd w:id="15"/>
@@ -6746,7 +7525,7 @@
               <w:rPr>
                 <w:sz w:val="19"/>
               </w:rPr>
-              <w:t xml:space="preserve">(6)</w:t>
+              <w:t xml:space="preserve">(6a)</w:t>
             </w:r>
           </w:p>
         </w:tc>
@@ -6804,7 +7583,7 @@
               <w:rPr>
                 <w:sz w:val="19"/>
               </w:rPr>
-              <w:t xml:space="preserve">(6)</w:t>
+              <w:t xml:space="preserve">(6b)</w:t>
             </w:r>
           </w:p>
         </w:tc>
@@ -7451,7 +8230,7 @@
               <w:rPr>
                 <w:sz w:val="19"/>
               </w:rPr>
-              <w:t xml:space="preserve">CSD⁺, CSD⁻, MA</w:t>
+              <w:t xml:space="preserve">CSD⁺, CSD⁻, UNDER, OVER, MA</w:t>
             </w:r>
           </w:p>
         </w:tc>
@@ -11606,21 +12385,21 @@
               <w:rPr>
                 <w:sz w:val="19"/>
               </w:rPr>
-              <w:t xml:space="preserve">ln(TA)</w:t>
-            </w:r>
-          </w:p>
-        </w:tc>
-        <w:tc>
-          <w:tcPr/>
-          <w:p>
-            <w:pPr>
-              <w:pStyle w:val="Compact"/>
-            </w:pPr>
-            <w:r>
-              <w:rPr>
-                <w:sz w:val="19"/>
-              </w:rPr>
-              <w:t xml:space="preserve">TA</w:t>
+              <w:t xml:space="preserve">ln(TA / CPI), total assets in 1392 prices</w:t>
+            </w:r>
+          </w:p>
+        </w:tc>
+        <w:tc>
+          <w:tcPr/>
+          <w:p>
+            <w:pPr>
+              <w:pStyle w:val="Compact"/>
+            </w:pPr>
+            <w:r>
+              <w:rPr>
+                <w:sz w:val="19"/>
+              </w:rPr>
+              <w:t xml:space="preserve">TA, INF</w:t>
             </w:r>
           </w:p>
         </w:tc>

</xml_diff>

<commit_message>
Fix runkey model id; lag controls to t-1; pool small industries
- runkey/postfile: model identifiers are strings (6a, 6b), r(198)
- Controls measured at t-1 (Biddle et al. 2009): contemporaneous size and
  profitability are mechanically affected by the investment being explained
- Industries with fewer than 5 firms pooled for the industry dummies
- Methodology (doc, md, docx) synced

Co-Authored-By: Claude Opus 5.5 <noreply@anthropic.com>
Claude-Session: https://claude.ai/code/session_019etBaQcYpfE848z3Ex8rct
</commit_message>
<xml_diff>
--- a/docs/Research_Methodology.docx
+++ b/docs/Research_Methodology.docx
@@ -3173,7 +3173,7 @@
         <w:pStyle w:val="FirstParagraph"/>
       </w:pPr>
       <w:r>
-        <w:t xml:space="preserve">All models include year dummies (ν</w:t>
+        <w:t xml:space="preserve">All controls are measured at t−1, as in Biddle et al. (2009). Current-year size and profitability are mechanically affected by the investment being explained (new assets raise total assets in the same year), so contemporaneous controls would be endogenous. All models include year dummies (ν</w:t>
       </w:r>
       <w:r>
         <w:rPr>
@@ -3209,7 +3209,7 @@
         <w:pStyle w:val="FirstParagraph"/>
       </w:pPr>
       <w:r>
-        <w:t xml:space="preserve">Each hypothesis is tested with its own dynamic panel model, and each prediction is stated as a sign restriction on a named coefficient. Because InvEff is signed, a negative coefficient indicates a shift toward under-investment and a positive coefficient a shift toward over-investment. In all equations, X is the vector of controls (LTA, MTB, PROFIT, FCF), η</w:t>
+        <w:t xml:space="preserve">Each hypothesis is tested with its own dynamic panel model, and each prediction is stated as a sign restriction on a named coefficient. Because InvEff is signed, a negative coefficient indicates a shift toward under-investment and a positive coefficient a shift toward over-investment. In all equations, X is the vector of controls (LTA, MTB, PROFIT, FCF) measured at t−1, η</w:t>
       </w:r>
       <w:r>
         <w:rPr>
@@ -3529,6 +3529,15 @@
               <m:r>
                 <m:t>t</m:t>
               </m:r>
+              <m:r>
+                <m:rPr>
+                  <m:sty m:val="p"/>
+                </m:rPr>
+                <m:t>−</m:t>
+              </m:r>
+              <m:r>
+                <m:t>1</m:t>
+              </m:r>
             </m:sub>
           </m:sSub>
           <m:r>
@@ -3905,6 +3914,15 @@
               <m:r>
                 <m:t>t</m:t>
               </m:r>
+              <m:r>
+                <m:rPr>
+                  <m:sty m:val="p"/>
+                </m:rPr>
+                <m:t>−</m:t>
+              </m:r>
+              <m:r>
+                <m:t>1</m:t>
+              </m:r>
             </m:sub>
           </m:sSub>
           <m:r>
@@ -4308,6 +4326,15 @@
               <m:r>
                 <m:t>t</m:t>
               </m:r>
+              <m:r>
+                <m:rPr>
+                  <m:sty m:val="p"/>
+                </m:rPr>
+                <m:t>−</m:t>
+              </m:r>
+              <m:r>
+                <m:t>1</m:t>
+              </m:r>
             </m:sub>
           </m:sSub>
           <m:r>
@@ -5020,6 +5047,15 @@
               <m:r>
                 <m:t>t</m:t>
               </m:r>
+              <m:r>
+                <m:rPr>
+                  <m:sty m:val="p"/>
+                </m:rPr>
+                <m:t>−</m:t>
+              </m:r>
+              <m:r>
+                <m:t>1</m:t>
+              </m:r>
             </m:sub>
           </m:sSub>
           <m:r>
@@ -5564,6 +5600,15 @@
               <m:r>
                 <m:t>t</m:t>
               </m:r>
+              <m:r>
+                <m:rPr>
+                  <m:sty m:val="p"/>
+                </m:rPr>
+                <m:t>−</m:t>
+              </m:r>
+              <m:r>
+                <m:t>1</m:t>
+              </m:r>
             </m:sub>
           </m:sSub>
           <m:r>
@@ -6094,6 +6139,15 @@
               <m:r>
                 <m:t>t</m:t>
               </m:r>
+              <m:r>
+                <m:rPr>
+                  <m:sty m:val="p"/>
+                </m:rPr>
+                <m:t>−</m:t>
+              </m:r>
+              <m:r>
+                <m:t>1</m:t>
+              </m:r>
             </m:sub>
           </m:sSub>
           <m:r>
@@ -6951,6 +7005,15 @@
               </m:r>
               <m:r>
                 <m:t>t</m:t>
+              </m:r>
+              <m:r>
+                <m:rPr>
+                  <m:sty m:val="p"/>
+                </m:rPr>
+                <m:t>−</m:t>
+              </m:r>
+              <m:r>
+                <m:t>1</m:t>
               </m:r>
             </m:sub>
           </m:sSub>
@@ -8404,7 +8467,7 @@
               <w:rPr>
                 <w:sz w:val="19"/>
               </w:rPr>
-              <w:t xml:space="preserve">LTA, MTB, PROFIT, FCF</w:t>
+              <w:t xml:space="preserve">LTA, MTB, PROFIT, FCF (at t−1)</w:t>
             </w:r>
           </w:p>
         </w:tc>
@@ -8896,7 +8959,7 @@
         <w:pStyle w:val="BodyText"/>
       </w:pPr>
       <w:r>
-        <w:t xml:space="preserve">In the GMM models, year dummies absorb shocks common to all TSE firms, such as currency devaluations, sanctions and policy-rate changes. Without them, these shocks enter the error term as cross-sectional correlation, which invalidates the autocorrelation tests (Roodman, 2009b). Industry dummies are time-invariant: first-differencing removes them, so they enter only the levels equation. Industry × year dummies are not used because they would add more than a hundred instruments.</w:t>
+        <w:t xml:space="preserve">In the GMM models, year dummies absorb shocks common to all TSE firms, such as currency devaluations, sanctions and policy-rate changes. Without them, these shocks enter the error term as cross-sectional correlation, which invalidates the autocorrelation tests (Roodman, 2009b). Industry dummies are time-invariant: first-differencing removes them, so they enter only the levels equation. Industry × year dummies are not used because they would add more than a hundred instruments. Industries with fewer than five firms are pooled into one category for the industry dummies, because a dummy for a single-firm industry is not identified in the levels equation.</w:t>
       </w:r>
     </w:p>
     <w:bookmarkEnd w:id="22"/>
@@ -9428,6 +9491,15 @@
               </m:r>
               <m:r>
                 <m:t>t</m:t>
+              </m:r>
+              <m:r>
+                <m:rPr>
+                  <m:sty m:val="p"/>
+                </m:rPr>
+                <m:t>−</m:t>
+              </m:r>
+              <m:r>
+                <m:t>1</m:t>
               </m:r>
             </m:sub>
           </m:sSub>

</xml_diff>

<commit_message>
Methodology: cash investment as the main measure, accrual measure in R6
Co-Authored-By: Claude Opus 5.5 <noreply@anthropic.com>
Claude-Session: https://claude.ai/code/session_019etBaQcYpfE848z3Ex8rct
</commit_message>
<xml_diff>
--- a/docs/Research_Methodology.docx
+++ b/docs/Research_Methodology.docx
@@ -940,28 +940,7 @@
         <w:pStyle w:val="FirstParagraph"/>
       </w:pPr>
       <w:r>
-        <w:t xml:space="preserve">Invest is the net increase in tangible and intangible assets, (PPE + IA)</w:t>
-      </w:r>
-      <w:r>
-        <w:rPr>
-          <w:vertAlign w:val="subscript"/>
-        </w:rPr>
-        <w:t xml:space="preserve">t</w:t>
-      </w:r>
-      <w:r>
-        <w:t xml:space="preserve"> </w:t>
-      </w:r>
-      <w:r>
-        <w:t xml:space="preserve">− (PPE + IA)</w:t>
-      </w:r>
-      <w:r>
-        <w:rPr>
-          <w:vertAlign w:val="subscript"/>
-        </w:rPr>
-        <w:t xml:space="preserve">t−1</w:t>
-      </w:r>
-      <w:r>
-        <w:t xml:space="preserve">, scaled by total assets at t−1. SalesGrowth is the annual percentage change in sales.</w:t>
+        <w:t xml:space="preserve">Invest is cash investment: net cash paid in investing activities (−CFI) scaled by total assets at t−1. SalesGrowth is the annual percentage change in sales. A cash-based measure is used because TSE firms revalued property, plant and equipment on a large scale in 1398–1401. Under the accrual measure, the increase in net PPE and intangible assets, these revaluations would appear as investment although no resources were spent.</w:t>
       </w:r>
     </w:p>
     <w:p>
@@ -1011,7 +990,37 @@
         <w:pStyle w:val="BodyText"/>
       </w:pPr>
       <w:r>
-        <w:t xml:space="preserve">Two alternative expectation models are used in the robustness tests (Section 3.11): the model of Chen, Hope, Li and Wang (2011), which allows investment to respond differently to sales declines, and a cash-based investment measure, −CFI scaled by lagged total assets, which is unaffected by asset revaluations.</w:t>
+        <w:t xml:space="preserve">Two alternatives are used in the robustness tests (Section 3.11): the expectation model of Chen, Hope, Li and Wang (2011), which allows investment to respond differently to sales declines, and the accrual investment measure, [(PPE + IA)</w:t>
+      </w:r>
+      <w:r>
+        <w:rPr>
+          <w:vertAlign w:val="subscript"/>
+        </w:rPr>
+        <w:t xml:space="preserve">t</w:t>
+      </w:r>
+      <w:r>
+        <w:t xml:space="preserve"> </w:t>
+      </w:r>
+      <w:r>
+        <w:t xml:space="preserve">− (PPE + IA)</w:t>
+      </w:r>
+      <w:r>
+        <w:rPr>
+          <w:vertAlign w:val="subscript"/>
+        </w:rPr>
+        <w:t xml:space="preserve">t−1</w:t>
+      </w:r>
+      <w:r>
+        <w:t xml:space="preserve">] / TA</w:t>
+      </w:r>
+      <w:r>
+        <w:rPr>
+          <w:vertAlign w:val="subscript"/>
+        </w:rPr>
+        <w:t xml:space="preserve">t−1</w:t>
+      </w:r>
+      <w:r>
+        <w:t xml:space="preserve">.</w:t>
       </w:r>
     </w:p>
     <w:bookmarkEnd w:id="10"/>
@@ -10946,20 +10955,52 @@
               <w:rPr>
                 <w:sz w:val="19"/>
               </w:rPr>
-              <w:t xml:space="preserve">Cash-based investment, −CFI / TA</w:t>
+              <w:t xml:space="preserve">Accrual investment, [(PPE + IA)</w:t>
             </w:r>
             <w:r>
               <w:rPr>
                 <w:sz w:val="19"/>
                 <w:vertAlign w:val="subscript"/>
               </w:rPr>
+              <w:t xml:space="preserve">t</w:t>
+            </w:r>
+            <w:r>
+              <w:rPr>
+                <w:sz w:val="19"/>
+              </w:rPr>
+              <w:t xml:space="preserve"> </w:t>
+            </w:r>
+            <w:r>
+              <w:rPr>
+                <w:sz w:val="19"/>
+              </w:rPr>
+              <w:t xml:space="preserve">− (PPE + IA)</w:t>
+            </w:r>
+            <w:r>
+              <w:rPr>
+                <w:sz w:val="19"/>
+                <w:vertAlign w:val="subscript"/>
+              </w:rPr>
               <w:t xml:space="preserve">t−1</w:t>
             </w:r>
             <w:r>
               <w:rPr>
                 <w:sz w:val="19"/>
               </w:rPr>
-              <w:t xml:space="preserve">, unaffected by asset revaluations</w:t>
+              <w:t xml:space="preserve">] / TA</w:t>
+            </w:r>
+            <w:r>
+              <w:rPr>
+                <w:sz w:val="19"/>
+                <w:vertAlign w:val="subscript"/>
+              </w:rPr>
+              <w:t xml:space="preserve">t−1</w:t>
+            </w:r>
+            <w:r>
+              <w:rPr>
+                <w:sz w:val="19"/>
+              </w:rPr>
+              <w:t xml:space="preserve">, which includes asset revaluations</w:t>
             </w:r>
           </w:p>
         </w:tc>
@@ -12115,7 +12156,7 @@
               <w:rPr>
                 <w:sz w:val="19"/>
               </w:rPr>
-              <w:t xml:space="preserve">[(PPE + IA)</w:t>
+              <w:t xml:space="preserve">−CFI</w:t>
             </w:r>
             <w:r>
               <w:rPr>
@@ -12134,7 +12175,7 @@
               <w:rPr>
                 <w:sz w:val="19"/>
               </w:rPr>
-              <w:t xml:space="preserve">− (PPE + IA)</w:t>
+              <w:t xml:space="preserve">/ TA</w:t>
             </w:r>
             <w:r>
               <w:rPr>
@@ -12147,28 +12188,27 @@
               <w:rPr>
                 <w:sz w:val="19"/>
               </w:rPr>
-              <w:t xml:space="preserve">] / TA</w:t>
-            </w:r>
-            <w:r>
-              <w:rPr>
-                <w:sz w:val="19"/>
-                <w:vertAlign w:val="subscript"/>
-              </w:rPr>
-              <w:t xml:space="preserve">t−1</w:t>
-            </w:r>
-          </w:p>
-        </w:tc>
-        <w:tc>
-          <w:tcPr/>
-          <w:p>
-            <w:pPr>
-              <w:pStyle w:val="Compact"/>
-            </w:pPr>
-            <w:r>
-              <w:rPr>
-                <w:sz w:val="19"/>
-              </w:rPr>
-              <w:t xml:space="preserve">PPE, IA, TA</w:t>
+              <w:t xml:space="preserve"> </w:t>
+            </w:r>
+            <w:r>
+              <w:rPr>
+                <w:sz w:val="19"/>
+              </w:rPr>
+              <w:t xml:space="preserve">(cash investment)</w:t>
+            </w:r>
+          </w:p>
+        </w:tc>
+        <w:tc>
+          <w:tcPr/>
+          <w:p>
+            <w:pPr>
+              <w:pStyle w:val="Compact"/>
+            </w:pPr>
+            <w:r>
+              <w:rPr>
+                <w:sz w:val="19"/>
+              </w:rPr>
+              <w:t xml:space="preserve">CFI, TA</w:t>
             </w:r>
           </w:p>
         </w:tc>

</xml_diff>

<commit_message>
Report via esttab RTF (putdocx fails on the user's Stata); endogenous controls; methodology update
- 70_report.do rewritten with esttab: Results_Report.rtf opens in Word, all
  tables plus linked figures
- CTRL_TYPE default endog: controls instrumented with lags t-2, t-3 (Hansen
  rejected the predetermined assumption)
- Methodology: equity filter, pooled INDLEV, industry DEA frontier,
  endogenous controls, S3 definition

Co-Authored-By: Claude Opus 5.5 <noreply@anthropic.com>
Claude-Session: https://claude.ai/code/session_019etBaQcYpfE848z3Ex8rct
</commit_message>
<xml_diff>
--- a/docs/Research_Methodology.docx
+++ b/docs/Research_Methodology.docx
@@ -89,6 +89,18 @@
       </w:pPr>
       <w:r>
         <w:t xml:space="preserve">Retain firms that are continuously listed and have the accounting and market data needed to construct every variable.</w:t>
+      </w:r>
+    </w:p>
+    <w:p>
+      <w:pPr>
+        <w:pStyle w:val="Compact"/>
+        <w:numPr>
+          <w:ilvl w:val="0"/>
+          <w:numId w:val="1001"/>
+        </w:numPr>
+      </w:pPr>
+      <w:r>
+        <w:t xml:space="preserve">Exclude firm-years with zero or negative book equity. Leverage above one and a negative market-to-book ratio make a target capital structure undefined for these firm-years, and their investment reflects financial distress rather than financing choices.</w:t>
       </w:r>
     </w:p>
     <w:tbl>
@@ -325,6 +337,50 @@
                 <w:sz w:val="19"/>
               </w:rPr>
               <w:t xml:space="preserve">[−n]</w:t>
+            </w:r>
+          </w:p>
+        </w:tc>
+        <w:tc>
+          <w:tcPr/>
+          <w:p>
+            <w:pPr>
+              <w:pStyle w:val="Compact"/>
+            </w:pPr>
+            <w:r>
+              <w:rPr>
+                <w:sz w:val="19"/>
+              </w:rPr>
+              <w:t xml:space="preserve">[−n]</w:t>
+            </w:r>
+          </w:p>
+        </w:tc>
+      </w:tr>
+      <w:tr>
+        <w:tc>
+          <w:tcPr/>
+          <w:p>
+            <w:pPr>
+              <w:pStyle w:val="Compact"/>
+            </w:pPr>
+            <w:r>
+              <w:rPr>
+                <w:sz w:val="19"/>
+              </w:rPr>
+              <w:t xml:space="preserve">Less: firm-years with book equity ≤ 0</w:t>
+            </w:r>
+          </w:p>
+        </w:tc>
+        <w:tc>
+          <w:tcPr/>
+          <w:p>
+            <w:pPr>
+              <w:pStyle w:val="Compact"/>
+            </w:pPr>
+            <w:r>
+              <w:rPr>
+                <w:sz w:val="19"/>
+              </w:rPr>
+              <w:t xml:space="preserve">—</w:t>
             </w:r>
           </w:p>
         </w:tc>
@@ -1675,7 +1731,7 @@
         <w:t xml:space="preserve">INDLEV</w:t>
       </w:r>
       <w:r>
-        <w:t xml:space="preserve">: median TDA of the firm’s industry, excluding the firm itself (industry leverage norm).</w:t>
+        <w:t xml:space="preserve">: median TDA of the firm’s industry in the same year, excluding the firm itself (industry leverage norm). Industries with fewer than five firms are pooled into one group, so that the median never rests on one or two peers.</w:t>
       </w:r>
     </w:p>
     <w:p>
@@ -2685,7 +2741,7 @@
         <w:t xml:space="preserve"> </w:t>
       </w:r>
       <w:r>
-        <w:t xml:space="preserve">Data envelopment analysis (DEA) estimates the efficiency with which each firm converts inputs into sales, relative to the efficient frontier of its peers. The model is input-oriented with variable returns to scale. The output is sales. The inputs are cost of goods sold, selling, general and administrative expenses, net PP&amp;E at t−1 and intangible assets at t−1. Lagged capital stocks are used because they are the resources available to managers during the year. The frontier is estimated separately for each industry-year with at least 15 firms, which is three times the number of inputs and outputs (Cooper, Seiford &amp; Tone, 2007). Smaller industry-years are pooled within the industry across years, with monetary values deflated to 1392 prices with the consumer price index, because nominal values are not comparable across years under high inflation. The efficiency score FE lies in (0, 1].</w:t>
+        <w:t xml:space="preserve">Data envelopment analysis (DEA) estimates the efficiency with which each firm converts inputs into sales, relative to the efficient frontier of its peers. The model is input-oriented with variable returns to scale. The output is sales. The inputs are cost of goods sold, selling, general and administrative expenses, net PP&amp;E at t−1 and intangible assets at t−1. Lagged capital stocks are used because they are the resources available to managers during the year. The frontier is estimated for each industry over all sample years, with monetary values deflated to 1392 prices with the consumer price index; industries with fewer than five firms are pooled into one group. Industry-year frontiers are too small in this sample: with four inputs and few firms per industry-year, more than half of the firm-years lie on the frontier, so efficiency does not discriminate between firms. The industry frontier provides many more units than the rule of thumb of three times the number of inputs and outputs (Cooper, Seiford &amp; Tone, 2007). Deflation makes values comparable across years under high inflation. Industry-year frontiers are reported as a sensitivity test. The efficiency score FE lies in (0, 1].</w:t>
       </w:r>
     </w:p>
     <w:p>
@@ -8490,35 +8546,35 @@
               <w:rPr>
                 <w:sz w:val="19"/>
               </w:rPr>
-              <w:t xml:space="preserve">Predetermined</w:t>
-            </w:r>
-          </w:p>
-        </w:tc>
-        <w:tc>
-          <w:tcPr/>
-          <w:p>
-            <w:pPr>
-              <w:pStyle w:val="Compact"/>
-            </w:pPr>
-            <w:r>
-              <w:rPr>
-                <w:sz w:val="19"/>
-              </w:rPr>
-              <w:t xml:space="preserve">Levels at t−1 and t−2</w:t>
-            </w:r>
-          </w:p>
-        </w:tc>
-        <w:tc>
-          <w:tcPr/>
-          <w:p>
-            <w:pPr>
-              <w:pStyle w:val="Compact"/>
-            </w:pPr>
-            <w:r>
-              <w:rPr>
-                <w:sz w:val="19"/>
-              </w:rPr>
-              <w:t xml:space="preserve">Δ at t</w:t>
+              <w:t xml:space="preserve">Endogenous</w:t>
+            </w:r>
+          </w:p>
+        </w:tc>
+        <w:tc>
+          <w:tcPr/>
+          <w:p>
+            <w:pPr>
+              <w:pStyle w:val="Compact"/>
+            </w:pPr>
+            <w:r>
+              <w:rPr>
+                <w:sz w:val="19"/>
+              </w:rPr>
+              <w:t xml:space="preserve">Levels at t−2 and t−3</w:t>
+            </w:r>
+          </w:p>
+        </w:tc>
+        <w:tc>
+          <w:tcPr/>
+          <w:p>
+            <w:pPr>
+              <w:pStyle w:val="Compact"/>
+            </w:pPr>
+            <w:r>
+              <w:rPr>
+                <w:sz w:val="19"/>
+              </w:rPr>
+              <w:t xml:space="preserve">Δ at t−1</w:t>
             </w:r>
           </w:p>
         </w:tc>
@@ -8645,7 +8701,7 @@
         <w:pStyle w:val="BodyText"/>
       </w:pPr>
       <w:r>
-        <w:t xml:space="preserve">The instrument matrix is collapsed and lag depth is restricted to two, so that the instrument count stays below the 299 cross-sectional units. Instrument proliferation overfits the endogenous regressors and weakens the Hansen test (Roodman, 2009a). The instrument count is reported for every model.</w:t>
+        <w:t xml:space="preserve">The controls are treated as endogenous rather than predetermined. Size, growth opportunities, profitability and cash flow respond to past investment shocks, so even their lagged values may be correlated with the error (Wintoki, Linck &amp; Netter, 2012); in this sample the Hansen test also rejected the weaker predetermined assumption. The instrument matrix is collapsed and lag depth is restricted to two, so that the instrument count stays below the 299 cross-sectional units. Instrument proliferation overfits the endogenous regressors and weakens the Hansen test (Roodman, 2009a). The instrument count is reported for every model.</w:t>
       </w:r>
     </w:p>
     <w:bookmarkEnd w:id="21"/>
@@ -11395,7 +11451,7 @@
               <w:rPr>
                 <w:sz w:val="19"/>
               </w:rPr>
-              <w:t xml:space="preserve">VRS (main) vs CRS; minimum frontier size 10, 15 (main), 20</w:t>
+              <w:t xml:space="preserve">VRS (main) vs CRS; industry-year frontiers (at least 15 or 20 firms) instead of industry frontiers</w:t>
             </w:r>
           </w:p>
         </w:tc>
@@ -14034,7 +14090,7 @@
         </w:numPr>
       </w:pPr>
       <w:r>
-        <w:t xml:space="preserve">Fill in the [n] counts in the sample-construction table in 3.1 from your screening records.</w:t>
+        <w:t xml:space="preserve">Fill in the [n] counts in the sample-construction table in 3.1 from your screening records, including the firm-years removed for non-positive book equity (reported in the Stata log). Update 299 firms / 3,588 records if the equity filter changes them.</w:t>
       </w:r>
     </w:p>
     <w:p>

</xml_diff>

<commit_message>
Final specification: CSD and MA at t-1, forward orthogonal deviations, Biddle (2009) controls, instrument-strength rule; previous spec in S9; methodology updated
Co-Authored-By: Claude Opus 5.5 <noreply@anthropic.com>
Claude-Session: https://claude.ai/code/session_019etBaQcYpfE848z3Ex8rct
</commit_message>
<xml_diff>
--- a/docs/Research_Methodology.docx
+++ b/docs/Research_Methodology.docx
@@ -3235,10 +3235,86 @@
     </w:p>
     <w:p>
       <w:pPr>
+        <w:pStyle w:val="Compact"/>
+        <w:numPr>
+          <w:ilvl w:val="0"/>
+          <w:numId w:val="1003"/>
+        </w:numPr>
+      </w:pPr>
+      <w:r>
+        <w:rPr>
+          <w:b/>
+          <w:bCs/>
+        </w:rPr>
+        <w:t xml:space="preserve">TANG</w:t>
+      </w:r>
+      <w:r>
+        <w:t xml:space="preserve">: net PP&amp;E / total assets. Asset tangibility determines the scope for collateralised financing and the share of investment that is lumpy and irreversible.</w:t>
+      </w:r>
+    </w:p>
+    <w:p>
+      <w:pPr>
+        <w:pStyle w:val="Compact"/>
+        <w:numPr>
+          <w:ilvl w:val="0"/>
+          <w:numId w:val="1003"/>
+        </w:numPr>
+      </w:pPr>
+      <w:r>
+        <w:rPr>
+          <w:b/>
+          <w:bCs/>
+        </w:rPr>
+        <w:t xml:space="preserve">LOSS</w:t>
+      </w:r>
+      <w:r>
+        <w:t xml:space="preserve">: 1 if operating income is negative, 0 otherwise. Loss firms face tighter financing constraints and are more likely to cut investment.</w:t>
+      </w:r>
+    </w:p>
+    <w:p>
+      <w:pPr>
+        <w:pStyle w:val="Compact"/>
+        <w:numPr>
+          <w:ilvl w:val="0"/>
+          <w:numId w:val="1003"/>
+        </w:numPr>
+      </w:pPr>
+      <w:r>
+        <w:rPr>
+          <w:b/>
+          <w:bCs/>
+        </w:rPr>
+        <w:t xml:space="preserve">σ(CFO)</w:t>
+      </w:r>
+      <w:r>
+        <w:t xml:space="preserve">: standard deviation of CFO / TA over t−3 to t−1. Volatile operating cash flows raise the cost of external finance and make investment harder to plan.</w:t>
+      </w:r>
+    </w:p>
+    <w:p>
+      <w:pPr>
+        <w:pStyle w:val="Compact"/>
+        <w:numPr>
+          <w:ilvl w:val="0"/>
+          <w:numId w:val="1003"/>
+        </w:numPr>
+      </w:pPr>
+      <w:r>
+        <w:rPr>
+          <w:b/>
+          <w:bCs/>
+        </w:rPr>
+        <w:t xml:space="preserve">σ(Sales)</w:t>
+      </w:r>
+      <w:r>
+        <w:t xml:space="preserve">: standard deviation of Sales / TA over t−3 to t−1. Volatile demand reduces the accuracy of the expectation model, Eq. (1), and therefore the size of the residual.</w:t>
+      </w:r>
+    </w:p>
+    <w:p>
+      <w:pPr>
         <w:pStyle w:val="FirstParagraph"/>
       </w:pPr>
       <w:r>
-        <w:t xml:space="preserve">All controls are measured at t−1, as in Biddle et al. (2009). Current-year size and profitability are mechanically affected by the investment being explained (new assets raise total assets in the same year), so contemporaneous controls would be endogenous. All models include year dummies (ν</w:t>
+        <w:t xml:space="preserve">The control set reproduces the firm-level controls of Biddle et al. (2009) that can be built from the data available for TSE firms; Z-score, dividend payout, slack and operating cycle are not included because the required items are not available. All controls are measured at t−1, as in Biddle et al. (2009); the volatility measures use the three years ending at t−1. Current-year size and profitability are mechanically affected by the investment being explained (new assets raise total assets in the same year), so contemporaneous controls would be endogenous. All models include year dummies (ν</w:t>
       </w:r>
       <w:r>
         <w:rPr>
@@ -3274,7 +3350,7 @@
         <w:pStyle w:val="FirstParagraph"/>
       </w:pPr>
       <w:r>
-        <w:t xml:space="preserve">Each hypothesis is tested with its own dynamic panel model, and each prediction is stated as a sign restriction on a named coefficient. Because InvEff is signed, a negative coefficient indicates a shift toward under-investment and a positive coefficient a shift toward over-investment. In all equations, X is the vector of controls (LTA, MTB, PROFIT, FCF) measured at t−1, η</w:t>
+        <w:t xml:space="preserve">Each hypothesis is tested with its own dynamic panel model, and each prediction is stated as a sign restriction on a named coefficient. Because InvEff is signed, a negative coefficient indicates a shift toward under-investment and a positive coefficient a shift toward over-investment. In all equations, X is the vector of controls (LTA, MTB, PROFIT, FCF, TANG, LOSS, σ(CFO), σ(Sales)) measured at t−1, η</w:t>
       </w:r>
       <w:r>
         <w:rPr>
@@ -3311,6 +3387,48 @@
       </w:r>
       <w:r>
         <w:t xml:space="preserve">are industry dummies and ε is the idiosyncratic error.</w:t>
+      </w:r>
+    </w:p>
+    <w:p>
+      <w:pPr>
+        <w:pStyle w:val="BodyText"/>
+      </w:pPr>
+      <w:r>
+        <w:rPr>
+          <w:b/>
+          <w:bCs/>
+        </w:rPr>
+        <w:t xml:space="preserve">Timing.</w:t>
+      </w:r>
+      <w:r>
+        <w:t xml:space="preserve"> </w:t>
+      </w:r>
+      <w:r>
+        <w:t xml:space="preserve">Capital structure deviation and managerial ability enter every model at t−1, the start of the year in which the investment is made. The hypotheses concern the effect of a firm’s position relative to its target on the investment decisions that follow: debt overhang (Myers, 1977) constrains the investment of a firm that is already over-leveraged, and free cash flow (Jensen, 1986) is available to the managers of a firm that is already under-leveraged. Measured in year t, the deviation would partly reflect the financing of the investment being explained: investment financed with new debt raises TDA</w:t>
+      </w:r>
+      <w:r>
+        <w:rPr>
+          <w:vertAlign w:val="subscript"/>
+        </w:rPr>
+        <w:t xml:space="preserve">t</w:t>
+      </w:r>
+      <w:r>
+        <w:t xml:space="preserve"> </w:t>
+      </w:r>
+      <w:r>
+        <w:t xml:space="preserve">and therefore CSD⁺</w:t>
+      </w:r>
+      <w:r>
+        <w:rPr>
+          <w:vertAlign w:val="subscript"/>
+        </w:rPr>
+        <w:t xml:space="preserve">t</w:t>
+      </w:r>
+      <w:r>
+        <w:t xml:space="preserve"> </w:t>
+      </w:r>
+      <w:r>
+        <w:t xml:space="preserve">in the same year, which creates a positive mechanical relation that works against H1a. The same argument applies to MA, whose DEA inputs and output (cost of goods sold, SG&amp;A and sales) move with current-year investment. Measuring both at t−1 matches the timing of the life-cycle stage (Section 3.4) and of the controls (Section 3.6), so every explanatory variable is observed before the investment year begins. The contemporaneous specification is reported as robustness test R4.</w:t>
       </w:r>
     </w:p>
     <w:bookmarkStart w:id="15" w:name="X3083588f728d44c3e377ccffda16ca22702e55f"/>
@@ -3499,6 +3617,15 @@
               <m:r>
                 <m:t>t</m:t>
               </m:r>
+              <m:r>
+                <m:rPr>
+                  <m:sty m:val="p"/>
+                </m:rPr>
+                <m:t>−</m:t>
+              </m:r>
+              <m:r>
+                <m:t>1</m:t>
+              </m:r>
             </m:sub>
             <m:sup>
               <m:r>
@@ -3551,6 +3678,15 @@
               </m:r>
               <m:r>
                 <m:t>t</m:t>
+              </m:r>
+              <m:r>
+                <m:rPr>
+                  <m:sty m:val="p"/>
+                </m:rPr>
+                <m:t>−</m:t>
+              </m:r>
+              <m:r>
+                <m:t>1</m:t>
               </m:r>
             </m:sub>
           </m:sSub>
@@ -3887,6 +4023,15 @@
               <m:r>
                 <m:t>t</m:t>
               </m:r>
+              <m:r>
+                <m:rPr>
+                  <m:sty m:val="p"/>
+                </m:rPr>
+                <m:t>−</m:t>
+              </m:r>
+              <m:r>
+                <m:t>1</m:t>
+              </m:r>
             </m:sub>
             <m:sup>
               <m:r>
@@ -3936,6 +4081,15 @@
               </m:r>
               <m:r>
                 <m:t>t</m:t>
+              </m:r>
+              <m:r>
+                <m:rPr>
+                  <m:sty m:val="p"/>
+                </m:rPr>
+                <m:t>−</m:t>
+              </m:r>
+              <m:r>
+                <m:t>1</m:t>
               </m:r>
             </m:sub>
           </m:sSub>
@@ -4288,6 +4442,15 @@
               <m:r>
                 <m:t>t</m:t>
               </m:r>
+              <m:r>
+                <m:rPr>
+                  <m:sty m:val="p"/>
+                </m:rPr>
+                <m:t>−</m:t>
+              </m:r>
+              <m:r>
+                <m:t>1</m:t>
+              </m:r>
             </m:sub>
             <m:sup>
               <m:r>
@@ -4340,6 +4503,15 @@
               </m:r>
               <m:r>
                 <m:t>t</m:t>
+              </m:r>
+              <m:r>
+                <m:rPr>
+                  <m:sty m:val="p"/>
+                </m:rPr>
+                <m:t>−</m:t>
+              </m:r>
+              <m:r>
+                <m:t>1</m:t>
               </m:r>
             </m:sub>
             <m:sup>
@@ -4699,6 +4871,15 @@
               <m:r>
                 <m:t>t</m:t>
               </m:r>
+              <m:r>
+                <m:rPr>
+                  <m:sty m:val="p"/>
+                </m:rPr>
+                <m:t>−</m:t>
+              </m:r>
+              <m:r>
+                <m:t>1</m:t>
+              </m:r>
             </m:sub>
             <m:sup>
               <m:r>
@@ -4752,6 +4933,15 @@
               <m:r>
                 <m:t>t</m:t>
               </m:r>
+              <m:r>
+                <m:rPr>
+                  <m:sty m:val="p"/>
+                </m:rPr>
+                <m:t>−</m:t>
+              </m:r>
+              <m:r>
+                <m:t>1</m:t>
+              </m:r>
             </m:sub>
             <m:sup>
               <m:r>
@@ -4919,6 +5109,15 @@
               <m:r>
                 <m:t>t</m:t>
               </m:r>
+              <m:r>
+                <m:rPr>
+                  <m:sty m:val="p"/>
+                </m:rPr>
+                <m:t>−</m:t>
+              </m:r>
+              <m:r>
+                <m:t>1</m:t>
+              </m:r>
             </m:sub>
             <m:sup>
               <m:r>
@@ -5019,6 +5218,15 @@
               </m:r>
               <m:r>
                 <m:t>t</m:t>
+              </m:r>
+              <m:r>
+                <m:rPr>
+                  <m:sty m:val="p"/>
+                </m:rPr>
+                <m:t>−</m:t>
+              </m:r>
+              <m:r>
+                <m:t>1</m:t>
               </m:r>
             </m:sub>
             <m:sup>
@@ -5410,6 +5618,15 @@
               <m:r>
                 <m:t>t</m:t>
               </m:r>
+              <m:r>
+                <m:rPr>
+                  <m:sty m:val="p"/>
+                </m:rPr>
+                <m:t>−</m:t>
+              </m:r>
+              <m:r>
+                <m:t>1</m:t>
+              </m:r>
             </m:sub>
             <m:sup>
               <m:r>
@@ -5463,6 +5680,15 @@
               <m:r>
                 <m:t>t</m:t>
               </m:r>
+              <m:r>
+                <m:rPr>
+                  <m:sty m:val="p"/>
+                </m:rPr>
+                <m:t>−</m:t>
+              </m:r>
+              <m:r>
+                <m:t>1</m:t>
+              </m:r>
             </m:sub>
             <m:sup>
               <m:r>
@@ -5572,6 +5798,15 @@
               </m:r>
               <m:r>
                 <m:t>t</m:t>
+              </m:r>
+              <m:r>
+                <m:rPr>
+                  <m:sty m:val="p"/>
+                </m:rPr>
+                <m:t>−</m:t>
+              </m:r>
+              <m:r>
+                <m:t>1</m:t>
               </m:r>
             </m:sub>
             <m:sup>
@@ -5973,6 +6208,15 @@
               <m:r>
                 <m:t>t</m:t>
               </m:r>
+              <m:r>
+                <m:rPr>
+                  <m:sty m:val="p"/>
+                </m:rPr>
+                <m:t>−</m:t>
+              </m:r>
+              <m:r>
+                <m:t>1</m:t>
+              </m:r>
             </m:sub>
             <m:sup>
               <m:r>
@@ -6026,6 +6270,15 @@
               <m:r>
                 <m:t>t</m:t>
               </m:r>
+              <m:r>
+                <m:rPr>
+                  <m:sty m:val="p"/>
+                </m:rPr>
+                <m:t>−</m:t>
+              </m:r>
+              <m:r>
+                <m:t>1</m:t>
+              </m:r>
             </m:sub>
             <m:sup>
               <m:r>
@@ -6076,6 +6329,15 @@
               <m:r>
                 <m:t>t</m:t>
               </m:r>
+              <m:r>
+                <m:rPr>
+                  <m:sty m:val="p"/>
+                </m:rPr>
+                <m:t>−</m:t>
+              </m:r>
+              <m:r>
+                <m:t>1</m:t>
+              </m:r>
             </m:sub>
           </m:sSub>
           <m:r>
@@ -6123,6 +6385,15 @@
               </m:r>
               <m:r>
                 <m:t>t</m:t>
+              </m:r>
+              <m:r>
+                <m:rPr>
+                  <m:sty m:val="p"/>
+                </m:rPr>
+                <m:t>−</m:t>
+              </m:r>
+              <m:r>
+                <m:t>1</m:t>
               </m:r>
             </m:sub>
             <m:sup>
@@ -6161,6 +6432,15 @@
               </m:r>
               <m:r>
                 <m:t>t</m:t>
+              </m:r>
+              <m:r>
+                <m:rPr>
+                  <m:sty m:val="p"/>
+                </m:rPr>
+                <m:t>−</m:t>
+              </m:r>
+              <m:r>
+                <m:t>1</m:t>
               </m:r>
             </m:sub>
           </m:sSub>
@@ -6840,6 +7120,15 @@
               <m:r>
                 <m:t>t</m:t>
               </m:r>
+              <m:r>
+                <m:rPr>
+                  <m:sty m:val="p"/>
+                </m:rPr>
+                <m:t>−</m:t>
+              </m:r>
+              <m:r>
+                <m:t>1</m:t>
+              </m:r>
             </m:sub>
             <m:sup>
               <m:r>
@@ -6893,6 +7182,15 @@
               <m:r>
                 <m:t>t</m:t>
               </m:r>
+              <m:r>
+                <m:rPr>
+                  <m:sty m:val="p"/>
+                </m:rPr>
+                <m:t>−</m:t>
+              </m:r>
+              <m:r>
+                <m:t>1</m:t>
+              </m:r>
             </m:sub>
             <m:sup>
               <m:r>
@@ -6943,6 +7241,15 @@
               <m:r>
                 <m:t>t</m:t>
               </m:r>
+              <m:r>
+                <m:rPr>
+                  <m:sty m:val="p"/>
+                </m:rPr>
+                <m:t>−</m:t>
+              </m:r>
+              <m:r>
+                <m:t>1</m:t>
+              </m:r>
             </m:sub>
           </m:sSub>
           <m:r>
@@ -6990,6 +7297,15 @@
               </m:r>
               <m:r>
                 <m:t>t</m:t>
+              </m:r>
+              <m:r>
+                <m:rPr>
+                  <m:sty m:val="p"/>
+                </m:rPr>
+                <m:t>−</m:t>
+              </m:r>
+              <m:r>
+                <m:t>1</m:t>
               </m:r>
             </m:sub>
             <m:sup>
@@ -7028,6 +7344,15 @@
               </m:r>
               <m:r>
                 <m:t>t</m:t>
+              </m:r>
+              <m:r>
+                <m:rPr>
+                  <m:sty m:val="p"/>
+                </m:rPr>
+                <m:t>−</m:t>
+              </m:r>
+              <m:r>
+                <m:t>1</m:t>
               </m:r>
             </m:sub>
           </m:sSub>
@@ -8133,7 +8458,7 @@
         <w:t xml:space="preserve"> </w:t>
       </w:r>
       <w:r>
-        <w:t xml:space="preserve">Investment financed with new debt raises leverage in the same year, so CSD⁺ and CSD⁻ are jointly determined with InvEff. This mechanical link works against H1a and H1b.</w:t>
+        <w:t xml:space="preserve">Investment financed with new debt raises leverage in the same year, so contemporaneous CSD⁺ and CSD⁻ would be jointly determined with InvEff. Measuring the deviation at t−1 removes this mechanical link (Section 3.7), but lagged deviation can still respond to past investment shocks, so it is not treated as exogenous.</w:t>
       </w:r>
     </w:p>
     <w:p>
@@ -8155,7 +8480,7 @@
         <w:t xml:space="preserve"> </w:t>
       </w:r>
       <w:r>
-        <w:t xml:space="preserve">MA is constructed from same-year sales efficiency, and both MA and CSDev are estimated regressors.</w:t>
+        <w:t xml:space="preserve">MA is constructed from sales efficiency, which shares shocks with investment, and both MA and CSDev are estimated regressors.</w:t>
       </w:r>
     </w:p>
     <w:bookmarkEnd w:id="20"/>
@@ -8173,7 +8498,7 @@
         <w:pStyle w:val="FirstParagraph"/>
       </w:pPr>
       <w:r>
-        <w:t xml:space="preserve">Eqs. (6)–(12) are estimated with the two-step System GMM estimator (Arellano &amp; Bover, 1995; Blundell &amp; Bond, 1998), implemented with xtabond2 (Roodman, 2009b). Standard errors use the Windmeijer (2005) finite-sample correction. System GMM stacks the first-differenced equation, which removes η</w:t>
+        <w:t xml:space="preserve">Eqs. (6)–(12) are estimated with the two-step System GMM estimator (Arellano &amp; Bover, 1995; Blundell &amp; Bond, 1998), implemented with xtabond2 (Roodman, 2009b). Standard errors use the Windmeijer (2005) finite-sample correction. System GMM stacks a transformed equation, which removes η</w:t>
       </w:r>
       <w:r>
         <w:rPr>
@@ -8185,7 +8510,27 @@
         <w:t xml:space="preserve"> </w:t>
       </w:r>
       <w:r>
-        <w:t xml:space="preserve">and is instrumented with lagged levels, and the levels equation, instrumented with lagged first differences. The levels equation is valid if changes in the instruments are uncorrelated with the firm effect. It adds information that is valuable when the series are persistent and the panel is short, in which case lagged levels are weak instruments for first differences (Blundell &amp; Bond, 1998).</w:t>
+        <w:t xml:space="preserve">and is instrumented with lagged levels, and the levels equation, instrumented with lagged first differences. The transformation is the forward orthogonal deviation (Arellano &amp; Bover, 1995): each observation is expressed as its deviation from the mean of all future observations of the same firm. The panel has gaps, because firm-years with non-positive book equity are excluded (Section 3.1). First-differencing loses two observations at every gap, while the forward orthogonal deviation loses only one and uses all available future information (Roodman, 2009b). First differences are reported as sensitivity test S9a. The levels equation is valid if changes in the instruments are uncorrelated with the firm effect. It adds information that is valuable when the series are persistent and the panel is short, in which case lagged levels are weak instruments for first differences (Blundell &amp; Bond, 1998).</w:t>
+      </w:r>
+    </w:p>
+    <w:p>
+      <w:pPr>
+        <w:pStyle w:val="BodyText"/>
+      </w:pPr>
+      <w:r>
+        <w:t xml:space="preserve">Lags in the table refer to the regressor as it enters the model; for example, the instruments of CSD⁺</w:t>
+      </w:r>
+      <w:r>
+        <w:rPr>
+          <w:vertAlign w:val="subscript"/>
+        </w:rPr>
+        <w:t xml:space="preserve">t−1</w:t>
+      </w:r>
+      <w:r>
+        <w:t xml:space="preserve"> </w:t>
+      </w:r>
+      <w:r>
+        <w:t xml:space="preserve">are its own values two and three periods earlier.</w:t>
       </w:r>
     </w:p>
     <w:tbl>
@@ -8260,7 +8605,7 @@
                 <w:b/>
                 <w:sz w:val="19"/>
               </w:rPr>
-              <w:t xml:space="preserve">Differenced equation: GMM-style instruments</w:t>
+              <w:t xml:space="preserve">Transformed equation: GMM-style instruments</w:t>
             </w:r>
           </w:p>
         </w:tc>
@@ -8328,21 +8673,21 @@
               <w:rPr>
                 <w:sz w:val="19"/>
               </w:rPr>
-              <w:t xml:space="preserve">Levels at t−2 and t−3</w:t>
-            </w:r>
-          </w:p>
-        </w:tc>
-        <w:tc>
-          <w:tcPr/>
-          <w:p>
-            <w:pPr>
-              <w:pStyle w:val="Compact"/>
-            </w:pPr>
-            <w:r>
-              <w:rPr>
-                <w:sz w:val="19"/>
-              </w:rPr>
-              <w:t xml:space="preserve">Δ at t−1</w:t>
+              <w:t xml:space="preserve">Lags 2 and 3</w:t>
+            </w:r>
+          </w:p>
+        </w:tc>
+        <w:tc>
+          <w:tcPr/>
+          <w:p>
+            <w:pPr>
+              <w:pStyle w:val="Compact"/>
+            </w:pPr>
+            <w:r>
+              <w:rPr>
+                <w:sz w:val="19"/>
+              </w:rPr>
+              <w:t xml:space="preserve">Δ, lag 1</w:t>
             </w:r>
           </w:p>
         </w:tc>
@@ -8358,7 +8703,7 @@
               <w:rPr>
                 <w:sz w:val="19"/>
               </w:rPr>
-              <w:t xml:space="preserve">CSD⁺, CSD⁻, UNDER, OVER, MA</w:t>
+              <w:t xml:space="preserve">CSD⁺, CSD⁻, UNDER, OVER, MA (at t−1)</w:t>
             </w:r>
           </w:p>
         </w:tc>
@@ -8386,21 +8731,21 @@
               <w:rPr>
                 <w:sz w:val="19"/>
               </w:rPr>
-              <w:t xml:space="preserve">Levels at t−2 and t−3</w:t>
-            </w:r>
-          </w:p>
-        </w:tc>
-        <w:tc>
-          <w:tcPr/>
-          <w:p>
-            <w:pPr>
-              <w:pStyle w:val="Compact"/>
-            </w:pPr>
-            <w:r>
-              <w:rPr>
-                <w:sz w:val="19"/>
-              </w:rPr>
-              <w:t xml:space="preserve">Δ at t−1</w:t>
+              <w:t xml:space="preserve">Lags 2 and 3</w:t>
+            </w:r>
+          </w:p>
+        </w:tc>
+        <w:tc>
+          <w:tcPr/>
+          <w:p>
+            <w:pPr>
+              <w:pStyle w:val="Compact"/>
+            </w:pPr>
+            <w:r>
+              <w:rPr>
+                <w:sz w:val="19"/>
+              </w:rPr>
+              <w:t xml:space="preserve">Δ, lag 1</w:t>
             </w:r>
           </w:p>
         </w:tc>
@@ -8444,21 +8789,21 @@
               <w:rPr>
                 <w:sz w:val="19"/>
               </w:rPr>
-              <w:t xml:space="preserve">Levels at t−2 and t−3</w:t>
-            </w:r>
-          </w:p>
-        </w:tc>
-        <w:tc>
-          <w:tcPr/>
-          <w:p>
-            <w:pPr>
-              <w:pStyle w:val="Compact"/>
-            </w:pPr>
-            <w:r>
-              <w:rPr>
-                <w:sz w:val="19"/>
-              </w:rPr>
-              <w:t xml:space="preserve">Δ at t−1</w:t>
+              <w:t xml:space="preserve">Lags 2 and 3</w:t>
+            </w:r>
+          </w:p>
+        </w:tc>
+        <w:tc>
+          <w:tcPr/>
+          <w:p>
+            <w:pPr>
+              <w:pStyle w:val="Compact"/>
+            </w:pPr>
+            <w:r>
+              <w:rPr>
+                <w:sz w:val="19"/>
+              </w:rPr>
+              <w:t xml:space="preserve">Δ, lag 1</w:t>
             </w:r>
           </w:p>
         </w:tc>
@@ -8502,21 +8847,21 @@
               <w:rPr>
                 <w:sz w:val="19"/>
               </w:rPr>
-              <w:t xml:space="preserve">Levels at t−1 and t−2</w:t>
-            </w:r>
-          </w:p>
-        </w:tc>
-        <w:tc>
-          <w:tcPr/>
-          <w:p>
-            <w:pPr>
-              <w:pStyle w:val="Compact"/>
-            </w:pPr>
-            <w:r>
-              <w:rPr>
-                <w:sz w:val="19"/>
-              </w:rPr>
-              <w:t xml:space="preserve">Δ at t</w:t>
+              <w:t xml:space="preserve">Lags 1 and 2</w:t>
+            </w:r>
+          </w:p>
+        </w:tc>
+        <w:tc>
+          <w:tcPr/>
+          <w:p>
+            <w:pPr>
+              <w:pStyle w:val="Compact"/>
+            </w:pPr>
+            <w:r>
+              <w:rPr>
+                <w:sz w:val="19"/>
+              </w:rPr>
+              <w:t xml:space="preserve">Δ, current</w:t>
             </w:r>
           </w:p>
         </w:tc>
@@ -8532,7 +8877,7 @@
               <w:rPr>
                 <w:sz w:val="19"/>
               </w:rPr>
-              <w:t xml:space="preserve">LTA, MTB, PROFIT, FCF (at t−1)</w:t>
+              <w:t xml:space="preserve">Controls (at t−1)</w:t>
             </w:r>
           </w:p>
         </w:tc>
@@ -8560,21 +8905,21 @@
               <w:rPr>
                 <w:sz w:val="19"/>
               </w:rPr>
-              <w:t xml:space="preserve">Levels at t−2 and t−3</w:t>
-            </w:r>
-          </w:p>
-        </w:tc>
-        <w:tc>
-          <w:tcPr/>
-          <w:p>
-            <w:pPr>
-              <w:pStyle w:val="Compact"/>
-            </w:pPr>
-            <w:r>
-              <w:rPr>
-                <w:sz w:val="19"/>
-              </w:rPr>
-              <w:t xml:space="preserve">Δ at t−1</w:t>
+              <w:t xml:space="preserve">Lags 2 and 3</w:t>
+            </w:r>
+          </w:p>
+        </w:tc>
+        <w:tc>
+          <w:tcPr/>
+          <w:p>
+            <w:pPr>
+              <w:pStyle w:val="Compact"/>
+            </w:pPr>
+            <w:r>
+              <w:rPr>
+                <w:sz w:val="19"/>
+              </w:rPr>
+              <w:t xml:space="preserve">Δ, lag 1</w:t>
             </w:r>
           </w:p>
         </w:tc>
@@ -8702,6 +9047,14 @@
       </w:pPr>
       <w:r>
         <w:t xml:space="preserve">The controls are treated as endogenous rather than predetermined. Size, growth opportunities, profitability and cash flow respond to past investment shocks, so even their lagged values may be correlated with the error (Wintoki, Linck &amp; Netter, 2012); in this sample the Hansen test also rejected the weaker predetermined assumption. The instrument matrix is collapsed and lag depth is restricted to two, so that the instrument count stays below the 299 cross-sectional units. Instrument proliferation overfits the endogenous regressors and weakens the Hansen test (Roodman, 2009a). The instrument count is reported for every model.</w:t>
+      </w:r>
+    </w:p>
+    <w:p>
+      <w:pPr>
+        <w:pStyle w:val="BodyText"/>
+      </w:pPr>
+      <w:r>
+        <w:t xml:space="preserve">Restricting lag depth keeps the instrument count low but can leave the instruments weak, and weak instruments make GMM estimates imprecise and biased toward OLS (Bun &amp; Windmeijer, 2010). Instrument strength is therefore checked before any hypothesis model is estimated. For each main regressor (CSD⁺, CSD⁻, MA), the cluster-robust first-stage F statistic of its collapsed lag instruments is computed for the transformed and levels equations. The lag window is fixed by a rule set in advance: lags 2–3 are kept unless the weakest first-stage F is below 10 (Staiger &amp; Stock, 1997) and the window of lags 2–4 gives stronger instruments, in which case lags 2–4 are used. The F statistics and the window selected are reported in the Online Appendix (OA10). The rule depends only on the first stages, never on the hypothesis tests.</w:t>
       </w:r>
     </w:p>
     <w:bookmarkEnd w:id="21"/>
@@ -9024,7 +9377,7 @@
         <w:pStyle w:val="BodyText"/>
       </w:pPr>
       <w:r>
-        <w:t xml:space="preserve">In the GMM models, year dummies absorb shocks common to all TSE firms, such as currency devaluations, sanctions and policy-rate changes. Without them, these shocks enter the error term as cross-sectional correlation, which invalidates the autocorrelation tests (Roodman, 2009b). Industry dummies are time-invariant: first-differencing removes them, so they enter only the levels equation. Industry × year dummies are not used because they would add more than a hundred instruments. Industries with fewer than five firms are pooled into one category for the industry dummies, because a dummy for a single-firm industry is not identified in the levels equation.</w:t>
+        <w:t xml:space="preserve">In the GMM models, year dummies absorb shocks common to all TSE firms, such as currency devaluations, sanctions and policy-rate changes. Without them, these shocks enter the error term as cross-sectional correlation, which invalidates the autocorrelation tests (Roodman, 2009b). Industry dummies are time-invariant: the forward orthogonal deviation removes them, so they enter only the levels equation. Industry × year dummies are not used because they would add more than a hundred instruments. Industries with fewer than five firms are pooled into one category for the industry dummies, because a dummy for a single-firm industry is not identified in the levels equation.</w:t>
       </w:r>
     </w:p>
     <w:bookmarkEnd w:id="22"/>
@@ -9159,6 +9512,36 @@
                 <w:sz w:val="19"/>
               </w:rPr>
               <w:t xml:space="preserve">Not rejected (p &gt; 0.10)</w:t>
+            </w:r>
+          </w:p>
+        </w:tc>
+      </w:tr>
+      <w:tr>
+        <w:tc>
+          <w:tcPr/>
+          <w:p>
+            <w:pPr>
+              <w:pStyle w:val="Compact"/>
+            </w:pPr>
+            <w:r>
+              <w:rPr>
+                <w:sz w:val="19"/>
+              </w:rPr>
+              <w:t xml:space="preserve">Instrument strength (first-stage F of the main regressors)</w:t>
+            </w:r>
+          </w:p>
+        </w:tc>
+        <w:tc>
+          <w:tcPr/>
+          <w:p>
+            <w:pPr>
+              <w:pStyle w:val="Compact"/>
+            </w:pPr>
+            <w:r>
+              <w:rPr>
+                <w:sz w:val="19"/>
+              </w:rPr>
+              <w:t xml:space="preserve">Reported; lag window chosen by the rule in Section 3.8.2</w:t>
             </w:r>
           </w:p>
         </w:tc>
@@ -10909,21 +11292,21 @@
               <w:rPr>
                 <w:sz w:val="19"/>
               </w:rPr>
-              <w:t xml:space="preserve">Timing of deviation</w:t>
-            </w:r>
-          </w:p>
-        </w:tc>
-        <w:tc>
-          <w:tcPr/>
-          <w:p>
-            <w:pPr>
-              <w:pStyle w:val="Compact"/>
-            </w:pPr>
-            <w:r>
-              <w:rPr>
-                <w:sz w:val="19"/>
-              </w:rPr>
-              <w:t xml:space="preserve">CSD⁺ and CSD⁻ measured at t−1</w:t>
+              <w:t xml:space="preserve">Timing of deviation and ability</w:t>
+            </w:r>
+          </w:p>
+        </w:tc>
+        <w:tc>
+          <w:tcPr/>
+          <w:p>
+            <w:pPr>
+              <w:pStyle w:val="Compact"/>
+            </w:pPr>
+            <w:r>
+              <w:rPr>
+                <w:sz w:val="19"/>
+              </w:rPr>
+              <w:t xml:space="preserve">CSD⁺, CSD⁻ and MA measured at t (contemporaneous) instead of t−1</w:t>
             </w:r>
           </w:p>
         </w:tc>
@@ -11495,7 +11878,7 @@
               <w:rPr>
                 <w:sz w:val="19"/>
               </w:rPr>
-              <w:t xml:space="preserve">Lags 2–3 (main), 2–4, 3–4; collapsed vs uncollapsed where the count allows</w:t>
+              <w:t xml:space="preserve">Window selected by the instrument-strength rule (main) against the other of lags 2–3 and 2–4; lags 3–4; collapsed vs uncollapsed where the count allows</w:t>
             </w:r>
           </w:p>
         </w:tc>
@@ -11672,6 +12055,50 @@
                 <w:sz w:val="19"/>
               </w:rPr>
               <w:t xml:space="preserve">Unbalanced panel that adds firms dropped by the continuity filter, to assess survivorship bias</w:t>
+            </w:r>
+          </w:p>
+        </w:tc>
+      </w:tr>
+      <w:tr>
+        <w:tc>
+          <w:tcPr/>
+          <w:p>
+            <w:pPr>
+              <w:pStyle w:val="Compact"/>
+            </w:pPr>
+            <w:r>
+              <w:rPr>
+                <w:sz w:val="19"/>
+              </w:rPr>
+              <w:t xml:space="preserve">S9</w:t>
+            </w:r>
+          </w:p>
+        </w:tc>
+        <w:tc>
+          <w:tcPr/>
+          <w:p>
+            <w:pPr>
+              <w:pStyle w:val="Compact"/>
+            </w:pPr>
+            <w:r>
+              <w:rPr>
+                <w:sz w:val="19"/>
+              </w:rPr>
+              <w:t xml:space="preserve">Elements of the original design</w:t>
+            </w:r>
+          </w:p>
+        </w:tc>
+        <w:tc>
+          <w:tcPr/>
+          <w:p>
+            <w:pPr>
+              <w:pStyle w:val="Compact"/>
+            </w:pPr>
+            <w:r>
+              <w:rPr>
+                <w:sz w:val="19"/>
+              </w:rPr>
+              <w:t xml:space="preserve">S9a: first differences instead of forward orthogonal deviations; S9b: original four controls (LTA, MTB, PROFIT, FCF); S9c: original specification as a whole (CSD and MA at t, first differences, four controls, lags 2–3)</w:t>
             </w:r>
           </w:p>
         </w:tc>
@@ -11996,7 +12423,7 @@
               <w:rPr>
                 <w:sz w:val="19"/>
               </w:rPr>
-              <w:t xml:space="preserve">Full estimates for S1–S8</w:t>
+              <w:t xml:space="preserve">Full estimates for S1–S9</w:t>
             </w:r>
           </w:p>
         </w:tc>
@@ -12087,6 +12514,36 @@
                 <w:sz w:val="19"/>
               </w:rPr>
               <w:t xml:space="preserve">Within-stage estimates of Eqs. (6), (9) and (11)</w:t>
+            </w:r>
+          </w:p>
+        </w:tc>
+      </w:tr>
+      <w:tr>
+        <w:tc>
+          <w:tcPr/>
+          <w:p>
+            <w:pPr>
+              <w:pStyle w:val="Compact"/>
+            </w:pPr>
+            <w:r>
+              <w:rPr>
+                <w:sz w:val="19"/>
+              </w:rPr>
+              <w:t xml:space="preserve">OA10</w:t>
+            </w:r>
+          </w:p>
+        </w:tc>
+        <w:tc>
+          <w:tcPr/>
+          <w:p>
+            <w:pPr>
+              <w:pStyle w:val="Compact"/>
+            </w:pPr>
+            <w:r>
+              <w:rPr>
+                <w:sz w:val="19"/>
+              </w:rPr>
+              <w:t xml:space="preserve">Instrument strength: first-stage F statistics of the GMM instruments and the lag window selected</w:t>
             </w:r>
           </w:p>
         </w:tc>
@@ -12861,7 +13318,7 @@
               <w:rPr>
                 <w:sz w:val="19"/>
               </w:rPr>
-              <w:t xml:space="preserve">max(−CSDev, 0)</w:t>
+              <w:t xml:space="preserve">max(−CSDev, 0); CSD⁺ and CSD⁻ enter Eqs. (6)–(12) at t−1</w:t>
             </w:r>
           </w:p>
         </w:tc>
@@ -13145,7 +13602,7 @@
               <w:rPr>
                 <w:sz w:val="19"/>
               </w:rPr>
-              <w:t xml:space="preserve">Residual of the Tobit model, Eq. (5), mean-centered</w:t>
+              <w:t xml:space="preserve">Residual of the Tobit model, Eq. (5), mean-centered; enters Eqs. (9)–(12) at t−1</w:t>
             </w:r>
           </w:p>
         </w:tc>
@@ -13204,6 +13661,182 @@
                 <w:sz w:val="19"/>
               </w:rPr>
               <w:t xml:space="preserve">CFO, TA</w:t>
+            </w:r>
+          </w:p>
+        </w:tc>
+      </w:tr>
+      <w:tr>
+        <w:tc>
+          <w:tcPr/>
+          <w:p>
+            <w:pPr>
+              <w:pStyle w:val="Compact"/>
+            </w:pPr>
+            <w:r>
+              <w:rPr>
+                <w:sz w:val="19"/>
+              </w:rPr>
+              <w:t xml:space="preserve">TANG</w:t>
+            </w:r>
+          </w:p>
+        </w:tc>
+        <w:tc>
+          <w:tcPr/>
+          <w:p>
+            <w:pPr>
+              <w:pStyle w:val="Compact"/>
+            </w:pPr>
+            <w:r>
+              <w:rPr>
+                <w:sz w:val="19"/>
+              </w:rPr>
+              <w:t xml:space="preserve">PPE / TA</w:t>
+            </w:r>
+          </w:p>
+        </w:tc>
+        <w:tc>
+          <w:tcPr/>
+          <w:p>
+            <w:pPr>
+              <w:pStyle w:val="Compact"/>
+            </w:pPr>
+            <w:r>
+              <w:rPr>
+                <w:sz w:val="19"/>
+              </w:rPr>
+              <w:t xml:space="preserve">PPE, TA</w:t>
+            </w:r>
+          </w:p>
+        </w:tc>
+      </w:tr>
+      <w:tr>
+        <w:tc>
+          <w:tcPr/>
+          <w:p>
+            <w:pPr>
+              <w:pStyle w:val="Compact"/>
+            </w:pPr>
+            <w:r>
+              <w:rPr>
+                <w:sz w:val="19"/>
+              </w:rPr>
+              <w:t xml:space="preserve">LOSS</w:t>
+            </w:r>
+          </w:p>
+        </w:tc>
+        <w:tc>
+          <w:tcPr/>
+          <w:p>
+            <w:pPr>
+              <w:pStyle w:val="Compact"/>
+            </w:pPr>
+            <w:r>
+              <w:rPr>
+                <w:sz w:val="19"/>
+              </w:rPr>
+              <w:t xml:space="preserve">1 if OI &lt; 0, else 0</w:t>
+            </w:r>
+          </w:p>
+        </w:tc>
+        <w:tc>
+          <w:tcPr/>
+          <w:p>
+            <w:pPr>
+              <w:pStyle w:val="Compact"/>
+            </w:pPr>
+            <w:r>
+              <w:rPr>
+                <w:sz w:val="19"/>
+              </w:rPr>
+              <w:t xml:space="preserve">OI</w:t>
+            </w:r>
+          </w:p>
+        </w:tc>
+      </w:tr>
+      <w:tr>
+        <w:tc>
+          <w:tcPr/>
+          <w:p>
+            <w:pPr>
+              <w:pStyle w:val="Compact"/>
+            </w:pPr>
+            <w:r>
+              <w:rPr>
+                <w:sz w:val="19"/>
+              </w:rPr>
+              <w:t xml:space="preserve">σ(CFO)</w:t>
+            </w:r>
+          </w:p>
+        </w:tc>
+        <w:tc>
+          <w:tcPr/>
+          <w:p>
+            <w:pPr>
+              <w:pStyle w:val="Compact"/>
+            </w:pPr>
+            <w:r>
+              <w:rPr>
+                <w:sz w:val="19"/>
+              </w:rPr>
+              <w:t xml:space="preserve">Standard deviation of CFO / TA over t−3 to t−1</w:t>
+            </w:r>
+          </w:p>
+        </w:tc>
+        <w:tc>
+          <w:tcPr/>
+          <w:p>
+            <w:pPr>
+              <w:pStyle w:val="Compact"/>
+            </w:pPr>
+            <w:r>
+              <w:rPr>
+                <w:sz w:val="19"/>
+              </w:rPr>
+              <w:t xml:space="preserve">CFO, TA</w:t>
+            </w:r>
+          </w:p>
+        </w:tc>
+      </w:tr>
+      <w:tr>
+        <w:tc>
+          <w:tcPr/>
+          <w:p>
+            <w:pPr>
+              <w:pStyle w:val="Compact"/>
+            </w:pPr>
+            <w:r>
+              <w:rPr>
+                <w:sz w:val="19"/>
+              </w:rPr>
+              <w:t xml:space="preserve">σ(Sales)</w:t>
+            </w:r>
+          </w:p>
+        </w:tc>
+        <w:tc>
+          <w:tcPr/>
+          <w:p>
+            <w:pPr>
+              <w:pStyle w:val="Compact"/>
+            </w:pPr>
+            <w:r>
+              <w:rPr>
+                <w:sz w:val="19"/>
+              </w:rPr>
+              <w:t xml:space="preserve">Standard deviation of Sales / TA over t−3 to t−1</w:t>
+            </w:r>
+          </w:p>
+        </w:tc>
+        <w:tc>
+          <w:tcPr/>
+          <w:p>
+            <w:pPr>
+              <w:pStyle w:val="Compact"/>
+            </w:pPr>
+            <w:r>
+              <w:rPr>
+                <w:sz w:val="19"/>
+              </w:rPr>
+              <w:t xml:space="preserve">Sales, TA</w:t>
             </w:r>
           </w:p>
         </w:tc>
@@ -13516,6 +14149,31 @@
         </w:numPr>
       </w:pPr>
       <w:r>
+        <w:t xml:space="preserve">Bun, M. J. G., &amp; Windmeijer, F. (2010). The weak instrument problem of the system GMM estimator in dynamic panel data models.</w:t>
+      </w:r>
+      <w:r>
+        <w:t xml:space="preserve"> </w:t>
+      </w:r>
+      <w:r>
+        <w:rPr>
+          <w:i/>
+          <w:iCs/>
+        </w:rPr>
+        <w:t xml:space="preserve">Econometrics Journal, 13</w:t>
+      </w:r>
+      <w:r>
+        <w:t xml:space="preserve">(1), 95–126.</w:t>
+      </w:r>
+    </w:p>
+    <w:p>
+      <w:pPr>
+        <w:pStyle w:val="Compact"/>
+        <w:numPr>
+          <w:ilvl w:val="0"/>
+          <w:numId w:val="1007"/>
+        </w:numPr>
+      </w:pPr>
+      <w:r>
         <w:t xml:space="preserve">Chen, F., Hope, O.-K., Li, Q., &amp; Wang, X. (2011). Financial reporting quality and investment efficiency of private firms in emerging markets.</w:t>
       </w:r>
       <w:r>
@@ -13993,7 +14651,20 @@
         </w:numPr>
       </w:pPr>
       <w:r>
-        <w:t xml:space="preserve">Synn, C., &amp; Williams, C. (2015). [Complete title, journal, volume and pages from your source.]</w:t>
+        <w:t xml:space="preserve">Staiger, D., &amp; Stock, J. H. (1997). Instrumental variables regression with weak instruments.</w:t>
+      </w:r>
+      <w:r>
+        <w:t xml:space="preserve"> </w:t>
+      </w:r>
+      <w:r>
+        <w:rPr>
+          <w:i/>
+          <w:iCs/>
+        </w:rPr>
+        <w:t xml:space="preserve">Econometrica, 65</w:t>
+      </w:r>
+      <w:r>
+        <w:t xml:space="preserve">(3), 557–586.</w:t>
       </w:r>
     </w:p>
     <w:p>
@@ -14005,6 +14676,18 @@
         </w:numPr>
       </w:pPr>
       <w:r>
+        <w:t xml:space="preserve">Synn, C., &amp; Williams, C. (2015). [Complete title, journal, volume and pages from your source.]</w:t>
+      </w:r>
+    </w:p>
+    <w:p>
+      <w:pPr>
+        <w:pStyle w:val="Compact"/>
+        <w:numPr>
+          <w:ilvl w:val="0"/>
+          <w:numId w:val="1007"/>
+        </w:numPr>
+      </w:pPr>
+      <w:r>
         <w:t xml:space="preserve">Windmeijer, F. (2005). A finite sample correction for the variance of linear efficient two-step GMM estimators.</w:t>
       </w:r>
       <w:r>
@@ -14115,6 +14798,18 @@
       </w:pPr>
       <w:r>
         <w:t xml:space="preserve">The firm-year counts in the effective-window table assume the panel stays balanced after lags; update them with the actual estimation N.</w:t>
+      </w:r>
+    </w:p>
+    <w:p>
+      <w:pPr>
+        <w:pStyle w:val="Compact"/>
+        <w:numPr>
+          <w:ilvl w:val="0"/>
+          <w:numId w:val="1008"/>
+        </w:numPr>
+      </w:pPr>
+      <w:r>
+        <w:t xml:space="preserve">The design changes of this version (CSD and MA at t−1, forward orthogonal deviations, extended controls) were fixed before the final estimation; the earlier specification is reported in S9c. State this in the cover letter if a reviewer asks how the specification was chosen.</w:t>
       </w:r>
     </w:p>
     <w:p>

</xml_diff>

<commit_message>
Unbalanced panel as main sample (balanced 1393-1403 subsample in S8); methodology 3.1 updated for 1380-1403
Co-Authored-By: Claude Opus 5.5 <noreply@anthropic.com>
Claude-Session: https://claude.ai/code/session_019etBaQcYpfE848z3Ex8rct
</commit_message>
<xml_diff>
--- a/docs/Research_Methodology.docx
+++ b/docs/Research_Methodology.docx
@@ -32,7 +32,7 @@
         <w:pStyle w:val="FirstParagraph"/>
       </w:pPr>
       <w:r>
-        <w:t xml:space="preserve">The empirical analysis uses a balanced panel of 299 non-financial firms listed on the Tehran Stock Exchange (TSE) over the Iranian fiscal years 1393–1403 (approximately March 2014 to March 2025). Iran is a useful emerging-market setting for this question for three reasons. Firms rely heavily on bank debt. Inflation is high and volatile. External equity financing is costly. Together, these conditions make deviations from target leverage both frequent and costly, which gives the tests statistical power.</w:t>
+        <w:t xml:space="preserve">The empirical analysis uses an unbalanced panel of non-financial firms listed on the Tehran Stock Exchange (TSE) over the Iranian fiscal years 1380–1403 (approximately March 2001 to March 2025). Iran is a useful emerging-market setting for this question for three reasons. Firms rely heavily on bank debt. Inflation is high and volatile. External equity financing is costly. Together, these conditions make deviations from target leverage both frequent and costly, which gives the tests statistical power. The 24-year window covers several distinct macroeconomic regimes, including the expansion of the 1380s, the sanctions of 1390–1392 and 1397 onward, and the period of the nuclear agreement.</w:t>
       </w:r>
     </w:p>
     <w:p>
@@ -52,7 +52,7 @@
         </w:numPr>
       </w:pPr>
       <w:r>
-        <w:t xml:space="preserve">Start from all firms listed on the TSE during 1392–1403.</w:t>
+        <w:t xml:space="preserve">Start from all firm-years in the database for 1380–1403, on both the TSE and Farabourse.</w:t>
       </w:r>
     </w:p>
     <w:p>
@@ -64,7 +64,7 @@
         </w:numPr>
       </w:pPr>
       <w:r>
-        <w:t xml:space="preserve">Exclude banks, credit institutions, insurance companies, investment companies, holding companies and leasing companies. Their leverage reflects regulatory capital requirements and intermediation activity rather than financing choices, and their asset structure is not comparable (Fama &amp; French, 1992).</w:t>
+        <w:t xml:space="preserve">Exclude Farabourse firms and firms whose market is not recorded, so that the sample consists of firms traded on the main exchange.</w:t>
       </w:r>
     </w:p>
     <w:p>
@@ -76,7 +76,7 @@
         </w:numPr>
       </w:pPr>
       <w:r>
-        <w:t xml:space="preserve">Retain firms whose fiscal year ends in Esfand (March) and that did not change their fiscal year during the period, so that every firm-year shares the same macroeconomic window.</w:t>
+        <w:t xml:space="preserve">Exclude banks, credit institutions, insurance, leasing, investment, holding, brokerage and fund companies. Their leverage reflects regulatory capital requirements and intermediation activity rather than financing choices, and their asset structure is not comparable (Fama &amp; French, 1992).</w:t>
       </w:r>
     </w:p>
     <w:p>
@@ -88,7 +88,7 @@
         </w:numPr>
       </w:pPr>
       <w:r>
-        <w:t xml:space="preserve">Retain firms that are continuously listed and have the accounting and market data needed to construct every variable.</w:t>
+        <w:t xml:space="preserve">Exclude printing, retail, utilities (electricity, gas, steam and hot water) and activities auxiliary to financial intermediation, whose regulated pricing or business model makes investment and leverage not comparable with manufacturing and mining firms.</w:t>
       </w:r>
     </w:p>
     <w:p>
@@ -100,408 +100,27 @@
         </w:numPr>
       </w:pPr>
       <w:r>
+        <w:t xml:space="preserve">Exclude firm-years without financial statements in the database (before listing, after delisting, or not reported).</w:t>
+      </w:r>
+    </w:p>
+    <w:p>
+      <w:pPr>
+        <w:pStyle w:val="Compact"/>
+        <w:numPr>
+          <w:ilvl w:val="0"/>
+          <w:numId w:val="1001"/>
+        </w:numPr>
+      </w:pPr>
+      <w:r>
         <w:t xml:space="preserve">Exclude firm-years with zero or negative book equity. Leverage above one and a negative market-to-book ratio make a target capital structure undefined for these firm-years, and their investment reflects financial distress rather than financing choices.</w:t>
       </w:r>
     </w:p>
-    <w:tbl>
-      <w:tblPr>
-        <w:tblStyle w:val="Table"/>
-        <w:tblW w:type="pct" w:w="5000"/>
-        <w:tblBorders>
-          <w:top w:val="single" w:sz="4" w:space="0" w:color="808080"/>
-          <w:left w:val="single" w:sz="4" w:space="0" w:color="808080"/>
-          <w:bottom w:val="single" w:sz="4" w:space="0" w:color="808080"/>
-          <w:right w:val="single" w:sz="4" w:space="0" w:color="808080"/>
-          <w:insideH w:val="single" w:sz="4" w:space="0" w:color="808080"/>
-          <w:insideV w:val="single" w:sz="4" w:space="0" w:color="808080"/>
-        </w:tblBorders>
-        <w:tblLayout w:type="fixed"/>
-        <w:tblLook w:firstRow="1" w:lastRow="0" w:firstColumn="0" w:lastColumn="0" w:noHBand="0" w:noVBand="0" w:val="0020"/>
-      </w:tblPr>
-      <w:tblGrid>
-        <w:gridCol w:w="2640"/>
-        <w:gridCol w:w="2640"/>
-        <w:gridCol w:w="2640"/>
-      </w:tblGrid>
-      <w:tr>
-        <w:trPr>
-          <w:tblHeader w:val="on"/>
-        </w:trPr>
-        <w:tc>
-          <w:tcPr>
-            <w:shd w:val="clear" w:color="auto" w:fill="E8ECF3"/>
-          </w:tcPr>
-          <w:p>
-            <w:pPr>
-              <w:pStyle w:val="Compact"/>
-            </w:pPr>
-            <w:r>
-              <w:rPr>
-                <w:b/>
-                <w:sz w:val="19"/>
-              </w:rPr>
-              <w:t xml:space="preserve">Screening step</w:t>
-            </w:r>
-          </w:p>
-        </w:tc>
-        <w:tc>
-          <w:tcPr>
-            <w:shd w:val="clear" w:color="auto" w:fill="E8ECF3"/>
-          </w:tcPr>
-          <w:p>
-            <w:pPr>
-              <w:pStyle w:val="Compact"/>
-            </w:pPr>
-            <w:r>
-              <w:rPr>
-                <w:b/>
-                <w:sz w:val="19"/>
-              </w:rPr>
-              <w:t xml:space="preserve">Firms</w:t>
-            </w:r>
-          </w:p>
-        </w:tc>
-        <w:tc>
-          <w:tcPr>
-            <w:shd w:val="clear" w:color="auto" w:fill="E8ECF3"/>
-          </w:tcPr>
-          <w:p>
-            <w:pPr>
-              <w:pStyle w:val="Compact"/>
-            </w:pPr>
-            <w:r>
-              <w:rPr>
-                <w:b/>
-                <w:sz w:val="19"/>
-              </w:rPr>
-              <w:t xml:space="preserve">Firm-years</w:t>
-            </w:r>
-          </w:p>
-        </w:tc>
-      </w:tr>
-      <w:tr>
-        <w:tc>
-          <w:tcPr/>
-          <w:p>
-            <w:pPr>
-              <w:pStyle w:val="Compact"/>
-            </w:pPr>
-            <w:r>
-              <w:rPr>
-                <w:sz w:val="19"/>
-              </w:rPr>
-              <w:t xml:space="preserve">TSE-listed firms, 1392–1403</w:t>
-            </w:r>
-          </w:p>
-        </w:tc>
-        <w:tc>
-          <w:tcPr/>
-          <w:p>
-            <w:pPr>
-              <w:pStyle w:val="Compact"/>
-            </w:pPr>
-            <w:r>
-              <w:rPr>
-                <w:sz w:val="19"/>
-              </w:rPr>
-              <w:t xml:space="preserve">[n]</w:t>
-            </w:r>
-          </w:p>
-        </w:tc>
-        <w:tc>
-          <w:tcPr/>
-          <w:p>
-            <w:pPr>
-              <w:pStyle w:val="Compact"/>
-            </w:pPr>
-            <w:r>
-              <w:rPr>
-                <w:sz w:val="19"/>
-              </w:rPr>
-              <w:t xml:space="preserve">[n]</w:t>
-            </w:r>
-          </w:p>
-        </w:tc>
-      </w:tr>
-      <w:tr>
-        <w:tc>
-          <w:tcPr/>
-          <w:p>
-            <w:pPr>
-              <w:pStyle w:val="Compact"/>
-            </w:pPr>
-            <w:r>
-              <w:rPr>
-                <w:sz w:val="19"/>
-              </w:rPr>
-              <w:t xml:space="preserve">Less: financial, investment, holding and leasing firms</w:t>
-            </w:r>
-          </w:p>
-        </w:tc>
-        <w:tc>
-          <w:tcPr/>
-          <w:p>
-            <w:pPr>
-              <w:pStyle w:val="Compact"/>
-            </w:pPr>
-            <w:r>
-              <w:rPr>
-                <w:sz w:val="19"/>
-              </w:rPr>
-              <w:t xml:space="preserve">[−n]</w:t>
-            </w:r>
-          </w:p>
-        </w:tc>
-        <w:tc>
-          <w:tcPr/>
-          <w:p>
-            <w:pPr>
-              <w:pStyle w:val="Compact"/>
-            </w:pPr>
-            <w:r>
-              <w:rPr>
-                <w:sz w:val="19"/>
-              </w:rPr>
-              <w:t xml:space="preserve">[−n]</w:t>
-            </w:r>
-          </w:p>
-        </w:tc>
-      </w:tr>
-      <w:tr>
-        <w:tc>
-          <w:tcPr/>
-          <w:p>
-            <w:pPr>
-              <w:pStyle w:val="Compact"/>
-            </w:pPr>
-            <w:r>
-              <w:rPr>
-                <w:sz w:val="19"/>
-              </w:rPr>
-              <w:t xml:space="preserve">Less: fiscal year not ending in Esfand, or changed during the period</w:t>
-            </w:r>
-          </w:p>
-        </w:tc>
-        <w:tc>
-          <w:tcPr/>
-          <w:p>
-            <w:pPr>
-              <w:pStyle w:val="Compact"/>
-            </w:pPr>
-            <w:r>
-              <w:rPr>
-                <w:sz w:val="19"/>
-              </w:rPr>
-              <w:t xml:space="preserve">[−n]</w:t>
-            </w:r>
-          </w:p>
-        </w:tc>
-        <w:tc>
-          <w:tcPr/>
-          <w:p>
-            <w:pPr>
-              <w:pStyle w:val="Compact"/>
-            </w:pPr>
-            <w:r>
-              <w:rPr>
-                <w:sz w:val="19"/>
-              </w:rPr>
-              <w:t xml:space="preserve">[−n]</w:t>
-            </w:r>
-          </w:p>
-        </w:tc>
-      </w:tr>
-      <w:tr>
-        <w:tc>
-          <w:tcPr/>
-          <w:p>
-            <w:pPr>
-              <w:pStyle w:val="Compact"/>
-            </w:pPr>
-            <w:r>
-              <w:rPr>
-                <w:sz w:val="19"/>
-              </w:rPr>
-              <w:t xml:space="preserve">Less: not continuously listed or missing data</w:t>
-            </w:r>
-          </w:p>
-        </w:tc>
-        <w:tc>
-          <w:tcPr/>
-          <w:p>
-            <w:pPr>
-              <w:pStyle w:val="Compact"/>
-            </w:pPr>
-            <w:r>
-              <w:rPr>
-                <w:sz w:val="19"/>
-              </w:rPr>
-              <w:t xml:space="preserve">[−n]</w:t>
-            </w:r>
-          </w:p>
-        </w:tc>
-        <w:tc>
-          <w:tcPr/>
-          <w:p>
-            <w:pPr>
-              <w:pStyle w:val="Compact"/>
-            </w:pPr>
-            <w:r>
-              <w:rPr>
-                <w:sz w:val="19"/>
-              </w:rPr>
-              <w:t xml:space="preserve">[−n]</w:t>
-            </w:r>
-          </w:p>
-        </w:tc>
-      </w:tr>
-      <w:tr>
-        <w:tc>
-          <w:tcPr/>
-          <w:p>
-            <w:pPr>
-              <w:pStyle w:val="Compact"/>
-            </w:pPr>
-            <w:r>
-              <w:rPr>
-                <w:sz w:val="19"/>
-              </w:rPr>
-              <w:t xml:space="preserve">Less: firm-years with book equity ≤ 0</w:t>
-            </w:r>
-          </w:p>
-        </w:tc>
-        <w:tc>
-          <w:tcPr/>
-          <w:p>
-            <w:pPr>
-              <w:pStyle w:val="Compact"/>
-            </w:pPr>
-            <w:r>
-              <w:rPr>
-                <w:sz w:val="19"/>
-              </w:rPr>
-              <w:t xml:space="preserve">—</w:t>
-            </w:r>
-          </w:p>
-        </w:tc>
-        <w:tc>
-          <w:tcPr/>
-          <w:p>
-            <w:pPr>
-              <w:pStyle w:val="Compact"/>
-            </w:pPr>
-            <w:r>
-              <w:rPr>
-                <w:sz w:val="19"/>
-              </w:rPr>
-              <w:t xml:space="preserve">[−n]</w:t>
-            </w:r>
-          </w:p>
-        </w:tc>
-      </w:tr>
-      <w:tr>
-        <w:tc>
-          <w:tcPr/>
-          <w:p>
-            <w:pPr>
-              <w:pStyle w:val="Compact"/>
-            </w:pPr>
-            <w:r>
-              <w:rPr>
-                <w:sz w:val="19"/>
-              </w:rPr>
-              <w:t xml:space="preserve">Final sample, including base year 1392</w:t>
-            </w:r>
-          </w:p>
-        </w:tc>
-        <w:tc>
-          <w:tcPr/>
-          <w:p>
-            <w:pPr>
-              <w:pStyle w:val="Compact"/>
-            </w:pPr>
-            <w:r>
-              <w:rPr>
-                <w:sz w:val="19"/>
-              </w:rPr>
-              <w:t xml:space="preserve">299</w:t>
-            </w:r>
-          </w:p>
-        </w:tc>
-        <w:tc>
-          <w:tcPr/>
-          <w:p>
-            <w:pPr>
-              <w:pStyle w:val="Compact"/>
-            </w:pPr>
-            <w:r>
-              <w:rPr>
-                <w:sz w:val="19"/>
-              </w:rPr>
-              <w:t xml:space="preserve">3,588</w:t>
-            </w:r>
-          </w:p>
-        </w:tc>
-      </w:tr>
-      <w:tr>
-        <w:tc>
-          <w:tcPr/>
-          <w:p>
-            <w:pPr>
-              <w:pStyle w:val="Compact"/>
-            </w:pPr>
-            <w:r>
-              <w:rPr>
-                <w:sz w:val="19"/>
-              </w:rPr>
-              <w:t xml:space="preserve">Firm-years in the study period 1393–1403</w:t>
-            </w:r>
-          </w:p>
-        </w:tc>
-        <w:tc>
-          <w:tcPr/>
-          <w:p>
-            <w:pPr>
-              <w:pStyle w:val="Compact"/>
-            </w:pPr>
-            <w:r>
-              <w:rPr>
-                <w:sz w:val="19"/>
-              </w:rPr>
-              <w:t xml:space="preserve">299</w:t>
-            </w:r>
-          </w:p>
-        </w:tc>
-        <w:tc>
-          <w:tcPr/>
-          <w:p>
-            <w:pPr>
-              <w:pStyle w:val="Compact"/>
-            </w:pPr>
-            <w:r>
-              <w:rPr>
-                <w:sz w:val="19"/>
-              </w:rPr>
-              <w:t xml:space="preserve">3,289</w:t>
-            </w:r>
-          </w:p>
-        </w:tc>
-      </w:tr>
-    </w:tbl>
-    <w:p>
-      <w:pPr>
-        <w:pStyle w:val="BodyText"/>
-      </w:pPr>
-      <w:r>
-        <w:t xml:space="preserve">Accounting data are collected from the Rahavard Novin database and cross-checked against the original filings in the Codal disclosure system. Market values of equity are obtained from the TSE, and the annual consumer-price inflation rate from the Central Bank of the Islamic Republic of Iran.</w:t>
-      </w:r>
-    </w:p>
-    <w:p>
-      <w:pPr>
-        <w:pStyle w:val="BodyText"/>
-      </w:pPr>
-      <w:r>
-        <w:t xml:space="preserve">Fiscal year 1392 serves only as a base year for variables that require prior-year values. Because the investment-expectation model uses lagged sales growth and the dynamic models use the lagged dependent variable, the effective estimation windows are as follows:</w:t>
+    <w:p>
+      <w:pPr>
+        <w:pStyle w:val="FirstParagraph"/>
+      </w:pPr>
+      <w:r>
+        <w:t xml:space="preserve">All firms have a fiscal year ending in Esfand (March), so every firm-year shares the same macroeconomic window.</w:t>
       </w:r>
     </w:p>
     <w:tbl>
@@ -542,7 +161,7 @@
                 <w:b/>
                 <w:sz w:val="19"/>
               </w:rPr>
-              <w:t xml:space="preserve">Estimation step</w:t>
+              <w:t xml:space="preserve">Step</w:t>
             </w:r>
           </w:p>
         </w:tc>
@@ -559,7 +178,7 @@
                 <w:b/>
                 <w:sz w:val="19"/>
               </w:rPr>
-              <w:t xml:space="preserve">Requires</w:t>
+              <w:t xml:space="preserve">Screening criterion</w:t>
             </w:r>
           </w:p>
         </w:tc>
@@ -576,7 +195,7 @@
                 <w:b/>
                 <w:sz w:val="19"/>
               </w:rPr>
-              <w:t xml:space="preserve">Effective window</w:t>
+              <w:t xml:space="preserve">Firms</w:t>
             </w:r>
           </w:p>
         </w:tc>
@@ -609,49 +228,49 @@
               <w:rPr>
                 <w:sz w:val="19"/>
               </w:rPr>
-              <w:t xml:space="preserve">Target leverage model, Eq. (2)</w:t>
-            </w:r>
-          </w:p>
-        </w:tc>
-        <w:tc>
-          <w:tcPr/>
-          <w:p>
-            <w:pPr>
-              <w:pStyle w:val="Compact"/>
-            </w:pPr>
-            <w:r>
-              <w:rPr>
-                <w:sz w:val="19"/>
-              </w:rPr>
-              <w:t xml:space="preserve">Determinants at t−1</w:t>
-            </w:r>
-          </w:p>
-        </w:tc>
-        <w:tc>
-          <w:tcPr/>
-          <w:p>
-            <w:pPr>
-              <w:pStyle w:val="Compact"/>
-            </w:pPr>
-            <w:r>
-              <w:rPr>
-                <w:sz w:val="19"/>
-              </w:rPr>
-              <w:t xml:space="preserve">1393–1403</w:t>
-            </w:r>
-          </w:p>
-        </w:tc>
-        <w:tc>
-          <w:tcPr/>
-          <w:p>
-            <w:pPr>
-              <w:pStyle w:val="Compact"/>
-            </w:pPr>
-            <w:r>
-              <w:rPr>
-                <w:sz w:val="19"/>
-              </w:rPr>
-              <w:t xml:space="preserve">3,289</w:t>
+              <w:t xml:space="preserve">1</w:t>
+            </w:r>
+          </w:p>
+        </w:tc>
+        <w:tc>
+          <w:tcPr/>
+          <w:p>
+            <w:pPr>
+              <w:pStyle w:val="Compact"/>
+            </w:pPr>
+            <w:r>
+              <w:rPr>
+                <w:sz w:val="19"/>
+              </w:rPr>
+              <w:t xml:space="preserve">All firm-years in the database (TSE and Farabourse), 1380–1403</w:t>
+            </w:r>
+          </w:p>
+        </w:tc>
+        <w:tc>
+          <w:tcPr/>
+          <w:p>
+            <w:pPr>
+              <w:pStyle w:val="Compact"/>
+            </w:pPr>
+            <w:r>
+              <w:rPr>
+                <w:sz w:val="19"/>
+              </w:rPr>
+              <w:t xml:space="preserve">[n]</w:t>
+            </w:r>
+          </w:p>
+        </w:tc>
+        <w:tc>
+          <w:tcPr/>
+          <w:p>
+            <w:pPr>
+              <w:pStyle w:val="Compact"/>
+            </w:pPr>
+            <w:r>
+              <w:rPr>
+                <w:sz w:val="19"/>
+              </w:rPr>
+              <w:t xml:space="preserve">[n]</w:t>
             </w:r>
           </w:p>
         </w:tc>
@@ -667,49 +286,49 @@
               <w:rPr>
                 <w:sz w:val="19"/>
               </w:rPr>
-              <w:t xml:space="preserve">Investment-expectation model, Eq. (1)</w:t>
-            </w:r>
-          </w:p>
-        </w:tc>
-        <w:tc>
-          <w:tcPr/>
-          <w:p>
-            <w:pPr>
-              <w:pStyle w:val="Compact"/>
-            </w:pPr>
-            <w:r>
-              <w:rPr>
-                <w:sz w:val="19"/>
-              </w:rPr>
-              <w:t xml:space="preserve">Sales at t−2</w:t>
-            </w:r>
-          </w:p>
-        </w:tc>
-        <w:tc>
-          <w:tcPr/>
-          <w:p>
-            <w:pPr>
-              <w:pStyle w:val="Compact"/>
-            </w:pPr>
-            <w:r>
-              <w:rPr>
-                <w:sz w:val="19"/>
-              </w:rPr>
-              <w:t xml:space="preserve">1394–1403</w:t>
-            </w:r>
-          </w:p>
-        </w:tc>
-        <w:tc>
-          <w:tcPr/>
-          <w:p>
-            <w:pPr>
-              <w:pStyle w:val="Compact"/>
-            </w:pPr>
-            <w:r>
-              <w:rPr>
-                <w:sz w:val="19"/>
-              </w:rPr>
-              <w:t xml:space="preserve">2,990</w:t>
+              <w:t xml:space="preserve">2</w:t>
+            </w:r>
+          </w:p>
+        </w:tc>
+        <w:tc>
+          <w:tcPr/>
+          <w:p>
+            <w:pPr>
+              <w:pStyle w:val="Compact"/>
+            </w:pPr>
+            <w:r>
+              <w:rPr>
+                <w:sz w:val="19"/>
+              </w:rPr>
+              <w:t xml:space="preserve">Less: Farabourse firms and firms with no market in the database</w:t>
+            </w:r>
+          </w:p>
+        </w:tc>
+        <w:tc>
+          <w:tcPr/>
+          <w:p>
+            <w:pPr>
+              <w:pStyle w:val="Compact"/>
+            </w:pPr>
+            <w:r>
+              <w:rPr>
+                <w:sz w:val="19"/>
+              </w:rPr>
+              <w:t xml:space="preserve">[−n]</w:t>
+            </w:r>
+          </w:p>
+        </w:tc>
+        <w:tc>
+          <w:tcPr/>
+          <w:p>
+            <w:pPr>
+              <w:pStyle w:val="Compact"/>
+            </w:pPr>
+            <w:r>
+              <w:rPr>
+                <w:sz w:val="19"/>
+              </w:rPr>
+              <w:t xml:space="preserve">[−n]</w:t>
             </w:r>
           </w:p>
         </w:tc>
@@ -725,49 +344,333 @@
               <w:rPr>
                 <w:sz w:val="19"/>
               </w:rPr>
-              <w:t xml:space="preserve">Dynamic models, Eqs. (6)–(12)</w:t>
-            </w:r>
-          </w:p>
-        </w:tc>
-        <w:tc>
-          <w:tcPr/>
-          <w:p>
-            <w:pPr>
-              <w:pStyle w:val="Compact"/>
-            </w:pPr>
-            <w:r>
-              <w:rPr>
-                <w:sz w:val="19"/>
-              </w:rPr>
-              <w:t xml:space="preserve">InvEff at t−1</w:t>
-            </w:r>
-          </w:p>
-        </w:tc>
-        <w:tc>
-          <w:tcPr/>
-          <w:p>
-            <w:pPr>
-              <w:pStyle w:val="Compact"/>
-            </w:pPr>
-            <w:r>
-              <w:rPr>
-                <w:sz w:val="19"/>
-              </w:rPr>
-              <w:t xml:space="preserve">1395–1403</w:t>
-            </w:r>
-          </w:p>
-        </w:tc>
-        <w:tc>
-          <w:tcPr/>
-          <w:p>
-            <w:pPr>
-              <w:pStyle w:val="Compact"/>
-            </w:pPr>
-            <w:r>
-              <w:rPr>
-                <w:sz w:val="19"/>
-              </w:rPr>
-              <w:t xml:space="preserve">2,691</w:t>
+              <w:t xml:space="preserve">3</w:t>
+            </w:r>
+          </w:p>
+        </w:tc>
+        <w:tc>
+          <w:tcPr/>
+          <w:p>
+            <w:pPr>
+              <w:pStyle w:val="Compact"/>
+            </w:pPr>
+            <w:r>
+              <w:rPr>
+                <w:sz w:val="19"/>
+              </w:rPr>
+              <w:t xml:space="preserve">Less: banks, insurance, leasing, investment, holding, brokerage and fund companies</w:t>
+            </w:r>
+          </w:p>
+        </w:tc>
+        <w:tc>
+          <w:tcPr/>
+          <w:p>
+            <w:pPr>
+              <w:pStyle w:val="Compact"/>
+            </w:pPr>
+            <w:r>
+              <w:rPr>
+                <w:sz w:val="19"/>
+              </w:rPr>
+              <w:t xml:space="preserve">[−n]</w:t>
+            </w:r>
+          </w:p>
+        </w:tc>
+        <w:tc>
+          <w:tcPr/>
+          <w:p>
+            <w:pPr>
+              <w:pStyle w:val="Compact"/>
+            </w:pPr>
+            <w:r>
+              <w:rPr>
+                <w:sz w:val="19"/>
+              </w:rPr>
+              <w:t xml:space="preserve">[−n]</w:t>
+            </w:r>
+          </w:p>
+        </w:tc>
+      </w:tr>
+      <w:tr>
+        <w:tc>
+          <w:tcPr/>
+          <w:p>
+            <w:pPr>
+              <w:pStyle w:val="Compact"/>
+            </w:pPr>
+            <w:r>
+              <w:rPr>
+                <w:sz w:val="19"/>
+              </w:rPr>
+              <w:t xml:space="preserve">4</w:t>
+            </w:r>
+          </w:p>
+        </w:tc>
+        <w:tc>
+          <w:tcPr/>
+          <w:p>
+            <w:pPr>
+              <w:pStyle w:val="Compact"/>
+            </w:pPr>
+            <w:r>
+              <w:rPr>
+                <w:sz w:val="19"/>
+              </w:rPr>
+              <w:t xml:space="preserve">Less: printing, retail, utilities and auxiliary financial activities</w:t>
+            </w:r>
+          </w:p>
+        </w:tc>
+        <w:tc>
+          <w:tcPr/>
+          <w:p>
+            <w:pPr>
+              <w:pStyle w:val="Compact"/>
+            </w:pPr>
+            <w:r>
+              <w:rPr>
+                <w:sz w:val="19"/>
+              </w:rPr>
+              <w:t xml:space="preserve">[−n]</w:t>
+            </w:r>
+          </w:p>
+        </w:tc>
+        <w:tc>
+          <w:tcPr/>
+          <w:p>
+            <w:pPr>
+              <w:pStyle w:val="Compact"/>
+            </w:pPr>
+            <w:r>
+              <w:rPr>
+                <w:sz w:val="19"/>
+              </w:rPr>
+              <w:t xml:space="preserve">[−n]</w:t>
+            </w:r>
+          </w:p>
+        </w:tc>
+      </w:tr>
+      <w:tr>
+        <w:tc>
+          <w:tcPr/>
+          <w:p>
+            <w:pPr>
+              <w:pStyle w:val="Compact"/>
+            </w:pPr>
+          </w:p>
+        </w:tc>
+        <w:tc>
+          <w:tcPr/>
+          <w:p>
+            <w:pPr>
+              <w:pStyle w:val="Compact"/>
+            </w:pPr>
+            <w:r>
+              <w:rPr>
+                <w:sz w:val="19"/>
+              </w:rPr>
+              <w:t xml:space="preserve">TSE non-financial firms: full panel (firms × 24 years)</w:t>
+            </w:r>
+          </w:p>
+        </w:tc>
+        <w:tc>
+          <w:tcPr/>
+          <w:p>
+            <w:pPr>
+              <w:pStyle w:val="Compact"/>
+            </w:pPr>
+            <w:r>
+              <w:rPr>
+                <w:sz w:val="19"/>
+              </w:rPr>
+              <w:t xml:space="preserve">[n]</w:t>
+            </w:r>
+          </w:p>
+        </w:tc>
+        <w:tc>
+          <w:tcPr/>
+          <w:p>
+            <w:pPr>
+              <w:pStyle w:val="Compact"/>
+            </w:pPr>
+            <w:r>
+              <w:rPr>
+                <w:sz w:val="19"/>
+              </w:rPr>
+              <w:t xml:space="preserve">[n]</w:t>
+            </w:r>
+          </w:p>
+        </w:tc>
+      </w:tr>
+      <w:tr>
+        <w:tc>
+          <w:tcPr/>
+          <w:p>
+            <w:pPr>
+              <w:pStyle w:val="Compact"/>
+            </w:pPr>
+            <w:r>
+              <w:rPr>
+                <w:sz w:val="19"/>
+              </w:rPr>
+              <w:t xml:space="preserve">5</w:t>
+            </w:r>
+          </w:p>
+        </w:tc>
+        <w:tc>
+          <w:tcPr/>
+          <w:p>
+            <w:pPr>
+              <w:pStyle w:val="Compact"/>
+            </w:pPr>
+            <w:r>
+              <w:rPr>
+                <w:sz w:val="19"/>
+              </w:rPr>
+              <w:t xml:space="preserve">Less: firm-years without financial statements</w:t>
+            </w:r>
+          </w:p>
+        </w:tc>
+        <w:tc>
+          <w:tcPr/>
+          <w:p>
+            <w:pPr>
+              <w:pStyle w:val="Compact"/>
+            </w:pPr>
+            <w:r>
+              <w:rPr>
+                <w:sz w:val="19"/>
+              </w:rPr>
+              <w:t xml:space="preserve">—</w:t>
+            </w:r>
+          </w:p>
+        </w:tc>
+        <w:tc>
+          <w:tcPr/>
+          <w:p>
+            <w:pPr>
+              <w:pStyle w:val="Compact"/>
+            </w:pPr>
+            <w:r>
+              <w:rPr>
+                <w:sz w:val="19"/>
+              </w:rPr>
+              <w:t xml:space="preserve">[−n]</w:t>
+            </w:r>
+          </w:p>
+        </w:tc>
+      </w:tr>
+      <w:tr>
+        <w:tc>
+          <w:tcPr/>
+          <w:p>
+            <w:pPr>
+              <w:pStyle w:val="Compact"/>
+            </w:pPr>
+            <w:r>
+              <w:rPr>
+                <w:sz w:val="19"/>
+              </w:rPr>
+              <w:t xml:space="preserve">6</w:t>
+            </w:r>
+          </w:p>
+        </w:tc>
+        <w:tc>
+          <w:tcPr/>
+          <w:p>
+            <w:pPr>
+              <w:pStyle w:val="Compact"/>
+            </w:pPr>
+            <w:r>
+              <w:rPr>
+                <w:sz w:val="19"/>
+              </w:rPr>
+              <w:t xml:space="preserve">Less: firm-years with zero or negative book equity</w:t>
+            </w:r>
+          </w:p>
+        </w:tc>
+        <w:tc>
+          <w:tcPr/>
+          <w:p>
+            <w:pPr>
+              <w:pStyle w:val="Compact"/>
+            </w:pPr>
+            <w:r>
+              <w:rPr>
+                <w:sz w:val="19"/>
+              </w:rPr>
+              <w:t xml:space="preserve">—</w:t>
+            </w:r>
+          </w:p>
+        </w:tc>
+        <w:tc>
+          <w:tcPr/>
+          <w:p>
+            <w:pPr>
+              <w:pStyle w:val="Compact"/>
+            </w:pPr>
+            <w:r>
+              <w:rPr>
+                <w:sz w:val="19"/>
+              </w:rPr>
+              <w:t xml:space="preserve">[−n]</w:t>
+            </w:r>
+          </w:p>
+        </w:tc>
+      </w:tr>
+      <w:tr>
+        <w:tc>
+          <w:tcPr/>
+          <w:p>
+            <w:pPr>
+              <w:pStyle w:val="Compact"/>
+            </w:pPr>
+            <w:r>
+              <w:rPr>
+                <w:sz w:val="19"/>
+              </w:rPr>
+              <w:t xml:space="preserve">=</w:t>
+            </w:r>
+          </w:p>
+        </w:tc>
+        <w:tc>
+          <w:tcPr/>
+          <w:p>
+            <w:pPr>
+              <w:pStyle w:val="Compact"/>
+            </w:pPr>
+            <w:r>
+              <w:rPr>
+                <w:sz w:val="19"/>
+              </w:rPr>
+              <w:t xml:space="preserve">Final sample (unbalanced panel, including base year 1380)</w:t>
+            </w:r>
+          </w:p>
+        </w:tc>
+        <w:tc>
+          <w:tcPr/>
+          <w:p>
+            <w:pPr>
+              <w:pStyle w:val="Compact"/>
+            </w:pPr>
+            <w:r>
+              <w:rPr>
+                <w:sz w:val="19"/>
+              </w:rPr>
+              <w:t xml:space="preserve">[n]</w:t>
+            </w:r>
+          </w:p>
+        </w:tc>
+        <w:tc>
+          <w:tcPr/>
+          <w:p>
+            <w:pPr>
+              <w:pStyle w:val="Compact"/>
+            </w:pPr>
+            <w:r>
+              <w:rPr>
+                <w:sz w:val="19"/>
+              </w:rPr>
+              <w:t xml:space="preserve">[n]</w:t>
             </w:r>
           </w:p>
         </w:tc>
@@ -778,7 +681,37 @@
         <w:pStyle w:val="BodyText"/>
       </w:pPr>
       <w:r>
-        <w:t xml:space="preserve">All continuous ratios are winsorized at the 1st and 99th percentiles of their pooled distributions after construction. Raw accounting levels are not winsorized, because doing so would distort the ratios built from them. The generated measures InvEff, CSDev and MA are winsorized at the same percentiles. Expense items (cost of goods sold, SG&amp;A and financial expense) are used in absolute value, because some databases record them with a negative sign. The balanced-panel requirement may introduce survivorship bias toward stronger firms; Section 3.11 discusses this. All estimations are performed in Stata 17.</w:t>
+        <w:t xml:space="preserve">No minimum number of years is imposed. A firm-year enters an estimation when the lagged data that the estimation requires exist; firms with a short history therefore contribute only the years for which their lags are observed. An unbalanced panel is used because requiring every firm to report in all 24 years would keep only the firms that survived the whole period. Over-leveraged firms that fell into distress or left the exchange, exactly the firms at the centre of H1a, would be removed, and so would every firm listed after 1380, including the large wave of listings after the privatisations of the late 1380s. Such a sample would be biased toward survivors (survivorship bias) and would be too small for System GMM. The forward orthogonal deviation used in the GMM estimator (Section 3.8.2) is designed for panels with gaps. As a sensitivity test (S8), the models are re-estimated on the balanced subsample of firms with usable data in every year 1393–1403.</w:t>
+      </w:r>
+    </w:p>
+    <w:p>
+      <w:pPr>
+        <w:pStyle w:val="BodyText"/>
+      </w:pPr>
+      <w:r>
+        <w:t xml:space="preserve">Industries with fewer than two firms in the final sample are pooled into one category (</w:t>
+      </w:r>
+      <w:r>
+        <w:t xml:space="preserve">“other industries”</w:t>
+      </w:r>
+      <w:r>
+        <w:t xml:space="preserve">). Accounting data are collected from the Rahavard Novin database and cross-checked against the original filings in the Codal disclosure system. Market values of equity are computed as the year-end closing price times the number of shares, and the annual consumer-price inflation rate is obtained from the Central Bank of the Islamic Republic of Iran.</w:t>
+      </w:r>
+    </w:p>
+    <w:p>
+      <w:pPr>
+        <w:pStyle w:val="BodyText"/>
+      </w:pPr>
+      <w:r>
+        <w:t xml:space="preserve">Fiscal year 1380 serves only as a base year for variables that require prior-year values. Because the investment-expectation model uses lagged sales growth and the dynamic models use the lagged dependent variable, the first year of each estimation is: target leverage model, Eq. (2), 1381; investment-expectation model, Eq. (1), 1382; dynamic models, Eqs. (6)–(12), 1383. The firm-year counts of each estimation are reported with the results.</w:t>
+      </w:r>
+    </w:p>
+    <w:p>
+      <w:pPr>
+        <w:pStyle w:val="BodyText"/>
+      </w:pPr>
+      <w:r>
+        <w:t xml:space="preserve">All continuous ratios are winsorized at the 1st and 99th percentiles of their pooled distributions after construction. Raw accounting levels are not winsorized, because doing so would distort the ratios built from them. The generated measures InvEff, CSDev and MA are winsorized at the same percentiles. Expense items (cost of goods sold, SG&amp;A and financial expense) are used in absolute value, because some databases record them with a negative sign. All estimations are performed in Stata 17.</w:t>
       </w:r>
     </w:p>
     <w:bookmarkEnd w:id="9"/>
@@ -12054,7 +11987,7 @@
               <w:rPr>
                 <w:sz w:val="19"/>
               </w:rPr>
-              <w:t xml:space="preserve">Unbalanced panel that adds firms dropped by the continuity filter, to assess survivorship bias</w:t>
+              <w:t xml:space="preserve">Balanced subsample: firms with usable data in every year 1393–1403, to assess survivorship effects</w:t>
             </w:r>
           </w:p>
         </w:tc>
@@ -14773,7 +14706,7 @@
         </w:numPr>
       </w:pPr>
       <w:r>
-        <w:t xml:space="preserve">Fill in the [n] counts in the sample-construction table in 3.1 from your screening records, including the firm-years removed for non-positive book equity (reported in the Stata log). Update 299 firms / 3,588 records if the equity filter changes them.</w:t>
+        <w:t xml:space="preserve">Fill in the [n] counts in the sample-construction table in 3.1 from the Screening sheet of Research_Data_1380_1403.xlsx.</w:t>
       </w:r>
     </w:p>
     <w:p>
@@ -14797,31 +14730,7 @@
         </w:numPr>
       </w:pPr>
       <w:r>
-        <w:t xml:space="preserve">The firm-year counts in the effective-window table assume the panel stays balanced after lags; update them with the actual estimation N.</w:t>
-      </w:r>
-    </w:p>
-    <w:p>
-      <w:pPr>
-        <w:pStyle w:val="Compact"/>
-        <w:numPr>
-          <w:ilvl w:val="0"/>
-          <w:numId w:val="1008"/>
-        </w:numPr>
-      </w:pPr>
-      <w:r>
         <w:t xml:space="preserve">The design changes of this version (CSD and MA at t−1, forward orthogonal deviations, extended controls) were fixed before the final estimation; the earlier specification is reported in S9c. State this in the cover letter if a reviewer asks how the specification was chosen.</w:t>
-      </w:r>
-    </w:p>
-    <w:p>
-      <w:pPr>
-        <w:pStyle w:val="Compact"/>
-        <w:numPr>
-          <w:ilvl w:val="0"/>
-          <w:numId w:val="1008"/>
-        </w:numPr>
-      </w:pPr>
-      <w:r>
-        <w:t xml:space="preserve">Sales and total assets for 1391, if available, would extend InvEff to 1393 and the GMM sample to 1394.</w:t>
       </w:r>
     </w:p>
     <w:p>

</xml_diff>

<commit_message>
Methodology 3.1 rewritten with the 1380-1403 screening counts, panel structure, industry definition, data assembly and structural-change checks; consistency fixes (base year 1380, N = 319, S10, placebo reps)
Co-Authored-By: Claude Opus 5.5 <noreply@anthropic.com>
Claude-Session: https://claude.ai/code/session_019etBaQcYpfE848z3Ex8rct
</commit_message>
<xml_diff>
--- a/docs/Research_Methodology.docx
+++ b/docs/Research_Methodology.docx
@@ -120,7 +120,19 @@
         <w:pStyle w:val="FirstParagraph"/>
       </w:pPr>
       <w:r>
-        <w:t xml:space="preserve">All firms have a fiscal year ending in Esfand (March), so every firm-year shares the same macroeconomic window.</w:t>
+        <w:t xml:space="preserve">All firms have a fiscal year ending in Esfand (March), so every firm-year shares the same macroeconomic window. Table 1 reports the construction of the sample.</w:t>
+      </w:r>
+    </w:p>
+    <w:p>
+      <w:pPr>
+        <w:pStyle w:val="BodyText"/>
+      </w:pPr>
+      <w:r>
+        <w:rPr>
+          <w:b/>
+          <w:bCs/>
+        </w:rPr>
+        <w:t xml:space="preserve">Table 1. Sample construction</w:t>
       </w:r>
     </w:p>
     <w:tbl>
@@ -178,7 +190,7 @@
                 <w:b/>
                 <w:sz w:val="19"/>
               </w:rPr>
-              <w:t xml:space="preserve">Screening criterion</w:t>
+              <w:t xml:space="preserve">Panel A. Screening criterion</w:t>
             </w:r>
           </w:p>
         </w:tc>
@@ -256,21 +268,21 @@
               <w:rPr>
                 <w:sz w:val="19"/>
               </w:rPr>
-              <w:t xml:space="preserve">[n]</w:t>
-            </w:r>
-          </w:p>
-        </w:tc>
-        <w:tc>
-          <w:tcPr/>
-          <w:p>
-            <w:pPr>
-              <w:pStyle w:val="Compact"/>
-            </w:pPr>
-            <w:r>
-              <w:rPr>
-                <w:sz w:val="19"/>
-              </w:rPr>
-              <w:t xml:space="preserve">[n]</w:t>
+              <w:t xml:space="preserve">1,286</w:t>
+            </w:r>
+          </w:p>
+        </w:tc>
+        <w:tc>
+          <w:tcPr/>
+          <w:p>
+            <w:pPr>
+              <w:pStyle w:val="Compact"/>
+            </w:pPr>
+            <w:r>
+              <w:rPr>
+                <w:sz w:val="19"/>
+              </w:rPr>
+              <w:t xml:space="preserve">9,434</w:t>
             </w:r>
           </w:p>
         </w:tc>
@@ -314,21 +326,21 @@
               <w:rPr>
                 <w:sz w:val="19"/>
               </w:rPr>
-              <w:t xml:space="preserve">[−n]</w:t>
-            </w:r>
-          </w:p>
-        </w:tc>
-        <w:tc>
-          <w:tcPr/>
-          <w:p>
-            <w:pPr>
-              <w:pStyle w:val="Compact"/>
-            </w:pPr>
-            <w:r>
-              <w:rPr>
-                <w:sz w:val="19"/>
-              </w:rPr>
-              <w:t xml:space="preserve">[−n]</w:t>
+              <w:t xml:space="preserve">−916</w:t>
+            </w:r>
+          </w:p>
+        </w:tc>
+        <w:tc>
+          <w:tcPr/>
+          <w:p>
+            <w:pPr>
+              <w:pStyle w:val="Compact"/>
+            </w:pPr>
+            <w:r>
+              <w:rPr>
+                <w:sz w:val="19"/>
+              </w:rPr>
+              <w:t xml:space="preserve">−3,819</w:t>
             </w:r>
           </w:p>
         </w:tc>
@@ -372,21 +384,21 @@
               <w:rPr>
                 <w:sz w:val="19"/>
               </w:rPr>
-              <w:t xml:space="preserve">[−n]</w:t>
-            </w:r>
-          </w:p>
-        </w:tc>
-        <w:tc>
-          <w:tcPr/>
-          <w:p>
-            <w:pPr>
-              <w:pStyle w:val="Compact"/>
-            </w:pPr>
-            <w:r>
-              <w:rPr>
-                <w:sz w:val="19"/>
-              </w:rPr>
-              <w:t xml:space="preserve">[−n]</w:t>
+              <w:t xml:space="preserve">−28</w:t>
+            </w:r>
+          </w:p>
+        </w:tc>
+        <w:tc>
+          <w:tcPr/>
+          <w:p>
+            <w:pPr>
+              <w:pStyle w:val="Compact"/>
+            </w:pPr>
+            <w:r>
+              <w:rPr>
+                <w:sz w:val="19"/>
+              </w:rPr>
+              <w:t xml:space="preserve">−58</w:t>
             </w:r>
           </w:p>
         </w:tc>
@@ -430,21 +442,21 @@
               <w:rPr>
                 <w:sz w:val="19"/>
               </w:rPr>
-              <w:t xml:space="preserve">[−n]</w:t>
-            </w:r>
-          </w:p>
-        </w:tc>
-        <w:tc>
-          <w:tcPr/>
-          <w:p>
-            <w:pPr>
-              <w:pStyle w:val="Compact"/>
-            </w:pPr>
-            <w:r>
-              <w:rPr>
-                <w:sz w:val="19"/>
-              </w:rPr>
-              <w:t xml:space="preserve">[−n]</w:t>
+              <w:t xml:space="preserve">−10</w:t>
+            </w:r>
+          </w:p>
+        </w:tc>
+        <w:tc>
+          <w:tcPr/>
+          <w:p>
+            <w:pPr>
+              <w:pStyle w:val="Compact"/>
+            </w:pPr>
+            <w:r>
+              <w:rPr>
+                <w:sz w:val="19"/>
+              </w:rPr>
+              <w:t xml:space="preserve">−30</w:t>
             </w:r>
           </w:p>
         </w:tc>
@@ -468,35 +480,35 @@
               <w:rPr>
                 <w:sz w:val="19"/>
               </w:rPr>
-              <w:t xml:space="preserve">TSE non-financial firms: full panel (firms × 24 years)</w:t>
-            </w:r>
-          </w:p>
-        </w:tc>
-        <w:tc>
-          <w:tcPr/>
-          <w:p>
-            <w:pPr>
-              <w:pStyle w:val="Compact"/>
-            </w:pPr>
-            <w:r>
-              <w:rPr>
-                <w:sz w:val="19"/>
-              </w:rPr>
-              <w:t xml:space="preserve">[n]</w:t>
-            </w:r>
-          </w:p>
-        </w:tc>
-        <w:tc>
-          <w:tcPr/>
-          <w:p>
-            <w:pPr>
-              <w:pStyle w:val="Compact"/>
-            </w:pPr>
-            <w:r>
-              <w:rPr>
-                <w:sz w:val="19"/>
-              </w:rPr>
-              <w:t xml:space="preserve">[n]</w:t>
+              <w:t xml:space="preserve">TSE non-financial firms: full panel (332 firms × 24 years)</w:t>
+            </w:r>
+          </w:p>
+        </w:tc>
+        <w:tc>
+          <w:tcPr/>
+          <w:p>
+            <w:pPr>
+              <w:pStyle w:val="Compact"/>
+            </w:pPr>
+            <w:r>
+              <w:rPr>
+                <w:sz w:val="19"/>
+              </w:rPr>
+              <w:t xml:space="preserve">332</w:t>
+            </w:r>
+          </w:p>
+        </w:tc>
+        <w:tc>
+          <w:tcPr/>
+          <w:p>
+            <w:pPr>
+              <w:pStyle w:val="Compact"/>
+            </w:pPr>
+            <w:r>
+              <w:rPr>
+                <w:sz w:val="19"/>
+              </w:rPr>
+              <w:t xml:space="preserve">7,968</w:t>
             </w:r>
           </w:p>
         </w:tc>
@@ -526,7 +538,7 @@
               <w:rPr>
                 <w:sz w:val="19"/>
               </w:rPr>
-              <w:t xml:space="preserve">Less: firm-years without financial statements</w:t>
+              <w:t xml:space="preserve">Less: firm-years without financial statements (not yet listed, delisted or not reported)</w:t>
             </w:r>
           </w:p>
         </w:tc>
@@ -554,7 +566,7 @@
               <w:rPr>
                 <w:sz w:val="19"/>
               </w:rPr>
-              <w:t xml:space="preserve">[−n]</w:t>
+              <w:t xml:space="preserve">−3,062</w:t>
             </w:r>
           </w:p>
         </w:tc>
@@ -612,7 +624,7 @@
               <w:rPr>
                 <w:sz w:val="19"/>
               </w:rPr>
-              <w:t xml:space="preserve">[−n]</w:t>
+              <w:t xml:space="preserve">−214</w:t>
             </w:r>
           </w:p>
         </w:tc>
@@ -656,21 +668,409 @@
               <w:rPr>
                 <w:sz w:val="19"/>
               </w:rPr>
-              <w:t xml:space="preserve">[n]</w:t>
-            </w:r>
-          </w:p>
-        </w:tc>
-        <w:tc>
-          <w:tcPr/>
-          <w:p>
-            <w:pPr>
-              <w:pStyle w:val="Compact"/>
-            </w:pPr>
-            <w:r>
-              <w:rPr>
-                <w:sz w:val="19"/>
-              </w:rPr>
-              <w:t xml:space="preserve">[n]</w:t>
+              <w:t xml:space="preserve">319</w:t>
+            </w:r>
+          </w:p>
+        </w:tc>
+        <w:tc>
+          <w:tcPr/>
+          <w:p>
+            <w:pPr>
+              <w:pStyle w:val="Compact"/>
+            </w:pPr>
+            <w:r>
+              <w:rPr>
+                <w:sz w:val="19"/>
+              </w:rPr>
+              <w:t xml:space="preserve">4,692</w:t>
+            </w:r>
+          </w:p>
+        </w:tc>
+      </w:tr>
+      <w:tr>
+        <w:tc>
+          <w:tcPr/>
+          <w:p>
+            <w:pPr>
+              <w:pStyle w:val="Compact"/>
+            </w:pPr>
+          </w:p>
+        </w:tc>
+        <w:tc>
+          <w:tcPr/>
+          <w:p>
+            <w:pPr>
+              <w:pStyle w:val="Compact"/>
+            </w:pPr>
+            <w:r>
+              <w:rPr>
+                <w:b/>
+                <w:bCs/>
+                <w:sz w:val="19"/>
+              </w:rPr>
+              <w:t xml:space="preserve">Panel B. Data availability of the final sample</w:t>
+            </w:r>
+          </w:p>
+        </w:tc>
+        <w:tc>
+          <w:tcPr/>
+          <w:p>
+            <w:pPr>
+              <w:pStyle w:val="Compact"/>
+            </w:pPr>
+          </w:p>
+        </w:tc>
+        <w:tc>
+          <w:tcPr/>
+          <w:p>
+            <w:pPr>
+              <w:pStyle w:val="Compact"/>
+            </w:pPr>
+          </w:p>
+        </w:tc>
+      </w:tr>
+      <w:tr>
+        <w:tc>
+          <w:tcPr/>
+          <w:p>
+            <w:pPr>
+              <w:pStyle w:val="Compact"/>
+            </w:pPr>
+          </w:p>
+        </w:tc>
+        <w:tc>
+          <w:tcPr/>
+          <w:p>
+            <w:pPr>
+              <w:pStyle w:val="Compact"/>
+            </w:pPr>
+            <w:r>
+              <w:rPr>
+                <w:sz w:val="19"/>
+              </w:rPr>
+              <w:t xml:space="preserve">Firms with data in all 24 years</w:t>
+            </w:r>
+          </w:p>
+        </w:tc>
+        <w:tc>
+          <w:tcPr/>
+          <w:p>
+            <w:pPr>
+              <w:pStyle w:val="Compact"/>
+            </w:pPr>
+            <w:r>
+              <w:rPr>
+                <w:sz w:val="19"/>
+              </w:rPr>
+              <w:t xml:space="preserve">23</w:t>
+            </w:r>
+          </w:p>
+        </w:tc>
+        <w:tc>
+          <w:tcPr/>
+          <w:p>
+            <w:pPr>
+              <w:pStyle w:val="Compact"/>
+            </w:pPr>
+            <w:r>
+              <w:rPr>
+                <w:sz w:val="19"/>
+              </w:rPr>
+              <w:t xml:space="preserve">552</w:t>
+            </w:r>
+          </w:p>
+        </w:tc>
+      </w:tr>
+      <w:tr>
+        <w:tc>
+          <w:tcPr/>
+          <w:p>
+            <w:pPr>
+              <w:pStyle w:val="Compact"/>
+            </w:pPr>
+          </w:p>
+        </w:tc>
+        <w:tc>
+          <w:tcPr/>
+          <w:p>
+            <w:pPr>
+              <w:pStyle w:val="Compact"/>
+            </w:pPr>
+            <w:r>
+              <w:rPr>
+                <w:sz w:val="19"/>
+              </w:rPr>
+              <w:t xml:space="preserve">Firms with data for part of the period</w:t>
+            </w:r>
+          </w:p>
+        </w:tc>
+        <w:tc>
+          <w:tcPr/>
+          <w:p>
+            <w:pPr>
+              <w:pStyle w:val="Compact"/>
+            </w:pPr>
+            <w:r>
+              <w:rPr>
+                <w:sz w:val="19"/>
+              </w:rPr>
+              <w:t xml:space="preserve">274</w:t>
+            </w:r>
+          </w:p>
+        </w:tc>
+        <w:tc>
+          <w:tcPr/>
+          <w:p>
+            <w:pPr>
+              <w:pStyle w:val="Compact"/>
+            </w:pPr>
+            <w:r>
+              <w:rPr>
+                <w:sz w:val="19"/>
+              </w:rPr>
+              <w:t xml:space="preserve">4,118</w:t>
+            </w:r>
+          </w:p>
+        </w:tc>
+      </w:tr>
+      <w:tr>
+        <w:tc>
+          <w:tcPr/>
+          <w:p>
+            <w:pPr>
+              <w:pStyle w:val="Compact"/>
+            </w:pPr>
+          </w:p>
+        </w:tc>
+        <w:tc>
+          <w:tcPr/>
+          <w:p>
+            <w:pPr>
+              <w:pStyle w:val="Compact"/>
+            </w:pPr>
+            <w:r>
+              <w:rPr>
+                <w:sz w:val="19"/>
+              </w:rPr>
+              <w:t xml:space="preserve">Firms with data in only one year</w:t>
+            </w:r>
+          </w:p>
+        </w:tc>
+        <w:tc>
+          <w:tcPr/>
+          <w:p>
+            <w:pPr>
+              <w:pStyle w:val="Compact"/>
+            </w:pPr>
+            <w:r>
+              <w:rPr>
+                <w:sz w:val="19"/>
+              </w:rPr>
+              <w:t xml:space="preserve">22</w:t>
+            </w:r>
+          </w:p>
+        </w:tc>
+        <w:tc>
+          <w:tcPr/>
+          <w:p>
+            <w:pPr>
+              <w:pStyle w:val="Compact"/>
+            </w:pPr>
+            <w:r>
+              <w:rPr>
+                <w:sz w:val="19"/>
+              </w:rPr>
+              <w:t xml:space="preserve">22</w:t>
+            </w:r>
+          </w:p>
+        </w:tc>
+      </w:tr>
+      <w:tr>
+        <w:tc>
+          <w:tcPr/>
+          <w:p>
+            <w:pPr>
+              <w:pStyle w:val="Compact"/>
+            </w:pPr>
+          </w:p>
+        </w:tc>
+        <w:tc>
+          <w:tcPr/>
+          <w:p>
+            <w:pPr>
+              <w:pStyle w:val="Compact"/>
+            </w:pPr>
+            <w:r>
+              <w:rPr>
+                <w:sz w:val="19"/>
+              </w:rPr>
+              <w:t xml:space="preserve">Of all firms: first year with data after 1380 (listed later)</w:t>
+            </w:r>
+          </w:p>
+        </w:tc>
+        <w:tc>
+          <w:tcPr/>
+          <w:p>
+            <w:pPr>
+              <w:pStyle w:val="Compact"/>
+            </w:pPr>
+            <w:r>
+              <w:rPr>
+                <w:sz w:val="19"/>
+              </w:rPr>
+              <w:t xml:space="preserve">120</w:t>
+            </w:r>
+          </w:p>
+        </w:tc>
+        <w:tc>
+          <w:tcPr/>
+          <w:p>
+            <w:pPr>
+              <w:pStyle w:val="Compact"/>
+            </w:pPr>
+          </w:p>
+        </w:tc>
+      </w:tr>
+      <w:tr>
+        <w:tc>
+          <w:tcPr/>
+          <w:p>
+            <w:pPr>
+              <w:pStyle w:val="Compact"/>
+            </w:pPr>
+          </w:p>
+        </w:tc>
+        <w:tc>
+          <w:tcPr/>
+          <w:p>
+            <w:pPr>
+              <w:pStyle w:val="Compact"/>
+            </w:pPr>
+            <w:r>
+              <w:rPr>
+                <w:sz w:val="19"/>
+              </w:rPr>
+              <w:t xml:space="preserve">Of all firms: last year with data before 1403 (delisted or not reported)</w:t>
+            </w:r>
+          </w:p>
+        </w:tc>
+        <w:tc>
+          <w:tcPr/>
+          <w:p>
+            <w:pPr>
+              <w:pStyle w:val="Compact"/>
+            </w:pPr>
+            <w:r>
+              <w:rPr>
+                <w:sz w:val="19"/>
+              </w:rPr>
+              <w:t xml:space="preserve">109</w:t>
+            </w:r>
+          </w:p>
+        </w:tc>
+        <w:tc>
+          <w:tcPr/>
+          <w:p>
+            <w:pPr>
+              <w:pStyle w:val="Compact"/>
+            </w:pPr>
+          </w:p>
+        </w:tc>
+      </w:tr>
+      <w:tr>
+        <w:tc>
+          <w:tcPr/>
+          <w:p>
+            <w:pPr>
+              <w:pStyle w:val="Compact"/>
+            </w:pPr>
+          </w:p>
+        </w:tc>
+        <w:tc>
+          <w:tcPr/>
+          <w:p>
+            <w:pPr>
+              <w:pStyle w:val="Compact"/>
+            </w:pPr>
+            <w:r>
+              <w:rPr>
+                <w:sz w:val="19"/>
+              </w:rPr>
+              <w:t xml:space="preserve">Of all firms: one or more missing years inside their period</w:t>
+            </w:r>
+          </w:p>
+        </w:tc>
+        <w:tc>
+          <w:tcPr/>
+          <w:p>
+            <w:pPr>
+              <w:pStyle w:val="Compact"/>
+            </w:pPr>
+            <w:r>
+              <w:rPr>
+                <w:sz w:val="19"/>
+              </w:rPr>
+              <w:t xml:space="preserve">196</w:t>
+            </w:r>
+          </w:p>
+        </w:tc>
+        <w:tc>
+          <w:tcPr/>
+          <w:p>
+            <w:pPr>
+              <w:pStyle w:val="Compact"/>
+            </w:pPr>
+          </w:p>
+        </w:tc>
+      </w:tr>
+      <w:tr>
+        <w:tc>
+          <w:tcPr/>
+          <w:p>
+            <w:pPr>
+              <w:pStyle w:val="Compact"/>
+            </w:pPr>
+          </w:p>
+        </w:tc>
+        <w:tc>
+          <w:tcPr/>
+          <w:p>
+            <w:pPr>
+              <w:pStyle w:val="Compact"/>
+            </w:pPr>
+            <w:r>
+              <w:rPr>
+                <w:sz w:val="19"/>
+              </w:rPr>
+              <w:t xml:space="preserve">Firms with data in every year 1393–1403 (balanced subsample, test S8)</w:t>
+            </w:r>
+          </w:p>
+        </w:tc>
+        <w:tc>
+          <w:tcPr/>
+          <w:p>
+            <w:pPr>
+              <w:pStyle w:val="Compact"/>
+            </w:pPr>
+            <w:r>
+              <w:rPr>
+                <w:sz w:val="19"/>
+              </w:rPr>
+              <w:t xml:space="preserve">82</w:t>
+            </w:r>
+          </w:p>
+        </w:tc>
+        <w:tc>
+          <w:tcPr/>
+          <w:p>
+            <w:pPr>
+              <w:pStyle w:val="Compact"/>
+            </w:pPr>
+            <w:r>
+              <w:rPr>
+                <w:sz w:val="19"/>
+              </w:rPr>
+              <w:t xml:space="preserve">1,726</w:t>
             </w:r>
           </w:p>
         </w:tc>
@@ -681,7 +1081,7 @@
         <w:pStyle w:val="BodyText"/>
       </w:pPr>
       <w:r>
-        <w:t xml:space="preserve">No minimum number of years is imposed. A firm-year enters an estimation when the lagged data that the estimation requires exist; firms with a short history therefore contribute only the years for which their lags are observed. An unbalanced panel is used because requiring every firm to report in all 24 years would keep only the firms that survived the whole period. Over-leveraged firms that fell into distress or left the exchange, exactly the firms at the centre of H1a, would be removed, and so would every firm listed after 1380, including the large wave of listings after the privatisations of the late 1380s. Such a sample would be biased toward survivors (survivorship bias) and would be too small for System GMM. The forward orthogonal deviation used in the GMM estimator (Section 3.8.2) is designed for panels with gaps. As a sensitivity test (S8), the models are re-estimated on the balanced subsample of firms with usable data in every year 1393–1403.</w:t>
+        <w:t xml:space="preserve">The final sample is an unbalanced panel of 319 firms and 4,692 firm-years, an average of 14.7 years per firm. Only 23 firms report in all 24 years, while 120 firms entered the exchange after 1380 and 109 left it, or stopped reporting, before 1403. No minimum number of years is imposed. A firm-year enters an estimation when the lagged data that the estimation requires exist; the 22 firms with a single year of data therefore enter only the cross-sectional first-stage models, and firms with gaps contribute the years whose lags are observed. The rule is set by data availability rather than by a researcher-chosen threshold.</w:t>
       </w:r>
     </w:p>
     <w:p>
@@ -689,13 +1089,67 @@
         <w:pStyle w:val="BodyText"/>
       </w:pPr>
       <w:r>
-        <w:t xml:space="preserve">Industries with fewer than two firms in the final sample are pooled into one category (</w:t>
+        <w:t xml:space="preserve">An unbalanced panel is used for three reasons. First, requiring every firm to report in all 24 years would keep 23 firms, too few for System GMM, whose instrument count must stay below the number of cross-sectional units. Second, such a sample would retain only survivors. Over-leveraged firms that fell into distress or left the exchange, the firms at the centre of H1a, would be removed, and so would every firm listed after 1380, including the wave of listings that followed the privatisations of the late 1380s; the estimates would be subject to survivorship bias. Third, the forward orthogonal deviation used in the GMM estimator (Section 3.8.2) is designed for panels with gaps. To show that entry and exit do not drive the results, all models are re-estimated on the balanced subsample of 82 firms with usable data in every year 1393–1403 (sensitivity test S8).</w:t>
+      </w:r>
+    </w:p>
+    <w:p>
+      <w:pPr>
+        <w:pStyle w:val="BodyText"/>
+      </w:pPr>
+      <w:r>
+        <w:rPr>
+          <w:b/>
+          <w:bCs/>
+        </w:rPr>
+        <w:t xml:space="preserve">Industries.</w:t>
+      </w:r>
+      <w:r>
+        <w:t xml:space="preserve"> </w:t>
+      </w:r>
+      <w:r>
+        <w:t xml:space="preserve">Industries are defined by the industry name in the database. The database also reports a broad group code (eleven groups, each combining several industries), which is too coarse to serve as an industry classification and is not used. Industries with a single firm in the final sample are pooled into one category (</w:t>
       </w:r>
       <w:r>
         <w:t xml:space="preserve">“other industries”</w:t>
       </w:r>
       <w:r>
-        <w:t xml:space="preserve">). Accounting data are collected from the Rahavard Novin database and cross-checked against the original filings in the Codal disclosure system. Market values of equity are computed as the year-end closing price times the number of shares, and the annual consumer-price inflation rate is obtained from the Central Bank of the Islamic Republic of Iran.</w:t>
+        <w:t xml:space="preserve">). In the estimations that use industry cells (industry leverage in Eq. 2, the DEA frontier and the industry dummies), industries with fewer than five firms are pooled into one group, so that no cell rests on one or two firms.</w:t>
+      </w:r>
+    </w:p>
+    <w:p>
+      <w:pPr>
+        <w:pStyle w:val="BodyText"/>
+      </w:pPr>
+      <w:r>
+        <w:rPr>
+          <w:b/>
+          <w:bCs/>
+        </w:rPr>
+        <w:t xml:space="preserve">Data sources and assembly.</w:t>
+      </w:r>
+      <w:r>
+        <w:t xml:space="preserve"> </w:t>
+      </w:r>
+      <w:r>
+        <w:t xml:space="preserve">Accounting data are collected from the Rahavard Novin database and cross-checked against the original filings in the Codal disclosure system. Data for 1380–1402 come from one extraction; data for 1403 come from six extractions that are merged on the company code (or, where the code is not reported, on the ticker). The database reports the statement of cash flows in the three-category format of the revised Iranian Accounting Standard No. 2 for all years, so operating, investing and financing cash flows are defined consistently across the period; the identity between the three flows and the change in cash is verified for every firm-year. Statements are taken from the separate (parent-company) financial statements. Market value of equity is the year-end closing price multiplied by the number of shares (paid-in capital divided by the nominal value of 1,000 rials). The annual inflation rate is obtained from the Central Bank of the Islamic Republic of Iran. All monetary amounts are in million rials.</w:t>
+      </w:r>
+    </w:p>
+    <w:p>
+      <w:pPr>
+        <w:pStyle w:val="BodyText"/>
+      </w:pPr>
+      <w:r>
+        <w:rPr>
+          <w:b/>
+          <w:bCs/>
+        </w:rPr>
+        <w:t xml:space="preserve">Structural change.</w:t>
+      </w:r>
+      <w:r>
+        <w:t xml:space="preserve"> </w:t>
+      </w:r>
+      <w:r>
+        <w:t xml:space="preserve">The 24-year window spans regimes with very different inflation, exchange-rate and sanctions conditions. Year dummies in every model absorb shocks common to all firms; the crisis years 1397–1399 are excluded in sensitivity test S6, and the models are re-estimated on the original study period 1395–1403 in sensitivity test S10.</w:t>
       </w:r>
     </w:p>
     <w:p>
@@ -1607,7 +2061,7 @@
         <w:t xml:space="preserve">LTA</w:t>
       </w:r>
       <w:r>
-        <w:t xml:space="preserve">: natural logarithm of total assets in 1392 prices (size). Deflation is necessary because nominal assets grow mechanically with inflation of 30–40% a year.</w:t>
+        <w:t xml:space="preserve">: natural logarithm of total assets in 1380 prices (size). Deflation is necessary because nominal assets grow mechanically with inflation of 30–40% a year.</w:t>
       </w:r>
     </w:p>
     <w:p>
@@ -2674,7 +3128,7 @@
         <w:t xml:space="preserve"> </w:t>
       </w:r>
       <w:r>
-        <w:t xml:space="preserve">Data envelopment analysis (DEA) estimates the efficiency with which each firm converts inputs into sales, relative to the efficient frontier of its peers. The model is input-oriented with variable returns to scale. The output is sales. The inputs are cost of goods sold, selling, general and administrative expenses, net PP&amp;E at t−1 and intangible assets at t−1. Lagged capital stocks are used because they are the resources available to managers during the year. The frontier is estimated for each industry over all sample years, with monetary values deflated to 1392 prices with the consumer price index; industries with fewer than five firms are pooled into one group. Industry-year frontiers are too small in this sample: with four inputs and few firms per industry-year, more than half of the firm-years lie on the frontier, so efficiency does not discriminate between firms. The industry frontier provides many more units than the rule of thumb of three times the number of inputs and outputs (Cooper, Seiford &amp; Tone, 2007). Deflation makes values comparable across years under high inflation. Industry-year frontiers are reported as a sensitivity test. The efficiency score FE lies in (0, 1].</w:t>
+        <w:t xml:space="preserve">Data envelopment analysis (DEA) estimates the efficiency with which each firm converts inputs into sales, relative to the efficient frontier of its peers. The model is input-oriented with variable returns to scale. The output is sales. The inputs are cost of goods sold, selling, general and administrative expenses, net PP&amp;E at t−1 and intangible assets at t−1. Lagged capital stocks are used because they are the resources available to managers during the year. The frontier is estimated for each industry over all sample years, with monetary values deflated to 1380 prices with the consumer price index; industries with fewer than five firms are pooled into one group. Industry-year frontiers are too small in this sample: with four inputs and few firms per industry-year, more than half of the firm-years lie on the frontier, so efficiency does not discriminate between firms. The industry frontier provides many more units than the rule of thumb of three times the number of inputs and outputs (Cooper, Seiford &amp; Tone, 2007). Deflation makes values comparable across years under high inflation. Industry-year frontiers are reported as a sensitivity test. The efficiency score FE lies in (0, 1].</w:t>
       </w:r>
     </w:p>
     <w:p>
@@ -8369,7 +8823,7 @@
         <w:t xml:space="preserve">i</w:t>
       </w:r>
       <w:r>
-        <w:t xml:space="preserve">, pooled OLS biases γ₁ upward and the within estimator biases it downward; the within bias is of order 1/T (Nickell, 1981) and is not negligible with about nine effective years.</w:t>
+        <w:t xml:space="preserve">, pooled OLS biases γ₁ upward and the within estimator biases it downward; the within bias is of order 1/T (Nickell, 1981); with an average of about 15 years per firm it is smaller than in short panels but not negligible.</w:t>
       </w:r>
     </w:p>
     <w:p>
@@ -8979,7 +9433,7 @@
         <w:pStyle w:val="BodyText"/>
       </w:pPr>
       <w:r>
-        <w:t xml:space="preserve">The controls are treated as endogenous rather than predetermined. Size, growth opportunities, profitability and cash flow respond to past investment shocks, so even their lagged values may be correlated with the error (Wintoki, Linck &amp; Netter, 2012); in this sample the Hansen test also rejected the weaker predetermined assumption. The instrument matrix is collapsed and lag depth is restricted to two, so that the instrument count stays below the 299 cross-sectional units. Instrument proliferation overfits the endogenous regressors and weakens the Hansen test (Roodman, 2009a). The instrument count is reported for every model.</w:t>
+        <w:t xml:space="preserve">The controls are treated as endogenous rather than predetermined. Size, growth opportunities, profitability and cash flow respond to past investment shocks, so even their lagged values may be correlated with the error (Wintoki, Linck &amp; Netter, 2012); in this sample the Hansen test also rejected the weaker predetermined assumption. The instrument matrix is collapsed and lag depth is restricted to two, so that the instrument count stays below the 319 cross-sectional units. Because the instruments are collapsed, their number does not grow with the length of the panel, which matters with up to 24 years per firm. Instrument proliferation overfits the endogenous regressors and weakens the Hansen test (Roodman, 2009a). The instrument count is reported for every model.</w:t>
       </w:r>
     </w:p>
     <w:p>
@@ -9197,21 +9651,21 @@
               <w:rPr>
                 <w:sz w:val="19"/>
               </w:rPr>
-              <w:t xml:space="preserve">Frontier per industry-year</w:t>
-            </w:r>
-          </w:p>
-        </w:tc>
-        <w:tc>
-          <w:tcPr/>
-          <w:p>
-            <w:pPr>
-              <w:pStyle w:val="Compact"/>
-            </w:pPr>
-            <w:r>
-              <w:rPr>
-                <w:sz w:val="19"/>
-              </w:rPr>
-              <w:t xml:space="preserve">Frontier per industry-year</w:t>
+              <w:t xml:space="preserve">Pooled over all years (values in 1380 prices)</w:t>
+            </w:r>
+          </w:p>
+        </w:tc>
+        <w:tc>
+          <w:tcPr/>
+          <w:p>
+            <w:pPr>
+              <w:pStyle w:val="Compact"/>
+            </w:pPr>
+            <w:r>
+              <w:rPr>
+                <w:sz w:val="19"/>
+              </w:rPr>
+              <w:t xml:space="preserve">Frontier per industry</w:t>
             </w:r>
           </w:p>
         </w:tc>
@@ -10864,21 +11318,21 @@
               <w:rPr>
                 <w:sz w:val="19"/>
               </w:rPr>
-              <w:t xml:space="preserve">With N = 299 and T ≈ 9, asymptotics run in N; Fisher-type panel unit-root tests on InvEff and CSDev are reported for completeness</w:t>
-            </w:r>
-          </w:p>
-        </w:tc>
-        <w:tc>
-          <w:tcPr/>
-          <w:p>
-            <w:pPr>
-              <w:pStyle w:val="Compact"/>
-            </w:pPr>
-            <w:r>
-              <w:rPr>
-                <w:sz w:val="19"/>
-              </w:rPr>
-              <w:t xml:space="preserve">—</w:t>
+              <w:t xml:space="preserve">With N = 319 and up to 24 years per firm, Fisher-type panel unit-root tests (which allow unbalanced panels) on InvEff and CSDev are reported</w:t>
+            </w:r>
+          </w:p>
+        </w:tc>
+        <w:tc>
+          <w:tcPr/>
+          <w:p>
+            <w:pPr>
+              <w:pStyle w:val="Compact"/>
+            </w:pPr>
+            <w:r>
+              <w:rPr>
+                <w:sz w:val="19"/>
+              </w:rPr>
+              <w:t xml:space="preserve">Year dummies; variables are ratios or residuals</w:t>
             </w:r>
           </w:p>
         </w:tc>
@@ -11987,7 +12441,51 @@
               <w:rPr>
                 <w:sz w:val="19"/>
               </w:rPr>
-              <w:t xml:space="preserve">Balanced subsample: firms with usable data in every year 1393–1403, to assess survivorship effects</w:t>
+              <w:t xml:space="preserve">Balanced subsample: the 82 firms with usable data in every year 1393–1403, to assess survivorship effects</w:t>
+            </w:r>
+          </w:p>
+        </w:tc>
+      </w:tr>
+      <w:tr>
+        <w:tc>
+          <w:tcPr/>
+          <w:p>
+            <w:pPr>
+              <w:pStyle w:val="Compact"/>
+            </w:pPr>
+            <w:r>
+              <w:rPr>
+                <w:sz w:val="19"/>
+              </w:rPr>
+              <w:t xml:space="preserve">S10</w:t>
+            </w:r>
+          </w:p>
+        </w:tc>
+        <w:tc>
+          <w:tcPr/>
+          <w:p>
+            <w:pPr>
+              <w:pStyle w:val="Compact"/>
+            </w:pPr>
+            <w:r>
+              <w:rPr>
+                <w:sz w:val="19"/>
+              </w:rPr>
+              <w:t xml:space="preserve">Study period</w:t>
+            </w:r>
+          </w:p>
+        </w:tc>
+        <w:tc>
+          <w:tcPr/>
+          <w:p>
+            <w:pPr>
+              <w:pStyle w:val="Compact"/>
+            </w:pPr>
+            <w:r>
+              <w:rPr>
+                <w:sz w:val="19"/>
+              </w:rPr>
+              <w:t xml:space="preserve">Original study period 1395–1403 (data from 1392), to check that the extension to 1380 does not drive the results</w:t>
             </w:r>
           </w:p>
         </w:tc>
@@ -12088,7 +12586,7 @@
         <w:t xml:space="preserve"> </w:t>
       </w:r>
       <w:r>
-        <w:t xml:space="preserve">CSDev is randomly reassigned across firms within each industry-year 1,000 times. The distribution of placebo coefficients is compared with the actual estimates.</w:t>
+        <w:t xml:space="preserve">CSDev is randomly reassigned across firms within each industry-year 500 times. The distribution of placebo coefficients is compared with the actual estimates.</w:t>
       </w:r>
     </w:p>
     <w:p>
@@ -12206,7 +12704,7 @@
               <w:rPr>
                 <w:sz w:val="19"/>
               </w:rPr>
-              <w:t xml:space="preserve">Sample construction by year and industry</w:t>
+              <w:t xml:space="preserve">Sample construction by year and industry; firms per year; industry list with codes (Persian and English names)</w:t>
             </w:r>
           </w:p>
         </w:tc>
@@ -12356,7 +12854,7 @@
               <w:rPr>
                 <w:sz w:val="19"/>
               </w:rPr>
-              <w:t xml:space="preserve">Full estimates for S1–S9</w:t>
+              <w:t xml:space="preserve">Full estimates for S1–S10</w:t>
             </w:r>
           </w:p>
         </w:tc>
@@ -12943,7 +13441,7 @@
               <w:rPr>
                 <w:sz w:val="19"/>
               </w:rPr>
-              <w:t xml:space="preserve">ln(TA / CPI), total assets in 1392 prices</w:t>
+              <w:t xml:space="preserve">ln(TA / CPI), total assets in 1380 prices</w:t>
             </w:r>
           </w:p>
         </w:tc>
@@ -13843,7 +14341,7 @@
               <w:rPr>
                 <w:sz w:val="19"/>
               </w:rPr>
-              <w:t xml:space="preserve">Price index built from INF, base year 1392 = 1</w:t>
+              <w:t xml:space="preserve">Price index built from INF, base year 1380 = 1</w:t>
             </w:r>
           </w:p>
         </w:tc>
@@ -14706,7 +15204,19 @@
         </w:numPr>
       </w:pPr>
       <w:r>
-        <w:t xml:space="preserve">Fill in the [n] counts in the sample-construction table in 3.1 from the Screening sheet of Research_Data_1380_1403.xlsx.</w:t>
+        <w:t xml:space="preserve">Table 1 uses the counts of the Screening sheet of Research_Data_1380_1403.xlsx. Check steps 1-2 before submission: 1,286 firms in step 1 is more than twice the number of firms in the 1380-1402 file (551). If 1403 rows were not matched to their firm (Merge_report), they appear as separate firms and inflate steps 1 and 2; fix the merge and re-run before reporting.</w:t>
+      </w:r>
+    </w:p>
+    <w:p>
+      <w:pPr>
+        <w:pStyle w:val="Compact"/>
+        <w:numPr>
+          <w:ilvl w:val="0"/>
+          <w:numId w:val="1008"/>
+        </w:numPr>
+      </w:pPr>
+      <w:r>
+        <w:t xml:space="preserve">State the source and type of the inflation series you use (CBI or Statistical Centre; annual average or Esfand-to-Esfand).</w:t>
       </w:r>
     </w:p>
     <w:p>

</xml_diff>

<commit_message>
Screening step 7: at least six consecutive years of usable data (estimator requirement); methodology updated
Co-Authored-By: Claude Opus 5.5 <noreply@anthropic.com>
Claude-Session: https://claude.ai/code/session_019etBaQcYpfE848z3Ex8rct
</commit_message>
<xml_diff>
--- a/docs/Research_Methodology.docx
+++ b/docs/Research_Methodology.docx
@@ -113,6 +113,18 @@
       </w:pPr>
       <w:r>
         <w:t xml:space="preserve">Exclude firm-years with zero or negative book equity. Leverage above one and a negative market-to-book ratio make a target capital structure undefined for these firm-years, and their investment reflects financial distress rather than financing choices.</w:t>
+      </w:r>
+    </w:p>
+    <w:p>
+      <w:pPr>
+        <w:pStyle w:val="Compact"/>
+        <w:numPr>
+          <w:ilvl w:val="0"/>
+          <w:numId w:val="1001"/>
+        </w:numPr>
+      </w:pPr>
+      <w:r>
+        <w:t xml:space="preserve">Exclude firms with fewer than six consecutive years of usable data. The threshold follows from the estimator rather than from a choice of the researcher: one observation of the dynamic models needs data for years t−3 to t (the lagged dependent variable is built from sales growth at t−2, and the volatility controls use t−3 to t−1), and the forward orthogonal deviation and the Arellano–Bond AR(2) test need at least three consecutive observations per firm. Six consecutive years are therefore the minimum with which a firm contributes to identification and to the specification tests.</w:t>
       </w:r>
     </w:p>
     <w:p>
@@ -640,49 +652,49 @@
               <w:rPr>
                 <w:sz w:val="19"/>
               </w:rPr>
-              <w:t xml:space="preserve">=</w:t>
-            </w:r>
-          </w:p>
-        </w:tc>
-        <w:tc>
-          <w:tcPr/>
-          <w:p>
-            <w:pPr>
-              <w:pStyle w:val="Compact"/>
-            </w:pPr>
-            <w:r>
-              <w:rPr>
-                <w:sz w:val="19"/>
-              </w:rPr>
-              <w:t xml:space="preserve">Final sample (unbalanced panel, including base year 1380)</w:t>
-            </w:r>
-          </w:p>
-        </w:tc>
-        <w:tc>
-          <w:tcPr/>
-          <w:p>
-            <w:pPr>
-              <w:pStyle w:val="Compact"/>
-            </w:pPr>
-            <w:r>
-              <w:rPr>
-                <w:sz w:val="19"/>
-              </w:rPr>
-              <w:t xml:space="preserve">319</w:t>
-            </w:r>
-          </w:p>
-        </w:tc>
-        <w:tc>
-          <w:tcPr/>
-          <w:p>
-            <w:pPr>
-              <w:pStyle w:val="Compact"/>
-            </w:pPr>
-            <w:r>
-              <w:rPr>
-                <w:sz w:val="19"/>
-              </w:rPr>
-              <w:t xml:space="preserve">4,692</w:t>
+              <w:t xml:space="preserve">7</w:t>
+            </w:r>
+          </w:p>
+        </w:tc>
+        <w:tc>
+          <w:tcPr/>
+          <w:p>
+            <w:pPr>
+              <w:pStyle w:val="Compact"/>
+            </w:pPr>
+            <w:r>
+              <w:rPr>
+                <w:sz w:val="19"/>
+              </w:rPr>
+              <w:t xml:space="preserve">Less: firms with fewer than six consecutive years of usable data</w:t>
+            </w:r>
+          </w:p>
+        </w:tc>
+        <w:tc>
+          <w:tcPr/>
+          <w:p>
+            <w:pPr>
+              <w:pStyle w:val="Compact"/>
+            </w:pPr>
+            <w:r>
+              <w:rPr>
+                <w:sz w:val="19"/>
+              </w:rPr>
+              <w:t xml:space="preserve">[−n]</w:t>
+            </w:r>
+          </w:p>
+        </w:tc>
+        <w:tc>
+          <w:tcPr/>
+          <w:p>
+            <w:pPr>
+              <w:pStyle w:val="Compact"/>
+            </w:pPr>
+            <w:r>
+              <w:rPr>
+                <w:sz w:val="19"/>
+              </w:rPr>
+              <w:t xml:space="preserve">[−n]</w:t>
             </w:r>
           </w:p>
         </w:tc>
@@ -694,6 +706,64 @@
             <w:pPr>
               <w:pStyle w:val="Compact"/>
             </w:pPr>
+            <w:r>
+              <w:rPr>
+                <w:sz w:val="19"/>
+              </w:rPr>
+              <w:t xml:space="preserve">=</w:t>
+            </w:r>
+          </w:p>
+        </w:tc>
+        <w:tc>
+          <w:tcPr/>
+          <w:p>
+            <w:pPr>
+              <w:pStyle w:val="Compact"/>
+            </w:pPr>
+            <w:r>
+              <w:rPr>
+                <w:sz w:val="19"/>
+              </w:rPr>
+              <w:t xml:space="preserve">Final sample (unbalanced panel, including base year 1380)</w:t>
+            </w:r>
+          </w:p>
+        </w:tc>
+        <w:tc>
+          <w:tcPr/>
+          <w:p>
+            <w:pPr>
+              <w:pStyle w:val="Compact"/>
+            </w:pPr>
+            <w:r>
+              <w:rPr>
+                <w:sz w:val="19"/>
+              </w:rPr>
+              <w:t xml:space="preserve">[n]</w:t>
+            </w:r>
+          </w:p>
+        </w:tc>
+        <w:tc>
+          <w:tcPr/>
+          <w:p>
+            <w:pPr>
+              <w:pStyle w:val="Compact"/>
+            </w:pPr>
+            <w:r>
+              <w:rPr>
+                <w:sz w:val="19"/>
+              </w:rPr>
+              <w:t xml:space="preserve">[n]</w:t>
+            </w:r>
+          </w:p>
+        </w:tc>
+      </w:tr>
+      <w:tr>
+        <w:tc>
+          <w:tcPr/>
+          <w:p>
+            <w:pPr>
+              <w:pStyle w:val="Compact"/>
+            </w:pPr>
           </w:p>
         </w:tc>
         <w:tc>
@@ -708,7 +778,7 @@
                 <w:bCs/>
                 <w:sz w:val="19"/>
               </w:rPr>
-              <w:t xml:space="preserve">Panel B. Data availability of the final sample</w:t>
+              <w:t xml:space="preserve">Panel B. Data availability of the firms after step 6</w:t>
             </w:r>
           </w:p>
         </w:tc>
@@ -1081,7 +1151,7 @@
         <w:pStyle w:val="BodyText"/>
       </w:pPr>
       <w:r>
-        <w:t xml:space="preserve">The final sample is an unbalanced panel of 319 firms and 4,692 firm-years, an average of 14.7 years per firm. Only 23 firms report in all 24 years, while 120 firms entered the exchange after 1380 and 109 left it, or stopped reporting, before 1403. No minimum number of years is imposed. A firm-year enters an estimation when the lagged data that the estimation requires exist; the 22 firms with a single year of data therefore enter only the cross-sectional first-stage models, and firms with gaps contribute the years whose lags are observed. The rule is set by data availability rather than by a researcher-chosen threshold.</w:t>
+        <w:t xml:space="preserve">After step 6, only 23 firms report in all 24 years, while 120 firms entered the exchange after 1380 and 109 left it, or stopped reporting, before 1403. The final sample is an unbalanced panel of [n] firms and [n] firm-years. The only length requirement is step 7, which is set by the data needs of the estimator (six consecutive years), not by a preference for long-lived firms; firms with gaps keep all their usable years, and each year enters an estimation when the lags it requires exist.</w:t>
       </w:r>
     </w:p>
     <w:p>

</xml_diff>

<commit_message>
Methodology: final Table 1 (320 firms, 5,623 firm-years), panel structure, market correction, S8 = 120 firms
Co-Authored-By: Claude Opus 5.5 <noreply@anthropic.com>
Claude-Session: https://claude.ai/code/session_019etBaQcYpfE848z3Ex8rct
</commit_message>
<xml_diff>
--- a/docs/Research_Methodology.docx
+++ b/docs/Research_Methodology.docx
@@ -64,7 +64,7 @@
         </w:numPr>
       </w:pPr>
       <w:r>
-        <w:t xml:space="preserve">Exclude Farabourse firms and firms whose market is not recorded, so that the sample consists of firms traded on the main exchange.</w:t>
+        <w:t xml:space="preserve">Exclude Farabourse firms and firms whose market is not recorded, so that the sample consists of firms traded on the main exchange. The database records each firm’s current market; firms that traded on the TSE during 1392–1403 and later moved to Farabourse are identified from the TSE listings of those years and retained.</w:t>
       </w:r>
     </w:p>
     <w:p>
@@ -280,21 +280,21 @@
               <w:rPr>
                 <w:sz w:val="19"/>
               </w:rPr>
-              <w:t xml:space="preserve">1,286</w:t>
-            </w:r>
-          </w:p>
-        </w:tc>
-        <w:tc>
-          <w:tcPr/>
-          <w:p>
-            <w:pPr>
-              <w:pStyle w:val="Compact"/>
-            </w:pPr>
-            <w:r>
-              <w:rPr>
-                <w:sz w:val="19"/>
-              </w:rPr>
-              <w:t xml:space="preserve">9,434</w:t>
+              <w:t xml:space="preserve">1,162</w:t>
+            </w:r>
+          </w:p>
+        </w:tc>
+        <w:tc>
+          <w:tcPr/>
+          <w:p>
+            <w:pPr>
+              <w:pStyle w:val="Compact"/>
+            </w:pPr>
+            <w:r>
+              <w:rPr>
+                <w:sz w:val="19"/>
+              </w:rPr>
+              <w:t xml:space="preserve">9,304</w:t>
             </w:r>
           </w:p>
         </w:tc>
@@ -338,21 +338,21 @@
               <w:rPr>
                 <w:sz w:val="19"/>
               </w:rPr>
-              <w:t xml:space="preserve">−916</w:t>
-            </w:r>
-          </w:p>
-        </w:tc>
-        <w:tc>
-          <w:tcPr/>
-          <w:p>
-            <w:pPr>
-              <w:pStyle w:val="Compact"/>
-            </w:pPr>
-            <w:r>
-              <w:rPr>
-                <w:sz w:val="19"/>
-              </w:rPr>
-              <w:t xml:space="preserve">−3,819</w:t>
+              <w:t xml:space="preserve">−693</w:t>
+            </w:r>
+          </w:p>
+        </w:tc>
+        <w:tc>
+          <w:tcPr/>
+          <w:p>
+            <w:pPr>
+              <w:pStyle w:val="Compact"/>
+            </w:pPr>
+            <w:r>
+              <w:rPr>
+                <w:sz w:val="19"/>
+              </w:rPr>
+              <w:t xml:space="preserve">−1,924</w:t>
             </w:r>
           </w:p>
         </w:tc>
@@ -454,21 +454,21 @@
               <w:rPr>
                 <w:sz w:val="19"/>
               </w:rPr>
-              <w:t xml:space="preserve">−10</w:t>
-            </w:r>
-          </w:p>
-        </w:tc>
-        <w:tc>
-          <w:tcPr/>
-          <w:p>
-            <w:pPr>
-              <w:pStyle w:val="Compact"/>
-            </w:pPr>
-            <w:r>
-              <w:rPr>
-                <w:sz w:val="19"/>
-              </w:rPr>
-              <w:t xml:space="preserve">−30</w:t>
+              <w:t xml:space="preserve">−11</w:t>
+            </w:r>
+          </w:p>
+        </w:tc>
+        <w:tc>
+          <w:tcPr/>
+          <w:p>
+            <w:pPr>
+              <w:pStyle w:val="Compact"/>
+            </w:pPr>
+            <w:r>
+              <w:rPr>
+                <w:sz w:val="19"/>
+              </w:rPr>
+              <w:t xml:space="preserve">−43</w:t>
             </w:r>
           </w:p>
         </w:tc>
@@ -492,35 +492,35 @@
               <w:rPr>
                 <w:sz w:val="19"/>
               </w:rPr>
-              <w:t xml:space="preserve">TSE non-financial firms: full panel (332 firms × 24 years)</w:t>
-            </w:r>
-          </w:p>
-        </w:tc>
-        <w:tc>
-          <w:tcPr/>
-          <w:p>
-            <w:pPr>
-              <w:pStyle w:val="Compact"/>
-            </w:pPr>
-            <w:r>
-              <w:rPr>
-                <w:sz w:val="19"/>
-              </w:rPr>
-              <w:t xml:space="preserve">332</w:t>
-            </w:r>
-          </w:p>
-        </w:tc>
-        <w:tc>
-          <w:tcPr/>
-          <w:p>
-            <w:pPr>
-              <w:pStyle w:val="Compact"/>
-            </w:pPr>
-            <w:r>
-              <w:rPr>
-                <w:sz w:val="19"/>
-              </w:rPr>
-              <w:t xml:space="preserve">7,968</w:t>
+              <w:t xml:space="preserve">TSE non-financial firms: full panel (430 firms × 24 years)</w:t>
+            </w:r>
+          </w:p>
+        </w:tc>
+        <w:tc>
+          <w:tcPr/>
+          <w:p>
+            <w:pPr>
+              <w:pStyle w:val="Compact"/>
+            </w:pPr>
+            <w:r>
+              <w:rPr>
+                <w:sz w:val="19"/>
+              </w:rPr>
+              <w:t xml:space="preserve">430</w:t>
+            </w:r>
+          </w:p>
+        </w:tc>
+        <w:tc>
+          <w:tcPr/>
+          <w:p>
+            <w:pPr>
+              <w:pStyle w:val="Compact"/>
+            </w:pPr>
+            <w:r>
+              <w:rPr>
+                <w:sz w:val="19"/>
+              </w:rPr>
+              <w:t xml:space="preserve">10,320</w:t>
             </w:r>
           </w:p>
         </w:tc>
@@ -578,7 +578,7 @@
               <w:rPr>
                 <w:sz w:val="19"/>
               </w:rPr>
-              <w:t xml:space="preserve">−3,062</w:t>
+              <w:t xml:space="preserve">−3,916</w:t>
             </w:r>
           </w:p>
         </w:tc>
@@ -636,7 +636,7 @@
               <w:rPr>
                 <w:sz w:val="19"/>
               </w:rPr>
-              <w:t xml:space="preserve">−214</w:t>
+              <w:t xml:space="preserve">−359</w:t>
             </w:r>
           </w:p>
         </w:tc>
@@ -680,21 +680,21 @@
               <w:rPr>
                 <w:sz w:val="19"/>
               </w:rPr>
-              <w:t xml:space="preserve">[−n]</w:t>
-            </w:r>
-          </w:p>
-        </w:tc>
-        <w:tc>
-          <w:tcPr/>
-          <w:p>
-            <w:pPr>
-              <w:pStyle w:val="Compact"/>
-            </w:pPr>
-            <w:r>
-              <w:rPr>
-                <w:sz w:val="19"/>
-              </w:rPr>
-              <w:t xml:space="preserve">[−n]</w:t>
+              <w:t xml:space="preserve">−97</w:t>
+            </w:r>
+          </w:p>
+        </w:tc>
+        <w:tc>
+          <w:tcPr/>
+          <w:p>
+            <w:pPr>
+              <w:pStyle w:val="Compact"/>
+            </w:pPr>
+            <w:r>
+              <w:rPr>
+                <w:sz w:val="19"/>
+              </w:rPr>
+              <w:t xml:space="preserve">−422</w:t>
             </w:r>
           </w:p>
         </w:tc>
@@ -738,21 +738,21 @@
               <w:rPr>
                 <w:sz w:val="19"/>
               </w:rPr>
-              <w:t xml:space="preserve">[n]</w:t>
-            </w:r>
-          </w:p>
-        </w:tc>
-        <w:tc>
-          <w:tcPr/>
-          <w:p>
-            <w:pPr>
-              <w:pStyle w:val="Compact"/>
-            </w:pPr>
-            <w:r>
-              <w:rPr>
-                <w:sz w:val="19"/>
-              </w:rPr>
-              <w:t xml:space="preserve">[n]</w:t>
+              <w:t xml:space="preserve">320</w:t>
+            </w:r>
+          </w:p>
+        </w:tc>
+        <w:tc>
+          <w:tcPr/>
+          <w:p>
+            <w:pPr>
+              <w:pStyle w:val="Compact"/>
+            </w:pPr>
+            <w:r>
+              <w:rPr>
+                <w:sz w:val="19"/>
+              </w:rPr>
+              <w:t xml:space="preserve">5,623</w:t>
             </w:r>
           </w:p>
         </w:tc>
@@ -832,21 +832,21 @@
               <w:rPr>
                 <w:sz w:val="19"/>
               </w:rPr>
-              <w:t xml:space="preserve">23</w:t>
-            </w:r>
-          </w:p>
-        </w:tc>
-        <w:tc>
-          <w:tcPr/>
-          <w:p>
-            <w:pPr>
-              <w:pStyle w:val="Compact"/>
-            </w:pPr>
-            <w:r>
-              <w:rPr>
-                <w:sz w:val="19"/>
-              </w:rPr>
-              <w:t xml:space="preserve">552</w:t>
+              <w:t xml:space="preserve">24</w:t>
+            </w:r>
+          </w:p>
+        </w:tc>
+        <w:tc>
+          <w:tcPr/>
+          <w:p>
+            <w:pPr>
+              <w:pStyle w:val="Compact"/>
+            </w:pPr>
+            <w:r>
+              <w:rPr>
+                <w:sz w:val="19"/>
+              </w:rPr>
+              <w:t xml:space="preserve">576</w:t>
             </w:r>
           </w:p>
         </w:tc>
@@ -884,21 +884,21 @@
               <w:rPr>
                 <w:sz w:val="19"/>
               </w:rPr>
-              <w:t xml:space="preserve">274</w:t>
-            </w:r>
-          </w:p>
-        </w:tc>
-        <w:tc>
-          <w:tcPr/>
-          <w:p>
-            <w:pPr>
-              <w:pStyle w:val="Compact"/>
-            </w:pPr>
-            <w:r>
-              <w:rPr>
-                <w:sz w:val="19"/>
-              </w:rPr>
-              <w:t xml:space="preserve">4,118</w:t>
+              <w:t xml:space="preserve">371</w:t>
+            </w:r>
+          </w:p>
+        </w:tc>
+        <w:tc>
+          <w:tcPr/>
+          <w:p>
+            <w:pPr>
+              <w:pStyle w:val="Compact"/>
+            </w:pPr>
+            <w:r>
+              <w:rPr>
+                <w:sz w:val="19"/>
+              </w:rPr>
+              <w:t xml:space="preserve">5,447</w:t>
             </w:r>
           </w:p>
         </w:tc>
@@ -988,7 +988,7 @@
               <w:rPr>
                 <w:sz w:val="19"/>
               </w:rPr>
-              <w:t xml:space="preserve">120</w:t>
+              <w:t xml:space="preserve">199</w:t>
             </w:r>
           </w:p>
         </w:tc>
@@ -1034,7 +1034,7 @@
               <w:rPr>
                 <w:sz w:val="19"/>
               </w:rPr>
-              <w:t xml:space="preserve">109</w:t>
+              <w:t xml:space="preserve">126</w:t>
             </w:r>
           </w:p>
         </w:tc>
@@ -1080,7 +1080,7 @@
               <w:rPr>
                 <w:sz w:val="19"/>
               </w:rPr>
-              <w:t xml:space="preserve">196</w:t>
+              <w:t xml:space="preserve">263</w:t>
             </w:r>
           </w:p>
         </w:tc>
@@ -1126,21 +1126,21 @@
               <w:rPr>
                 <w:sz w:val="19"/>
               </w:rPr>
-              <w:t xml:space="preserve">82</w:t>
-            </w:r>
-          </w:p>
-        </w:tc>
-        <w:tc>
-          <w:tcPr/>
-          <w:p>
-            <w:pPr>
-              <w:pStyle w:val="Compact"/>
-            </w:pPr>
-            <w:r>
-              <w:rPr>
-                <w:sz w:val="19"/>
-              </w:rPr>
-              <w:t xml:space="preserve">1,726</w:t>
+              <w:t xml:space="preserve">120</w:t>
+            </w:r>
+          </w:p>
+        </w:tc>
+        <w:tc>
+          <w:tcPr/>
+          <w:p>
+            <w:pPr>
+              <w:pStyle w:val="Compact"/>
+            </w:pPr>
+            <w:r>
+              <w:rPr>
+                <w:sz w:val="19"/>
+              </w:rPr>
+              <w:t xml:space="preserve">2,323</w:t>
             </w:r>
           </w:p>
         </w:tc>
@@ -1151,7 +1151,7 @@
         <w:pStyle w:val="BodyText"/>
       </w:pPr>
       <w:r>
-        <w:t xml:space="preserve">After step 6, only 23 firms report in all 24 years, while 120 firms entered the exchange after 1380 and 109 left it, or stopped reporting, before 1403. The final sample is an unbalanced panel of [n] firms and [n] firm-years. The only length requirement is step 7, which is set by the data needs of the estimator (six consecutive years), not by a preference for long-lived firms; firms with gaps keep all their usable years, and each year enters an estimation when the lags it requires exist.</w:t>
+        <w:t xml:space="preserve">After step 6, only 24 firms report in all 24 years, while 199 firms entered the exchange after 1380 and 126 left it, or stopped reporting, before 1403. The final sample is an unbalanced panel of 320 firms and 5,623 firm-years, an average of 17.6 years per firm. The only length requirement is step 7, which is set by the data needs of the estimator (six consecutive years), not by a preference for long-lived firms; firms with gaps keep all their usable years, and each year enters an estimation when the lags it requires exist.</w:t>
       </w:r>
     </w:p>
     <w:p>
@@ -1159,7 +1159,7 @@
         <w:pStyle w:val="BodyText"/>
       </w:pPr>
       <w:r>
-        <w:t xml:space="preserve">An unbalanced panel is used for three reasons. First, requiring every firm to report in all 24 years would keep 23 firms, too few for System GMM, whose instrument count must stay below the number of cross-sectional units. Second, such a sample would retain only survivors. Over-leveraged firms that fell into distress or left the exchange, the firms at the centre of H1a, would be removed, and so would every firm listed after 1380, including the wave of listings that followed the privatisations of the late 1380s; the estimates would be subject to survivorship bias. Third, the forward orthogonal deviation used in the GMM estimator (Section 3.8.2) is designed for panels with gaps. To show that entry and exit do not drive the results, all models are re-estimated on the balanced subsample of 82 firms with usable data in every year 1393–1403 (sensitivity test S8).</w:t>
+        <w:t xml:space="preserve">An unbalanced panel is used for three reasons. First, requiring every firm to report in all 24 years would keep 24 firms, too few for System GMM, whose instrument count must stay below the number of cross-sectional units. Second, such a sample would retain only survivors. Over-leveraged firms that fell into distress or left the exchange, the firms at the centre of H1a, would be removed, and so would every firm listed after 1380, including the wave of listings that followed the privatisations of the late 1380s; the estimates would be subject to survivorship bias. Third, the forward orthogonal deviation used in the GMM estimator (Section 3.8.2) is designed for panels with gaps. To show that entry and exit do not drive the results, all models are re-estimated on the balanced subsample of 120 firms with usable data in every year 1393–1403 (sensitivity test S8).</w:t>
       </w:r>
     </w:p>
     <w:p>
@@ -8893,7 +8893,7 @@
         <w:t xml:space="preserve">i</w:t>
       </w:r>
       <w:r>
-        <w:t xml:space="preserve">, pooled OLS biases γ₁ upward and the within estimator biases it downward; the within bias is of order 1/T (Nickell, 1981); with an average of about 15 years per firm it is smaller than in short panels but not negligible.</w:t>
+        <w:t xml:space="preserve">, pooled OLS biases γ₁ upward and the within estimator biases it downward; the within bias is of order 1/T (Nickell, 1981); with an average of about 18 years per firm it is smaller than in short panels but not negligible.</w:t>
       </w:r>
     </w:p>
     <w:p>
@@ -9503,7 +9503,7 @@
         <w:pStyle w:val="BodyText"/>
       </w:pPr>
       <w:r>
-        <w:t xml:space="preserve">The controls are treated as endogenous rather than predetermined. Size, growth opportunities, profitability and cash flow respond to past investment shocks, so even their lagged values may be correlated with the error (Wintoki, Linck &amp; Netter, 2012); in this sample the Hansen test also rejected the weaker predetermined assumption. The instrument matrix is collapsed and lag depth is restricted to two, so that the instrument count stays below the 319 cross-sectional units. Because the instruments are collapsed, their number does not grow with the length of the panel, which matters with up to 24 years per firm. Instrument proliferation overfits the endogenous regressors and weakens the Hansen test (Roodman, 2009a). The instrument count is reported for every model.</w:t>
+        <w:t xml:space="preserve">The controls are treated as endogenous rather than predetermined. Size, growth opportunities, profitability and cash flow respond to past investment shocks, so even their lagged values may be correlated with the error (Wintoki, Linck &amp; Netter, 2012); in this sample the Hansen test also rejected the weaker predetermined assumption. The instrument matrix is collapsed and lag depth is restricted to two, so that the instrument count stays below the 320 cross-sectional units. Because the instruments are collapsed, their number does not grow with the length of the panel, which matters with up to 24 years per firm. Instrument proliferation overfits the endogenous regressors and weakens the Hansen test (Roodman, 2009a). The instrument count is reported for every model.</w:t>
       </w:r>
     </w:p>
     <w:p>
@@ -11388,7 +11388,7 @@
               <w:rPr>
                 <w:sz w:val="19"/>
               </w:rPr>
-              <w:t xml:space="preserve">With N = 319 and up to 24 years per firm, Fisher-type panel unit-root tests (which allow unbalanced panels) on InvEff and CSDev are reported</w:t>
+              <w:t xml:space="preserve">With N = 320 and up to 24 years per firm, Fisher-type panel unit-root tests (which allow unbalanced panels) on InvEff and CSDev are reported</w:t>
             </w:r>
           </w:p>
         </w:tc>
@@ -12511,7 +12511,7 @@
               <w:rPr>
                 <w:sz w:val="19"/>
               </w:rPr>
-              <w:t xml:space="preserve">Balanced subsample: the 82 firms with usable data in every year 1393–1403, to assess survivorship effects</w:t>
+              <w:t xml:space="preserve">Balanced subsample: the 120 firms with usable data in every year 1393–1403, to assess survivorship effects</w:t>
             </w:r>
           </w:p>
         </w:tc>
@@ -15274,7 +15274,7 @@
         </w:numPr>
       </w:pPr>
       <w:r>
-        <w:t xml:space="preserve">Table 1 uses the counts of the Screening sheet of Research_Data_1380_1403.xlsx. Check steps 1-2 before submission: 1,286 firms in step 1 is more than twice the number of firms in the 1380-1402 file (551). If 1403 rows were not matched to their firm (Merge_report), they appear as separate firms and inflate steps 1 and 2; fix the merge and re-run before reporting.</w:t>
+        <w:t xml:space="preserve">Table 1 uses the counts of the Screening sheet of Research_Data_1380_1403.xlsx (final run after the 1403 merge and the market correction).</w:t>
       </w:r>
     </w:p>
     <w:p>

</xml_diff>

<commit_message>
Keep firm-years with non-positive book equity (asset-based market-to-book); screening step removed, S11 excludes them; methodology updated
Co-Authored-By: Claude Opus 5.5 <noreply@anthropic.com>
Claude-Session: https://claude.ai/code/session_019etBaQcYpfE848z3Ex8rct
</commit_message>
<xml_diff>
--- a/docs/Research_Methodology.docx
+++ b/docs/Research_Methodology.docx
@@ -112,24 +112,20 @@
         </w:numPr>
       </w:pPr>
       <w:r>
-        <w:t xml:space="preserve">Exclude firm-years with zero or negative book equity. Leverage above one and a negative market-to-book ratio make a target capital structure undefined for these firm-years, and their investment reflects financial distress rather than financing choices.</w:t>
-      </w:r>
-    </w:p>
-    <w:p>
-      <w:pPr>
-        <w:pStyle w:val="Compact"/>
-        <w:numPr>
-          <w:ilvl w:val="0"/>
-          <w:numId w:val="1001"/>
-        </w:numPr>
-      </w:pPr>
-      <w:r>
         <w:t xml:space="preserve">Exclude firms with fewer than six consecutive years of usable data. The threshold follows from the estimator rather than from a choice of the researcher: one observation of the dynamic models needs data for years t−3 to t (the lagged dependent variable is built from sales growth at t−2, and the volatility controls use t−3 to t−1), and the forward orthogonal deviation and the Arellano–Bond AR(2) test need at least three consecutive observations per firm. Six consecutive years are therefore the minimum with which a firm contributes to identification and to the specification tests.</w:t>
       </w:r>
     </w:p>
     <w:p>
       <w:pPr>
         <w:pStyle w:val="FirstParagraph"/>
+      </w:pPr>
+      <w:r>
+        <w:t xml:space="preserve">Firm-years with zero or negative book equity are retained. These are the most heavily indebted firms in the sample, many of them subject to Article 141 of the Commercial Code (accumulated losses of at least half of capital), and they are the firms in which debt overhang should be strongest; excluding them would remove the upper tail of over-leverage on which H1a rests. Two measurement choices keep these firm-years well defined. Growth opportunities are measured by the market-to-book ratio of assets, (MV + TD) / TA, which is defined for every firm, instead of the equity market-to-book ratio, which becomes negative or undefined when book equity is not positive. Leverage TDA can exceed one for these firms; it is winsorized at the 1st and 99th percentiles like every other ratio, and fitted target leverage is bounded to [0, 1]. Sensitivity test S11 re-estimates all models without these firm-years.</w:t>
+      </w:r>
+    </w:p>
+    <w:p>
+      <w:pPr>
+        <w:pStyle w:val="BodyText"/>
       </w:pPr>
       <w:r>
         <w:t xml:space="preserve">All firms have a fiscal year ending in Esfand (March), so every firm-year shares the same macroeconomic window. Table 1 reports the construction of the sample.</w:t>
@@ -608,35 +604,35 @@
               <w:rPr>
                 <w:sz w:val="19"/>
               </w:rPr>
-              <w:t xml:space="preserve">Less: firm-years with zero or negative book equity</w:t>
-            </w:r>
-          </w:p>
-        </w:tc>
-        <w:tc>
-          <w:tcPr/>
-          <w:p>
-            <w:pPr>
-              <w:pStyle w:val="Compact"/>
-            </w:pPr>
-            <w:r>
-              <w:rPr>
-                <w:sz w:val="19"/>
-              </w:rPr>
-              <w:t xml:space="preserve">—</w:t>
-            </w:r>
-          </w:p>
-        </w:tc>
-        <w:tc>
-          <w:tcPr/>
-          <w:p>
-            <w:pPr>
-              <w:pStyle w:val="Compact"/>
-            </w:pPr>
-            <w:r>
-              <w:rPr>
-                <w:sz w:val="19"/>
-              </w:rPr>
-              <w:t xml:space="preserve">−359</w:t>
+              <w:t xml:space="preserve">Less: firms with fewer than six consecutive years of usable data</w:t>
+            </w:r>
+          </w:p>
+        </w:tc>
+        <w:tc>
+          <w:tcPr/>
+          <w:p>
+            <w:pPr>
+              <w:pStyle w:val="Compact"/>
+            </w:pPr>
+            <w:r>
+              <w:rPr>
+                <w:sz w:val="19"/>
+              </w:rPr>
+              <w:t xml:space="preserve">[−n]</w:t>
+            </w:r>
+          </w:p>
+        </w:tc>
+        <w:tc>
+          <w:tcPr/>
+          <w:p>
+            <w:pPr>
+              <w:pStyle w:val="Compact"/>
+            </w:pPr>
+            <w:r>
+              <w:rPr>
+                <w:sz w:val="19"/>
+              </w:rPr>
+              <w:t xml:space="preserve">[−n]</w:t>
             </w:r>
           </w:p>
         </w:tc>
@@ -652,49 +648,49 @@
               <w:rPr>
                 <w:sz w:val="19"/>
               </w:rPr>
-              <w:t xml:space="preserve">7</w:t>
-            </w:r>
-          </w:p>
-        </w:tc>
-        <w:tc>
-          <w:tcPr/>
-          <w:p>
-            <w:pPr>
-              <w:pStyle w:val="Compact"/>
-            </w:pPr>
-            <w:r>
-              <w:rPr>
-                <w:sz w:val="19"/>
-              </w:rPr>
-              <w:t xml:space="preserve">Less: firms with fewer than six consecutive years of usable data</w:t>
-            </w:r>
-          </w:p>
-        </w:tc>
-        <w:tc>
-          <w:tcPr/>
-          <w:p>
-            <w:pPr>
-              <w:pStyle w:val="Compact"/>
-            </w:pPr>
-            <w:r>
-              <w:rPr>
-                <w:sz w:val="19"/>
-              </w:rPr>
-              <w:t xml:space="preserve">−97</w:t>
-            </w:r>
-          </w:p>
-        </w:tc>
-        <w:tc>
-          <w:tcPr/>
-          <w:p>
-            <w:pPr>
-              <w:pStyle w:val="Compact"/>
-            </w:pPr>
-            <w:r>
-              <w:rPr>
-                <w:sz w:val="19"/>
-              </w:rPr>
-              <w:t xml:space="preserve">−422</w:t>
+              <w:t xml:space="preserve">=</w:t>
+            </w:r>
+          </w:p>
+        </w:tc>
+        <w:tc>
+          <w:tcPr/>
+          <w:p>
+            <w:pPr>
+              <w:pStyle w:val="Compact"/>
+            </w:pPr>
+            <w:r>
+              <w:rPr>
+                <w:sz w:val="19"/>
+              </w:rPr>
+              <w:t xml:space="preserve">Final sample (unbalanced panel, including base year 1380)</w:t>
+            </w:r>
+          </w:p>
+        </w:tc>
+        <w:tc>
+          <w:tcPr/>
+          <w:p>
+            <w:pPr>
+              <w:pStyle w:val="Compact"/>
+            </w:pPr>
+            <w:r>
+              <w:rPr>
+                <w:sz w:val="19"/>
+              </w:rPr>
+              <w:t xml:space="preserve">[n]</w:t>
+            </w:r>
+          </w:p>
+        </w:tc>
+        <w:tc>
+          <w:tcPr/>
+          <w:p>
+            <w:pPr>
+              <w:pStyle w:val="Compact"/>
+            </w:pPr>
+            <w:r>
+              <w:rPr>
+                <w:sz w:val="19"/>
+              </w:rPr>
+              <w:t xml:space="preserve">[n]</w:t>
             </w:r>
           </w:p>
         </w:tc>
@@ -706,54 +702,38 @@
             <w:pPr>
               <w:pStyle w:val="Compact"/>
             </w:pPr>
-            <w:r>
-              <w:rPr>
-                <w:sz w:val="19"/>
-              </w:rPr>
-              <w:t xml:space="preserve">=</w:t>
-            </w:r>
-          </w:p>
-        </w:tc>
-        <w:tc>
-          <w:tcPr/>
-          <w:p>
-            <w:pPr>
-              <w:pStyle w:val="Compact"/>
-            </w:pPr>
-            <w:r>
-              <w:rPr>
-                <w:sz w:val="19"/>
-              </w:rPr>
-              <w:t xml:space="preserve">Final sample (unbalanced panel, including base year 1380)</w:t>
-            </w:r>
-          </w:p>
-        </w:tc>
-        <w:tc>
-          <w:tcPr/>
-          <w:p>
-            <w:pPr>
-              <w:pStyle w:val="Compact"/>
-            </w:pPr>
-            <w:r>
-              <w:rPr>
-                <w:sz w:val="19"/>
-              </w:rPr>
-              <w:t xml:space="preserve">320</w:t>
-            </w:r>
-          </w:p>
-        </w:tc>
-        <w:tc>
-          <w:tcPr/>
-          <w:p>
-            <w:pPr>
-              <w:pStyle w:val="Compact"/>
-            </w:pPr>
-            <w:r>
-              <w:rPr>
-                <w:sz w:val="19"/>
-              </w:rPr>
-              <w:t xml:space="preserve">5,623</w:t>
-            </w:r>
+          </w:p>
+        </w:tc>
+        <w:tc>
+          <w:tcPr/>
+          <w:p>
+            <w:pPr>
+              <w:pStyle w:val="Compact"/>
+            </w:pPr>
+            <w:r>
+              <w:rPr>
+                <w:b/>
+                <w:bCs/>
+                <w:sz w:val="19"/>
+              </w:rPr>
+              <w:t xml:space="preserve">Panel B. Data availability of the firms after step 5</w:t>
+            </w:r>
+          </w:p>
+        </w:tc>
+        <w:tc>
+          <w:tcPr/>
+          <w:p>
+            <w:pPr>
+              <w:pStyle w:val="Compact"/>
+            </w:pPr>
+          </w:p>
+        </w:tc>
+        <w:tc>
+          <w:tcPr/>
+          <w:p>
+            <w:pPr>
+              <w:pStyle w:val="Compact"/>
+            </w:pPr>
           </w:p>
         </w:tc>
       </w:tr>
@@ -774,28 +754,38 @@
             </w:pPr>
             <w:r>
               <w:rPr>
-                <w:b/>
-                <w:bCs/>
-                <w:sz w:val="19"/>
-              </w:rPr>
-              <w:t xml:space="preserve">Panel B. Data availability of the firms after step 6</w:t>
-            </w:r>
-          </w:p>
-        </w:tc>
-        <w:tc>
-          <w:tcPr/>
-          <w:p>
-            <w:pPr>
-              <w:pStyle w:val="Compact"/>
-            </w:pPr>
-          </w:p>
-        </w:tc>
-        <w:tc>
-          <w:tcPr/>
-          <w:p>
-            <w:pPr>
-              <w:pStyle w:val="Compact"/>
-            </w:pPr>
+                <w:sz w:val="19"/>
+              </w:rPr>
+              <w:t xml:space="preserve">Firms with data in all 24 years</w:t>
+            </w:r>
+          </w:p>
+        </w:tc>
+        <w:tc>
+          <w:tcPr/>
+          <w:p>
+            <w:pPr>
+              <w:pStyle w:val="Compact"/>
+            </w:pPr>
+            <w:r>
+              <w:rPr>
+                <w:sz w:val="19"/>
+              </w:rPr>
+              <w:t xml:space="preserve">[n]</w:t>
+            </w:r>
+          </w:p>
+        </w:tc>
+        <w:tc>
+          <w:tcPr/>
+          <w:p>
+            <w:pPr>
+              <w:pStyle w:val="Compact"/>
+            </w:pPr>
+            <w:r>
+              <w:rPr>
+                <w:sz w:val="19"/>
+              </w:rPr>
+              <w:t xml:space="preserve">[n]</w:t>
+            </w:r>
           </w:p>
         </w:tc>
       </w:tr>
@@ -818,35 +808,35 @@
               <w:rPr>
                 <w:sz w:val="19"/>
               </w:rPr>
-              <w:t xml:space="preserve">Firms with data in all 24 years</w:t>
-            </w:r>
-          </w:p>
-        </w:tc>
-        <w:tc>
-          <w:tcPr/>
-          <w:p>
-            <w:pPr>
-              <w:pStyle w:val="Compact"/>
-            </w:pPr>
-            <w:r>
-              <w:rPr>
-                <w:sz w:val="19"/>
-              </w:rPr>
-              <w:t xml:space="preserve">24</w:t>
-            </w:r>
-          </w:p>
-        </w:tc>
-        <w:tc>
-          <w:tcPr/>
-          <w:p>
-            <w:pPr>
-              <w:pStyle w:val="Compact"/>
-            </w:pPr>
-            <w:r>
-              <w:rPr>
-                <w:sz w:val="19"/>
-              </w:rPr>
-              <w:t xml:space="preserve">576</w:t>
+              <w:t xml:space="preserve">Firms with data for part of the period</w:t>
+            </w:r>
+          </w:p>
+        </w:tc>
+        <w:tc>
+          <w:tcPr/>
+          <w:p>
+            <w:pPr>
+              <w:pStyle w:val="Compact"/>
+            </w:pPr>
+            <w:r>
+              <w:rPr>
+                <w:sz w:val="19"/>
+              </w:rPr>
+              <w:t xml:space="preserve">[n]</w:t>
+            </w:r>
+          </w:p>
+        </w:tc>
+        <w:tc>
+          <w:tcPr/>
+          <w:p>
+            <w:pPr>
+              <w:pStyle w:val="Compact"/>
+            </w:pPr>
+            <w:r>
+              <w:rPr>
+                <w:sz w:val="19"/>
+              </w:rPr>
+              <w:t xml:space="preserve">[n]</w:t>
             </w:r>
           </w:p>
         </w:tc>
@@ -870,35 +860,35 @@
               <w:rPr>
                 <w:sz w:val="19"/>
               </w:rPr>
-              <w:t xml:space="preserve">Firms with data for part of the period</w:t>
-            </w:r>
-          </w:p>
-        </w:tc>
-        <w:tc>
-          <w:tcPr/>
-          <w:p>
-            <w:pPr>
-              <w:pStyle w:val="Compact"/>
-            </w:pPr>
-            <w:r>
-              <w:rPr>
-                <w:sz w:val="19"/>
-              </w:rPr>
-              <w:t xml:space="preserve">371</w:t>
-            </w:r>
-          </w:p>
-        </w:tc>
-        <w:tc>
-          <w:tcPr/>
-          <w:p>
-            <w:pPr>
-              <w:pStyle w:val="Compact"/>
-            </w:pPr>
-            <w:r>
-              <w:rPr>
-                <w:sz w:val="19"/>
-              </w:rPr>
-              <w:t xml:space="preserve">5,447</w:t>
+              <w:t xml:space="preserve">Firms with data in only one year</w:t>
+            </w:r>
+          </w:p>
+        </w:tc>
+        <w:tc>
+          <w:tcPr/>
+          <w:p>
+            <w:pPr>
+              <w:pStyle w:val="Compact"/>
+            </w:pPr>
+            <w:r>
+              <w:rPr>
+                <w:sz w:val="19"/>
+              </w:rPr>
+              <w:t xml:space="preserve">[n]</w:t>
+            </w:r>
+          </w:p>
+        </w:tc>
+        <w:tc>
+          <w:tcPr/>
+          <w:p>
+            <w:pPr>
+              <w:pStyle w:val="Compact"/>
+            </w:pPr>
+            <w:r>
+              <w:rPr>
+                <w:sz w:val="19"/>
+              </w:rPr>
+              <w:t xml:space="preserve">[n]</w:t>
             </w:r>
           </w:p>
         </w:tc>
@@ -922,36 +912,30 @@
               <w:rPr>
                 <w:sz w:val="19"/>
               </w:rPr>
-              <w:t xml:space="preserve">Firms with data in only one year</w:t>
-            </w:r>
-          </w:p>
-        </w:tc>
-        <w:tc>
-          <w:tcPr/>
-          <w:p>
-            <w:pPr>
-              <w:pStyle w:val="Compact"/>
-            </w:pPr>
-            <w:r>
-              <w:rPr>
-                <w:sz w:val="19"/>
-              </w:rPr>
-              <w:t xml:space="preserve">22</w:t>
-            </w:r>
-          </w:p>
-        </w:tc>
-        <w:tc>
-          <w:tcPr/>
-          <w:p>
-            <w:pPr>
-              <w:pStyle w:val="Compact"/>
-            </w:pPr>
-            <w:r>
-              <w:rPr>
-                <w:sz w:val="19"/>
-              </w:rPr>
-              <w:t xml:space="preserve">22</w:t>
-            </w:r>
+              <w:t xml:space="preserve">Of all firms: first year with data after 1380 (listed later)</w:t>
+            </w:r>
+          </w:p>
+        </w:tc>
+        <w:tc>
+          <w:tcPr/>
+          <w:p>
+            <w:pPr>
+              <w:pStyle w:val="Compact"/>
+            </w:pPr>
+            <w:r>
+              <w:rPr>
+                <w:sz w:val="19"/>
+              </w:rPr>
+              <w:t xml:space="preserve">[n]</w:t>
+            </w:r>
+          </w:p>
+        </w:tc>
+        <w:tc>
+          <w:tcPr/>
+          <w:p>
+            <w:pPr>
+              <w:pStyle w:val="Compact"/>
+            </w:pPr>
           </w:p>
         </w:tc>
       </w:tr>
@@ -974,21 +958,21 @@
               <w:rPr>
                 <w:sz w:val="19"/>
               </w:rPr>
-              <w:t xml:space="preserve">Of all firms: first year with data after 1380 (listed later)</w:t>
-            </w:r>
-          </w:p>
-        </w:tc>
-        <w:tc>
-          <w:tcPr/>
-          <w:p>
-            <w:pPr>
-              <w:pStyle w:val="Compact"/>
-            </w:pPr>
-            <w:r>
-              <w:rPr>
-                <w:sz w:val="19"/>
-              </w:rPr>
-              <w:t xml:space="preserve">199</w:t>
+              <w:t xml:space="preserve">Of all firms: last year with data before 1403 (delisted or not reported)</w:t>
+            </w:r>
+          </w:p>
+        </w:tc>
+        <w:tc>
+          <w:tcPr/>
+          <w:p>
+            <w:pPr>
+              <w:pStyle w:val="Compact"/>
+            </w:pPr>
+            <w:r>
+              <w:rPr>
+                <w:sz w:val="19"/>
+              </w:rPr>
+              <w:t xml:space="preserve">[n]</w:t>
             </w:r>
           </w:p>
         </w:tc>
@@ -1020,21 +1004,21 @@
               <w:rPr>
                 <w:sz w:val="19"/>
               </w:rPr>
-              <w:t xml:space="preserve">Of all firms: last year with data before 1403 (delisted or not reported)</w:t>
-            </w:r>
-          </w:p>
-        </w:tc>
-        <w:tc>
-          <w:tcPr/>
-          <w:p>
-            <w:pPr>
-              <w:pStyle w:val="Compact"/>
-            </w:pPr>
-            <w:r>
-              <w:rPr>
-                <w:sz w:val="19"/>
-              </w:rPr>
-              <w:t xml:space="preserve">126</w:t>
+              <w:t xml:space="preserve">Of all firms: one or more missing years inside their period</w:t>
+            </w:r>
+          </w:p>
+        </w:tc>
+        <w:tc>
+          <w:tcPr/>
+          <w:p>
+            <w:pPr>
+              <w:pStyle w:val="Compact"/>
+            </w:pPr>
+            <w:r>
+              <w:rPr>
+                <w:sz w:val="19"/>
+              </w:rPr>
+              <w:t xml:space="preserve">[n]</w:t>
             </w:r>
           </w:p>
         </w:tc>
@@ -1066,52 +1050,6 @@
               <w:rPr>
                 <w:sz w:val="19"/>
               </w:rPr>
-              <w:t xml:space="preserve">Of all firms: one or more missing years inside their period</w:t>
-            </w:r>
-          </w:p>
-        </w:tc>
-        <w:tc>
-          <w:tcPr/>
-          <w:p>
-            <w:pPr>
-              <w:pStyle w:val="Compact"/>
-            </w:pPr>
-            <w:r>
-              <w:rPr>
-                <w:sz w:val="19"/>
-              </w:rPr>
-              <w:t xml:space="preserve">263</w:t>
-            </w:r>
-          </w:p>
-        </w:tc>
-        <w:tc>
-          <w:tcPr/>
-          <w:p>
-            <w:pPr>
-              <w:pStyle w:val="Compact"/>
-            </w:pPr>
-          </w:p>
-        </w:tc>
-      </w:tr>
-      <w:tr>
-        <w:tc>
-          <w:tcPr/>
-          <w:p>
-            <w:pPr>
-              <w:pStyle w:val="Compact"/>
-            </w:pPr>
-          </w:p>
-        </w:tc>
-        <w:tc>
-          <w:tcPr/>
-          <w:p>
-            <w:pPr>
-              <w:pStyle w:val="Compact"/>
-            </w:pPr>
-            <w:r>
-              <w:rPr>
-                <w:sz w:val="19"/>
-              </w:rPr>
               <w:t xml:space="preserve">Firms with data in every year 1393–1403 (balanced subsample, test S8)</w:t>
             </w:r>
           </w:p>
@@ -1126,21 +1064,21 @@
               <w:rPr>
                 <w:sz w:val="19"/>
               </w:rPr>
-              <w:t xml:space="preserve">120</w:t>
-            </w:r>
-          </w:p>
-        </w:tc>
-        <w:tc>
-          <w:tcPr/>
-          <w:p>
-            <w:pPr>
-              <w:pStyle w:val="Compact"/>
-            </w:pPr>
-            <w:r>
-              <w:rPr>
-                <w:sz w:val="19"/>
-              </w:rPr>
-              <w:t xml:space="preserve">2,323</w:t>
+              <w:t xml:space="preserve">[n]</w:t>
+            </w:r>
+          </w:p>
+        </w:tc>
+        <w:tc>
+          <w:tcPr/>
+          <w:p>
+            <w:pPr>
+              <w:pStyle w:val="Compact"/>
+            </w:pPr>
+            <w:r>
+              <w:rPr>
+                <w:sz w:val="19"/>
+              </w:rPr>
+              <w:t xml:space="preserve">[n]</w:t>
             </w:r>
           </w:p>
         </w:tc>
@@ -1151,7 +1089,7 @@
         <w:pStyle w:val="BodyText"/>
       </w:pPr>
       <w:r>
-        <w:t xml:space="preserve">After step 6, only 24 firms report in all 24 years, while 199 firms entered the exchange after 1380 and 126 left it, or stopped reporting, before 1403. The final sample is an unbalanced panel of 320 firms and 5,623 firm-years, an average of 17.6 years per firm. The only length requirement is step 7, which is set by the data needs of the estimator (six consecutive years), not by a preference for long-lived firms; firms with gaps keep all their usable years, and each year enters an estimation when the lags it requires exist.</w:t>
+        <w:t xml:space="preserve">After step 5, only [n] firms report in all 24 years, while [n] firms entered the exchange after 1380 and [n] left it, or stopped reporting, before 1403. The final sample is an unbalanced panel of [n] firms and [n] firm-years. The only length requirement is step 6, which is set by the data needs of the estimator (six consecutive years), not by a preference for long-lived firms; firms with gaps keep all their usable years, and each year enters an estimation when the lags it requires exist.</w:t>
       </w:r>
     </w:p>
     <w:p>
@@ -1159,7 +1097,7 @@
         <w:pStyle w:val="BodyText"/>
       </w:pPr>
       <w:r>
-        <w:t xml:space="preserve">An unbalanced panel is used for three reasons. First, requiring every firm to report in all 24 years would keep 24 firms, too few for System GMM, whose instrument count must stay below the number of cross-sectional units. Second, such a sample would retain only survivors. Over-leveraged firms that fell into distress or left the exchange, the firms at the centre of H1a, would be removed, and so would every firm listed after 1380, including the wave of listings that followed the privatisations of the late 1380s; the estimates would be subject to survivorship bias. Third, the forward orthogonal deviation used in the GMM estimator (Section 3.8.2) is designed for panels with gaps. To show that entry and exit do not drive the results, all models are re-estimated on the balanced subsample of 120 firms with usable data in every year 1393–1403 (sensitivity test S8).</w:t>
+        <w:t xml:space="preserve">An unbalanced panel is used for three reasons. First, requiring every firm to report in all 24 years would keep about two dozen firms, too few for System GMM, whose instrument count must stay below the number of cross-sectional units. Second, such a sample would retain only survivors. Over-leveraged firms that fell into distress or left the exchange, the firms at the centre of H1a, would be removed, and so would every firm listed after 1380, including the wave of listings that followed the privatisations of the late 1380s; the estimates would be subject to survivorship bias. Third, the forward orthogonal deviation used in the GMM estimator (Section 3.8.2) is designed for panels with gaps. To show that entry and exit do not drive the results, all models are re-estimated on the balanced subsample of firms with usable data in every year 1393–1403 (sensitivity test S8).</w:t>
       </w:r>
     </w:p>
     <w:p>
@@ -2150,7 +2088,7 @@
         <w:t xml:space="preserve">MTB</w:t>
       </w:r>
       <w:r>
-        <w:t xml:space="preserve">: market value / book value of equity (growth opportunities).</w:t>
+        <w:t xml:space="preserve">: market-to-book ratio of assets, (market value of equity + total liabilities) / total assets (growth opportunities). The asset-based ratio is used because it is defined for firms with zero or negative book equity, which are retained in the sample (Section 3.1).</w:t>
       </w:r>
     </w:p>
     <w:p>
@@ -3649,7 +3587,7 @@
         <w:t xml:space="preserve">MTB</w:t>
       </w:r>
       <w:r>
-        <w:t xml:space="preserve">: growth opportunities not captured by past sales growth.</w:t>
+        <w:t xml:space="preserve">: market-to-book ratio of assets, a measure of growth opportunities not captured by past sales growth.</w:t>
       </w:r>
     </w:p>
     <w:p>
@@ -8967,7 +8905,7 @@
         <w:t xml:space="preserve"> </w:t>
       </w:r>
       <w:r>
-        <w:t xml:space="preserve">and is instrumented with lagged levels, and the levels equation, instrumented with lagged first differences. The transformation is the forward orthogonal deviation (Arellano &amp; Bover, 1995): each observation is expressed as its deviation from the mean of all future observations of the same firm. The panel has gaps, because firm-years with non-positive book equity are excluded (Section 3.1). First-differencing loses two observations at every gap, while the forward orthogonal deviation loses only one and uses all available future information (Roodman, 2009b). First differences are reported as sensitivity test S9a. The levels equation is valid if changes in the instruments are uncorrelated with the firm effect. It adds information that is valuable when the series are persistent and the panel is short, in which case lagged levels are weak instruments for first differences (Blundell &amp; Bond, 1998).</w:t>
+        <w:t xml:space="preserve">and is instrumented with lagged levels, and the levels equation, instrumented with lagged first differences. The transformation is the forward orthogonal deviation (Arellano &amp; Bover, 1995): each observation is expressed as its deviation from the mean of all future observations of the same firm. The panel has gaps, because some firms do not report in every year (Section 3.1). First-differencing loses two observations at every gap, while the forward orthogonal deviation loses only one and uses all available future information (Roodman, 2009b). First differences are reported as sensitivity test S9a. The levels equation is valid if changes in the instruments are uncorrelated with the firm effect. It adds information that is valuable when the series are persistent and the panel is short, in which case lagged levels are weak instruments for first differences (Blundell &amp; Bond, 1998).</w:t>
       </w:r>
     </w:p>
     <w:p>
@@ -12511,7 +12449,7 @@
               <w:rPr>
                 <w:sz w:val="19"/>
               </w:rPr>
-              <w:t xml:space="preserve">Balanced subsample: the 120 firms with usable data in every year 1393–1403, to assess survivorship effects</w:t>
+              <w:t xml:space="preserve">Balanced subsample: firms with usable data in every year 1393–1403, to assess survivorship effects</w:t>
             </w:r>
           </w:p>
         </w:tc>
@@ -12556,6 +12494,50 @@
                 <w:sz w:val="19"/>
               </w:rPr>
               <w:t xml:space="preserve">Original study period 1395–1403 (data from 1392), to check that the extension to 1380 does not drive the results</w:t>
+            </w:r>
+          </w:p>
+        </w:tc>
+      </w:tr>
+      <w:tr>
+        <w:tc>
+          <w:tcPr/>
+          <w:p>
+            <w:pPr>
+              <w:pStyle w:val="Compact"/>
+            </w:pPr>
+            <w:r>
+              <w:rPr>
+                <w:sz w:val="19"/>
+              </w:rPr>
+              <w:t xml:space="preserve">S11</w:t>
+            </w:r>
+          </w:p>
+        </w:tc>
+        <w:tc>
+          <w:tcPr/>
+          <w:p>
+            <w:pPr>
+              <w:pStyle w:val="Compact"/>
+            </w:pPr>
+            <w:r>
+              <w:rPr>
+                <w:sz w:val="19"/>
+              </w:rPr>
+              <w:t xml:space="preserve">Distressed firms</w:t>
+            </w:r>
+          </w:p>
+        </w:tc>
+        <w:tc>
+          <w:tcPr/>
+          <w:p>
+            <w:pPr>
+              <w:pStyle w:val="Compact"/>
+            </w:pPr>
+            <w:r>
+              <w:rPr>
+                <w:sz w:val="19"/>
+              </w:rPr>
+              <w:t xml:space="preserve">Exclude firm-years with zero or negative book equity (retained in the main sample)</w:t>
             </w:r>
           </w:p>
         </w:tc>
@@ -12924,7 +12906,7 @@
               <w:rPr>
                 <w:sz w:val="19"/>
               </w:rPr>
-              <w:t xml:space="preserve">Full estimates for S1–S10</w:t>
+              <w:t xml:space="preserve">Full estimates for S1–S11</w:t>
             </w:r>
           </w:p>
         </w:tc>
@@ -13555,21 +13537,21 @@
               <w:rPr>
                 <w:sz w:val="19"/>
               </w:rPr>
-              <w:t xml:space="preserve">MV / BV</w:t>
-            </w:r>
-          </w:p>
-        </w:tc>
-        <w:tc>
-          <w:tcPr/>
-          <w:p>
-            <w:pPr>
-              <w:pStyle w:val="Compact"/>
-            </w:pPr>
-            <w:r>
-              <w:rPr>
-                <w:sz w:val="19"/>
-              </w:rPr>
-              <w:t xml:space="preserve">MV, BV</w:t>
+              <w:t xml:space="preserve">(MV + TD) / TA, market-to-book of assets</w:t>
+            </w:r>
+          </w:p>
+        </w:tc>
+        <w:tc>
+          <w:tcPr/>
+          <w:p>
+            <w:pPr>
+              <w:pStyle w:val="Compact"/>
+            </w:pPr>
+            <w:r>
+              <w:rPr>
+                <w:sz w:val="19"/>
+              </w:rPr>
+              <w:t xml:space="preserve">MV, TD, TA</w:t>
             </w:r>
           </w:p>
         </w:tc>
@@ -15274,7 +15256,7 @@
         </w:numPr>
       </w:pPr>
       <w:r>
-        <w:t xml:space="preserve">Table 1 uses the counts of the Screening sheet of Research_Data_1380_1403.xlsx (final run after the 1403 merge and the market correction).</w:t>
+        <w:t xml:space="preserve">Fill the [n] counts of Table 1 and of the paragraph below it from the Screening sheet of Research_Data_1380_1403.xlsx after re-running 05_screening.do (firm-years with negative book equity are now retained).</w:t>
       </w:r>
     </w:p>
     <w:p>

</xml_diff>